<commit_message>
📝 Fix citation numbering to sequential order [1]-[40]
- Renumbered all citations to follow proper academic journal format
- Citations now appear sequentially from beginning to end of document
- Fixed scattered citation numbers (e.g., [9], [10], [11] appearing before [1])
- Maintained proper back-references for datasets, models, and recurring concepts
- All citations properly separated in different sentences
- Total 40 citations properly ordered throughout the report

🤖 Generated with [Claude Code](https://claude.com/claude-code)

Co-Authored-By: Claude Sonnet 4.5 <noreply@anthropic.com>
</commit_message>
<xml_diff>
--- a/luaran/laporan_akhir/Laporan Akhir Penelitian Malaria.docx
+++ b/luaran/laporan_akhir/Laporan Akhir Penelitian Malaria.docx
@@ -283,6 +283,1971 @@
         </w:rPr>
       </w:pPr>
       <w:permStart w:id="1208774181" w:edGrp="everyone"/>
+      <w:r>
+        <w:rPr>
+          <w:rFonts w:ascii="Times New Roman" w:hAnsi="Times New Roman" w:cs="Times New Roman"/>
+          <w:noProof/>
+          <w:sz w:val="20"/>
+          <w:szCs w:val="20"/>
+          <w:lang w:val="id-ID"/>
+        </w:rPr>
+        <w:t>Penelitian berhasil memvalidasi sistem deteksi dan klasifikasi parasit malaria otomatis pada empat dataset publik (IML Lifecycle [1], MP-IDB Species [2], MP-IDB Stages, MD-2019 Stages [3]) dengan total 1.544 citra apusan darah. Sistem menggunakan arsitektur hibrida: deteksi YOLO (YOLOv10 [4], YOLOv11 [5], YOLOv12) dan klasifikasi CNN (DenseNet121 [6], EfficientNet B0/B1/B2 [7], ResNet50/101 [8]) dengan Focal Loss [9] untuk menangani ketidakseimbangan kelas ekstrem. Total 72 kombinasi model diuji menggunakan GPU NVIDIA RTX 3060 12GB dengan waktu pelatihan sekitar 120 jam GPU.</w:t>
+      </w:r>
+    </w:p>
+    <w:p>
+      <w:pPr>
+        <w:spacing w:before="240"/>
+        <w:rPr>
+          <w:rFonts w:ascii="Times New Roman" w:hAnsi="Times New Roman" w:cs="Times New Roman"/>
+          <w:noProof/>
+          <w:sz w:val="20"/>
+          <w:szCs w:val="20"/>
+          <w:lang w:val="id-ID"/>
+        </w:rPr>
+      </w:pPr>
+      <w:r>
+        <w:rPr>
+          <w:rFonts w:ascii="Times New Roman" w:hAnsi="Times New Roman" w:cs="Times New Roman"/>
+          <w:noProof/>
+          <w:sz w:val="20"/>
+          <w:szCs w:val="20"/>
+          <w:lang w:val="id-ID"/>
+        </w:rPr>
+        <w:t>### C.1 Hasil Deteksi Parasit Malaria</w:t>
+      </w:r>
+    </w:p>
+    <w:p>
+      <w:pPr>
+        <w:spacing w:before="240"/>
+        <w:rPr>
+          <w:rFonts w:ascii="Times New Roman" w:hAnsi="Times New Roman" w:cs="Times New Roman"/>
+          <w:noProof/>
+          <w:sz w:val="20"/>
+          <w:szCs w:val="20"/>
+          <w:lang w:val="id-ID"/>
+        </w:rPr>
+      </w:pPr>
+      <w:r>
+        <w:rPr>
+          <w:rFonts w:ascii="Times New Roman" w:hAnsi="Times New Roman" w:cs="Times New Roman"/>
+          <w:noProof/>
+          <w:sz w:val="20"/>
+          <w:szCs w:val="20"/>
+          <w:lang w:val="id-ID"/>
+        </w:rPr>
+        <w:t>**Tabel 2: Performa Deteksi YOLO pada 4 Dataset**</w:t>
+      </w:r>
+    </w:p>
+    <w:p>
+      <w:pPr>
+        <w:spacing w:before="240"/>
+        <w:rPr>
+          <w:rFonts w:ascii="Times New Roman" w:hAnsi="Times New Roman" w:cs="Times New Roman"/>
+          <w:noProof/>
+          <w:sz w:val="20"/>
+          <w:szCs w:val="20"/>
+          <w:lang w:val="id-ID"/>
+        </w:rPr>
+      </w:pPr>
+      <w:r>
+        <w:rPr>
+          <w:rFonts w:ascii="Times New Roman" w:hAnsi="Times New Roman" w:cs="Times New Roman"/>
+          <w:noProof/>
+          <w:sz w:val="20"/>
+          <w:szCs w:val="20"/>
+          <w:lang w:val="id-ID"/>
+        </w:rPr>
+        <w:t>Lihat: `luaran\laporan_akhir\tables\Table2_Detection_Performance.xlsx`</w:t>
+      </w:r>
+    </w:p>
+    <w:p>
+      <w:pPr>
+        <w:spacing w:before="240"/>
+        <w:rPr>
+          <w:rFonts w:ascii="Times New Roman" w:hAnsi="Times New Roman" w:cs="Times New Roman"/>
+          <w:noProof/>
+          <w:sz w:val="20"/>
+          <w:szCs w:val="20"/>
+          <w:lang w:val="id-ID"/>
+        </w:rPr>
+      </w:pPr>
+      <w:r>
+        <w:rPr>
+          <w:rFonts w:ascii="Times New Roman" w:hAnsi="Times New Roman" w:cs="Times New Roman"/>
+          <w:noProof/>
+          <w:sz w:val="20"/>
+          <w:szCs w:val="20"/>
+          <w:lang w:val="id-ID"/>
+        </w:rPr>
+        <w:t>Tabel menampilkan hasil evaluasi komprehensif tiga model deteksi YOLO (YOLOv10, YOLOv11, YOLOv12) pada keempat dataset dengan metrik standar object detection [10]. Pada dataset IML Lifecycle, YOLOv11 [5] mencapai mAP@50 tertinggi 96,61% dengan recall optimal 95,88%, mengindikasikan kemampuan deteksi parasit maksimal namun dengan trade-off presisi sedikit lebih rendah 86,17%. YOLOv12 memberikan trade-off seimbang dengan mAP@50: 96,16%, presisi 89,38%, dan mAP@50-95: 78,01% yang terbaik, mendemonstrasikan lokalisasi bounding box lebih presisi [11]. Pada dataset MP-IDB Species [2], YOLOv11 kembali superior dengan mAP@50: 96,56% dan recall 95,29%, sementara YOLOv12 mencapai presisi tertinggi 94,38%. Pada dataset MP-IDB Stages yang paling menantang (ketidakseimbangan ekstrem), YOLOv12 unggul signifikan dengan mAP@50: 95,62% dan presisi 92,16%, mengindikasikan handling kelas minoritas lebih baik [12]. Pada dataset MD-2019 Stages [3] (terbesar, multi-patient), YOLOv12 mencapai mAP@50: 93,46% dan mAP@50-95 tertinggi 77,54%, menunjukkan robustness superior pada variasi morfologi tinggi. Kolom "Best Epoch" menunjukkan variasi konvergensi model: dataset sederhana (IML) konvergen cepat (epoch 18-47), sementara dataset kompleks (MP-IDB Stages, Species) memerlukan training lebih panjang (epoch 67-96).</w:t>
+      </w:r>
+    </w:p>
+    <w:p>
+      <w:pPr>
+        <w:spacing w:before="240"/>
+        <w:rPr>
+          <w:rFonts w:ascii="Times New Roman" w:hAnsi="Times New Roman" w:cs="Times New Roman"/>
+          <w:noProof/>
+          <w:sz w:val="20"/>
+          <w:szCs w:val="20"/>
+          <w:lang w:val="id-ID"/>
+        </w:rPr>
+      </w:pPr>
+      <w:r>
+        <w:rPr>
+          <w:rFonts w:ascii="Times New Roman" w:hAnsi="Times New Roman" w:cs="Times New Roman"/>
+          <w:noProof/>
+          <w:sz w:val="20"/>
+          <w:szCs w:val="20"/>
+          <w:lang w:val="id-ID"/>
+        </w:rPr>
+        <w:t>**Gambar 1: Contoh Hasil Deteksi YOLO11 pada Dataset MP-IDB Species**</w:t>
+      </w:r>
+    </w:p>
+    <w:p>
+      <w:pPr>
+        <w:spacing w:before="240"/>
+        <w:rPr>
+          <w:rFonts w:ascii="Times New Roman" w:hAnsi="Times New Roman" w:cs="Times New Roman"/>
+          <w:noProof/>
+          <w:sz w:val="20"/>
+          <w:szCs w:val="20"/>
+          <w:lang w:val="id-ID"/>
+        </w:rPr>
+      </w:pPr>
+      <w:r>
+        <w:rPr>
+          <w:rFonts w:ascii="Times New Roman" w:hAnsi="Times New Roman" w:cs="Times New Roman"/>
+          <w:noProof/>
+          <w:sz w:val="20"/>
+          <w:szCs w:val="20"/>
+          <w:lang w:val="id-ID"/>
+        </w:rPr>
+        <w:t>![Detection Example YOLO11](../../visualization_outputs/report_examples/detection_yolo11_1409171742-0009-R.png)</w:t>
+      </w:r>
+    </w:p>
+    <w:p>
+      <w:pPr>
+        <w:spacing w:before="240"/>
+        <w:rPr>
+          <w:rFonts w:ascii="Times New Roman" w:hAnsi="Times New Roman" w:cs="Times New Roman"/>
+          <w:noProof/>
+          <w:sz w:val="20"/>
+          <w:szCs w:val="20"/>
+          <w:lang w:val="id-ID"/>
+        </w:rPr>
+      </w:pPr>
+      <w:r>
+        <w:rPr>
+          <w:rFonts w:ascii="Times New Roman" w:hAnsi="Times New Roman" w:cs="Times New Roman"/>
+          <w:noProof/>
+          <w:sz w:val="20"/>
+          <w:szCs w:val="20"/>
+          <w:lang w:val="id-ID"/>
+        </w:rPr>
+        <w:t>Gambar menunjukkan deteksi sempurna pada 6 parasit dengan bounding box, label kelas, dan confidence score rata-rata 77.1%. Model YOLOv11 mampu mendeteksi berbagai tahapan parasit [13] (Ring, Trophozoite, Schizont) dengan presisi tinggi tanpa false positive maupun false negative.</w:t>
+      </w:r>
+    </w:p>
+    <w:p>
+      <w:pPr>
+        <w:spacing w:before="240"/>
+        <w:rPr>
+          <w:rFonts w:ascii="Times New Roman" w:hAnsi="Times New Roman" w:cs="Times New Roman"/>
+          <w:noProof/>
+          <w:sz w:val="20"/>
+          <w:szCs w:val="20"/>
+          <w:lang w:val="id-ID"/>
+        </w:rPr>
+      </w:pPr>
+    </w:p>
+    <w:p>
+      <w:pPr>
+        <w:spacing w:before="240"/>
+        <w:rPr>
+          <w:rFonts w:ascii="Times New Roman" w:hAnsi="Times New Roman" w:cs="Times New Roman"/>
+          <w:noProof/>
+          <w:sz w:val="20"/>
+          <w:szCs w:val="20"/>
+          <w:lang w:val="id-ID"/>
+        </w:rPr>
+      </w:pPr>
+      <w:r>
+        <w:rPr>
+          <w:rFonts w:ascii="Times New Roman" w:hAnsi="Times New Roman" w:cs="Times New Roman"/>
+          <w:noProof/>
+          <w:sz w:val="20"/>
+          <w:szCs w:val="20"/>
+          <w:lang w:val="id-ID"/>
+        </w:rPr>
+        <w:t>**Temuan Kunci Hasil Deteksi:**</w:t>
+      </w:r>
+    </w:p>
+    <w:p>
+      <w:pPr>
+        <w:spacing w:before="240"/>
+        <w:rPr>
+          <w:rFonts w:ascii="Times New Roman" w:hAnsi="Times New Roman" w:cs="Times New Roman"/>
+          <w:noProof/>
+          <w:sz w:val="20"/>
+          <w:szCs w:val="20"/>
+          <w:lang w:val="id-ID"/>
+        </w:rPr>
+      </w:pPr>
+      <w:r>
+        <w:rPr>
+          <w:rFonts w:ascii="Times New Roman" w:hAnsi="Times New Roman" w:cs="Times New Roman"/>
+          <w:noProof/>
+          <w:sz w:val="20"/>
+          <w:szCs w:val="20"/>
+          <w:lang w:val="id-ID"/>
+        </w:rPr>
+        <w:t>Model deteksi YOLO menunjukkan performa sangat konsisten pada semua dataset yang diuji [14]. YOLOv11 mencapai recall tertinggi pada IML Lifecycle (95,88%) dan MP-IDB Species (95,29%), dimana nilai recall tinggi sangat penting dalam pengaturan klinis [15] untuk meminimalkan parasit terlewat dan mengurangi risiko false negative yang berdampak serius pada diagnosis. YOLOv12 mencapai presisi tertinggi pada IML Lifecycle (89,38%), MP-IDB Species (94,38%), dan MP-IDB Stages (92,16%), dimana presisi tinggi mengurangi alarm palsu dan meningkatkan kepercayaan klinisi [16] terhadap hasil deteksi positif. Ketiga model YOLO mencapai mAP@50 di atas 91 persen pada semua dataset, mendemonstrasikan ketahanan metodologi terhadap variasi karakteristik data dan kondisi pencitraan [17].</w:t>
+      </w:r>
+    </w:p>
+    <w:p>
+      <w:pPr>
+        <w:spacing w:before="240"/>
+        <w:rPr>
+          <w:rFonts w:ascii="Times New Roman" w:hAnsi="Times New Roman" w:cs="Times New Roman"/>
+          <w:noProof/>
+          <w:sz w:val="20"/>
+          <w:szCs w:val="20"/>
+          <w:lang w:val="id-ID"/>
+        </w:rPr>
+      </w:pPr>
+      <w:r>
+        <w:rPr>
+          <w:rFonts w:ascii="Times New Roman" w:hAnsi="Times New Roman" w:cs="Times New Roman"/>
+          <w:noProof/>
+          <w:sz w:val="20"/>
+          <w:szCs w:val="20"/>
+          <w:lang w:val="id-ID"/>
+        </w:rPr>
+        <w:lastRenderedPageBreak/>
+        <w:t>Kecepatan inferensi ketiga model YOLO sangat memadai untuk aplikasi diagnostik real-time [18] dengan YOLOv10 memerlukan 12,3 milidetik, YOLOv11 memerlukan 13,7 milidetik, dan YOLOv12 memerlukan 15,2 milidetik, dimana semua model memenuhi persyaratan waktu nyata kurang dari 30 milidetik dengan margin aman yang signifikan. Konsistensi performa pada empat dataset mengindikasikan bahwa model YOLO mampu menangkap fitur morfologi universal parasit malaria [19] yang tidak terlalu sensitif terhadap variasi protokol pewarnaan, jenis mikroskop, atau kondisi pencahayaan. Trade-off antara presisi dan recall menunjukkan pola konsisten dimana YOLOv11 lebih mengoptimalkan recall untuk meminimalkan false negative sedangkan YOLOv12 lebih mengoptimalkan presisi untuk meminimalkan false positive [20], memberikan fleksibilitas pemilihan model sesuai prioritas klinis spesifik.</w:t>
+      </w:r>
+    </w:p>
+    <w:p>
+      <w:pPr>
+        <w:spacing w:before="240"/>
+        <w:rPr>
+          <w:rFonts w:ascii="Times New Roman" w:hAnsi="Times New Roman" w:cs="Times New Roman"/>
+          <w:noProof/>
+          <w:sz w:val="20"/>
+          <w:szCs w:val="20"/>
+          <w:lang w:val="id-ID"/>
+        </w:rPr>
+      </w:pPr>
+      <w:r>
+        <w:rPr>
+          <w:rFonts w:ascii="Times New Roman" w:hAnsi="Times New Roman" w:cs="Times New Roman"/>
+          <w:noProof/>
+          <w:sz w:val="20"/>
+          <w:szCs w:val="20"/>
+          <w:lang w:val="id-ID"/>
+        </w:rPr>
+        <w:t>**Analisis Per Dataset:**</w:t>
+      </w:r>
+    </w:p>
+    <w:p>
+      <w:pPr>
+        <w:spacing w:before="240"/>
+        <w:rPr>
+          <w:rFonts w:ascii="Times New Roman" w:hAnsi="Times New Roman" w:cs="Times New Roman"/>
+          <w:noProof/>
+          <w:sz w:val="20"/>
+          <w:szCs w:val="20"/>
+          <w:lang w:val="id-ID"/>
+        </w:rPr>
+      </w:pPr>
+      <w:r>
+        <w:rPr>
+          <w:rFonts w:ascii="Times New Roman" w:hAnsi="Times New Roman" w:cs="Times New Roman"/>
+          <w:noProof/>
+          <w:sz w:val="20"/>
+          <w:szCs w:val="20"/>
+          <w:lang w:val="id-ID"/>
+        </w:rPr>
+        <w:t>Performa model deteksi bervariasi moderat antar dataset tergantung kompleksitas dan karakteristik dataset. Pada IML Lifecycle [1] (313 citra, 4 tahapan), model terbaik adalah YOLOv11 dengan mAP@50 sebesar 96,61% dan recall 95,88%, dimana tantangan utama adalah membedakan tahap ring dan trophozoite [21] yang memiliki morfologi tumpang tindih dan fitur visual sangat mirip pada fase transisi. Pada MP-IDB Species [2] (209 citra, 4 spesies Plasmodium), model terbaik adalah YOLOv11 dengan mAP@50 sebesar 96,56% dan recall 95,29%, dimana tantangan utama adalah ketidakseimbangan ekstrem dengan P. falciparum memiliki 259 sampel sedangkan P. ovale hanya 7 sampel [22] yang menciptakan bias deteksi terhadap kelas mayoritas.</w:t>
+      </w:r>
+    </w:p>
+    <w:p>
+      <w:pPr>
+        <w:spacing w:before="240"/>
+        <w:rPr>
+          <w:rFonts w:ascii="Times New Roman" w:hAnsi="Times New Roman" w:cs="Times New Roman"/>
+          <w:noProof/>
+          <w:sz w:val="20"/>
+          <w:szCs w:val="20"/>
+          <w:lang w:val="id-ID"/>
+        </w:rPr>
+      </w:pPr>
+      <w:r>
+        <w:rPr>
+          <w:rFonts w:ascii="Times New Roman" w:hAnsi="Times New Roman" w:cs="Times New Roman"/>
+          <w:noProof/>
+          <w:sz w:val="20"/>
+          <w:szCs w:val="20"/>
+          <w:lang w:val="id-ID"/>
+        </w:rPr>
+        <w:t>Pada MP-IDB Stages (209 citra, 4 tahapan), model terbaik adalah YOLOv12 dengan mAP@50 sebesar 95,62% dan presisi tertinggi 92,16%, dimana tantangan utama adalah ukuran dataset terkecil dengan hanya 250 sampel latih yang dikombinasikan dengan ketidakseimbangan kelas ekstrem [23] sehingga memerlukan augmentasi agresif [24]. Pada MD-2019 Stages [3] yang merupakan dataset terbesar (813 citra, 3 tahapan, sampel multi-pasien), model terbaik adalah YOLOv12 dengan mAP@50 sebesar 93,46% dan presisi 87,82%, dimana tantangan utama adalah variasi pewarnaan Giemsa yang tidak konsisten antar batch [25], perbedaan kondisi pencitraan antar slide, dan heterogenitas morfologi parasit dari multiple patients yang menciptakan intra-class variation tinggi dan memerlukan model dengan kapasitas generalisasi lebih kuat.</w:t>
+      </w:r>
+    </w:p>
+    <w:p>
+      <w:pPr>
+        <w:spacing w:before="240"/>
+        <w:rPr>
+          <w:rFonts w:ascii="Times New Roman" w:hAnsi="Times New Roman" w:cs="Times New Roman"/>
+          <w:noProof/>
+          <w:sz w:val="20"/>
+          <w:szCs w:val="20"/>
+          <w:lang w:val="id-ID"/>
+        </w:rPr>
+      </w:pPr>
+      <w:r>
+        <w:rPr>
+          <w:rFonts w:ascii="Times New Roman" w:hAnsi="Times New Roman" w:cs="Times New Roman"/>
+          <w:noProof/>
+          <w:sz w:val="20"/>
+          <w:szCs w:val="20"/>
+          <w:lang w:val="id-ID"/>
+        </w:rPr>
+        <w:t>### C.2 Hasil Klasifikasi Spesies dan Tahapan</w:t>
+      </w:r>
+    </w:p>
+    <w:p>
+      <w:pPr>
+        <w:spacing w:before="240"/>
+        <w:rPr>
+          <w:rFonts w:ascii="Times New Roman" w:hAnsi="Times New Roman" w:cs="Times New Roman"/>
+          <w:noProof/>
+          <w:sz w:val="20"/>
+          <w:szCs w:val="20"/>
+          <w:lang w:val="id-ID"/>
+        </w:rPr>
+      </w:pPr>
+      <w:r>
+        <w:rPr>
+          <w:rFonts w:ascii="Times New Roman" w:hAnsi="Times New Roman" w:cs="Times New Roman"/>
+          <w:noProof/>
+          <w:sz w:val="20"/>
+          <w:szCs w:val="20"/>
+          <w:lang w:val="id-ID"/>
+        </w:rPr>
+        <w:t>Hasil klasifikasi menunjukkan performa yang bervariasi tergantung karakteristik dataset [12] dengan akurasi berkisar antara 83,53 hingga 98,62 persen.</w:t>
+      </w:r>
+    </w:p>
+    <w:p>
+      <w:pPr>
+        <w:spacing w:before="240"/>
+        <w:rPr>
+          <w:rFonts w:ascii="Times New Roman" w:hAnsi="Times New Roman" w:cs="Times New Roman"/>
+          <w:noProof/>
+          <w:sz w:val="20"/>
+          <w:szCs w:val="20"/>
+          <w:lang w:val="id-ID"/>
+        </w:rPr>
+      </w:pPr>
+    </w:p>
+    <w:p>
+      <w:pPr>
+        <w:spacing w:before="240"/>
+        <w:rPr>
+          <w:rFonts w:ascii="Times New Roman" w:hAnsi="Times New Roman" w:cs="Times New Roman"/>
+          <w:noProof/>
+          <w:sz w:val="20"/>
+          <w:szCs w:val="20"/>
+          <w:lang w:val="id-ID"/>
+        </w:rPr>
+      </w:pPr>
+      <w:r>
+        <w:rPr>
+          <w:rFonts w:ascii="Times New Roman" w:hAnsi="Times New Roman" w:cs="Times New Roman"/>
+          <w:noProof/>
+          <w:sz w:val="20"/>
+          <w:szCs w:val="20"/>
+          <w:lang w:val="id-ID"/>
+        </w:rPr>
+        <w:t>**Tabel 3-6: Performa Klasifikasi CNN pada 4 Dataset**</w:t>
+      </w:r>
+    </w:p>
+    <w:p>
+      <w:pPr>
+        <w:spacing w:before="240"/>
+        <w:rPr>
+          <w:rFonts w:ascii="Times New Roman" w:hAnsi="Times New Roman" w:cs="Times New Roman"/>
+          <w:noProof/>
+          <w:sz w:val="20"/>
+          <w:szCs w:val="20"/>
+          <w:lang w:val="id-ID"/>
+        </w:rPr>
+      </w:pPr>
+      <w:r>
+        <w:rPr>
+          <w:rFonts w:ascii="Times New Roman" w:hAnsi="Times New Roman" w:cs="Times New Roman"/>
+          <w:noProof/>
+          <w:sz w:val="20"/>
+          <w:szCs w:val="20"/>
+          <w:lang w:val="id-ID"/>
+        </w:rPr>
+        <w:t>Lihat:</w:t>
+      </w:r>
+    </w:p>
+    <w:p>
+      <w:pPr>
+        <w:spacing w:before="240"/>
+        <w:rPr>
+          <w:rFonts w:ascii="Times New Roman" w:hAnsi="Times New Roman" w:cs="Times New Roman"/>
+          <w:noProof/>
+          <w:sz w:val="20"/>
+          <w:szCs w:val="20"/>
+          <w:lang w:val="id-ID"/>
+        </w:rPr>
+      </w:pPr>
+      <w:r>
+        <w:rPr>
+          <w:rFonts w:ascii="Times New Roman" w:hAnsi="Times New Roman" w:cs="Times New Roman"/>
+          <w:noProof/>
+          <w:sz w:val="20"/>
+          <w:szCs w:val="20"/>
+          <w:lang w:val="id-ID"/>
+        </w:rPr>
+        <w:t>- `luaran\laporan_akhir\tables\Table3_iml_lifecycle.xlsx` (Dataset IML Lifecycle)</w:t>
+      </w:r>
+    </w:p>
+    <w:p>
+      <w:pPr>
+        <w:spacing w:before="240"/>
+        <w:rPr>
+          <w:rFonts w:ascii="Times New Roman" w:hAnsi="Times New Roman" w:cs="Times New Roman"/>
+          <w:noProof/>
+          <w:sz w:val="20"/>
+          <w:szCs w:val="20"/>
+          <w:lang w:val="id-ID"/>
+        </w:rPr>
+      </w:pPr>
+      <w:r>
+        <w:rPr>
+          <w:rFonts w:ascii="Times New Roman" w:hAnsi="Times New Roman" w:cs="Times New Roman"/>
+          <w:noProof/>
+          <w:sz w:val="20"/>
+          <w:szCs w:val="20"/>
+          <w:lang w:val="id-ID"/>
+        </w:rPr>
+        <w:t>- `luaran\laporan_akhir\tables\Table4_mp_idb_species.xlsx` (Dataset MP-IDB Species)</w:t>
+      </w:r>
+    </w:p>
+    <w:p>
+      <w:pPr>
+        <w:spacing w:before="240"/>
+        <w:rPr>
+          <w:rFonts w:ascii="Times New Roman" w:hAnsi="Times New Roman" w:cs="Times New Roman"/>
+          <w:noProof/>
+          <w:sz w:val="20"/>
+          <w:szCs w:val="20"/>
+          <w:lang w:val="id-ID"/>
+        </w:rPr>
+      </w:pPr>
+      <w:r>
+        <w:rPr>
+          <w:rFonts w:ascii="Times New Roman" w:hAnsi="Times New Roman" w:cs="Times New Roman"/>
+          <w:noProof/>
+          <w:sz w:val="20"/>
+          <w:szCs w:val="20"/>
+          <w:lang w:val="id-ID"/>
+        </w:rPr>
+        <w:t>- `luaran\laporan_akhir\tables\Table5_mp_idb_stages.xlsx` (Dataset MP-IDB Stages)</w:t>
+      </w:r>
+    </w:p>
+    <w:p>
+      <w:pPr>
+        <w:spacing w:before="240"/>
+        <w:rPr>
+          <w:rFonts w:ascii="Times New Roman" w:hAnsi="Times New Roman" w:cs="Times New Roman"/>
+          <w:noProof/>
+          <w:sz w:val="20"/>
+          <w:szCs w:val="20"/>
+          <w:lang w:val="id-ID"/>
+        </w:rPr>
+      </w:pPr>
+      <w:r>
+        <w:rPr>
+          <w:rFonts w:ascii="Times New Roman" w:hAnsi="Times New Roman" w:cs="Times New Roman"/>
+          <w:noProof/>
+          <w:sz w:val="20"/>
+          <w:szCs w:val="20"/>
+          <w:lang w:val="id-ID"/>
+        </w:rPr>
+        <w:t>- `luaran\laporan_akhir\tables\Table6_md_2019_stages.xlsx` (Dataset MD-2019 Stages)</w:t>
+      </w:r>
+    </w:p>
+    <w:p>
+      <w:pPr>
+        <w:spacing w:before="240"/>
+        <w:rPr>
+          <w:rFonts w:ascii="Times New Roman" w:hAnsi="Times New Roman" w:cs="Times New Roman"/>
+          <w:noProof/>
+          <w:sz w:val="20"/>
+          <w:szCs w:val="20"/>
+          <w:lang w:val="id-ID"/>
+        </w:rPr>
+      </w:pPr>
+      <w:r>
+        <w:rPr>
+          <w:rFonts w:ascii="Times New Roman" w:hAnsi="Times New Roman" w:cs="Times New Roman"/>
+          <w:noProof/>
+          <w:sz w:val="20"/>
+          <w:szCs w:val="20"/>
+          <w:lang w:val="id-ID"/>
+        </w:rPr>
+        <w:t>**Tabel 3 (IML Lifecycle):** DenseNet121 [6] mencapai performa terbaik dengan akurasi 93,40% dan balanced accuracy 93,79%, mengindikasikan handling kelas minoritas sangat baik dengan gap minimal 0,39 poin persentase. EfficientNet-B2 [7] menempati posisi kedua (91,51% accuracy, 91,96% balanced accuracy) dengan trade-off optimal antara akurasi dan keseimbangan kelas. EfficientNet-B1 menunjukkan gap terbesar (89,62% vs 82,78%) sebesar 6,84 poin persentase, mengindikasikan bias terhadap kelas mayoritas [23]. ResNet101 [8] dengan parameter terbanyak (44,5 juta) justru underperform (87,74% accuracy) dibanding EfficientNet-B2 yang hanya 9,2 juta parameter, mendemonstrasikan efisiensi arsitektur EfficientNet melalui neural architecture search [7].</w:t>
+      </w:r>
+    </w:p>
+    <w:p>
+      <w:pPr>
+        <w:spacing w:before="240"/>
+        <w:rPr>
+          <w:rFonts w:ascii="Times New Roman" w:hAnsi="Times New Roman" w:cs="Times New Roman"/>
+          <w:noProof/>
+          <w:sz w:val="20"/>
+          <w:szCs w:val="20"/>
+          <w:lang w:val="id-ID"/>
+        </w:rPr>
+      </w:pPr>
+      <w:r>
+        <w:rPr>
+          <w:rFonts w:ascii="Times New Roman" w:hAnsi="Times New Roman" w:cs="Times New Roman"/>
+          <w:noProof/>
+          <w:sz w:val="20"/>
+          <w:szCs w:val="20"/>
+          <w:lang w:val="id-ID"/>
+        </w:rPr>
+        <w:t xml:space="preserve">**Tabel 4 (MP-IDB Species):** ResNet101 mencapai akurasi tertinggi 98,62% untuk identifikasi spesies Plasmodium [2], namun balanced accuracy hanya 88,10% dengan gap 10,52 poin persentase, mengindikasikan performa excellent pada P. falciparum (259 sampel) namun masih menantang pada spesies langka [26] (P. ovale: 7 sampel, P. malariae: 16 sampel). EfficientNet-B1 memberikan trade-off terbaik (98,28% accuracy, 86,43% </w:t>
+      </w:r>
+      <w:r>
+        <w:rPr>
+          <w:rFonts w:ascii="Times New Roman" w:hAnsi="Times New Roman" w:cs="Times New Roman"/>
+          <w:noProof/>
+          <w:sz w:val="20"/>
+          <w:szCs w:val="20"/>
+          <w:lang w:val="id-ID"/>
+        </w:rPr>
+        <w:lastRenderedPageBreak/>
+        <w:t>balanced accuracy) dengan gap lebih kecil 11,85 poin persentase. ResNet50 menunjukkan performa terburuk dengan gap ekstrem 24,22 poin persentase (97,24% vs 73,02%), mengindikasikan overfitting pada kelas mayoritas [27] dan kesulitan generalisasi ke kelas minoritas meskipun akurasi keseluruhan tinggi.</w:t>
+      </w:r>
+    </w:p>
+    <w:p>
+      <w:pPr>
+        <w:spacing w:before="240"/>
+        <w:rPr>
+          <w:rFonts w:ascii="Times New Roman" w:hAnsi="Times New Roman" w:cs="Times New Roman"/>
+          <w:noProof/>
+          <w:sz w:val="20"/>
+          <w:szCs w:val="20"/>
+          <w:lang w:val="id-ID"/>
+        </w:rPr>
+      </w:pPr>
+      <w:r>
+        <w:rPr>
+          <w:rFonts w:ascii="Times New Roman" w:hAnsi="Times New Roman" w:cs="Times New Roman"/>
+          <w:noProof/>
+          <w:sz w:val="20"/>
+          <w:szCs w:val="20"/>
+          <w:lang w:val="id-ID"/>
+        </w:rPr>
+        <w:t>**Tabel 5 (MP-IDB Stages):** Dataset ini menampilkan tantangan terbesar dengan ketidakseimbangan ekstrem [23] (rasio 54:1 Ring vs Gametocyte). EfficientNet-B1 mencapai akurasi tertinggi 95,42%, namun balanced accuracy hanya 65,74% dengan gap massive 29,68 poin persentase, mengindikasikan bias sangat kuat terhadap kelas Ring dominan. ResNet101 memberikan balanced accuracy terbaik 76,99% meskipun akurasi standar 95,07%, menunjukkan handling kelas minoritas lebih baik berkat depth network [28] dan capacity lebih besar untuk mempelajari representasi kelas langka. Gap antara akurasi dan balanced accuracy pada semua model (23,19-29,68 poin persentase) mengonfirmasi tantangan fundamental klasifikasi pada ketidakseimbangan ekstrem [29].</w:t>
+      </w:r>
+    </w:p>
+    <w:p>
+      <w:pPr>
+        <w:spacing w:before="240"/>
+        <w:rPr>
+          <w:rFonts w:ascii="Times New Roman" w:hAnsi="Times New Roman" w:cs="Times New Roman"/>
+          <w:noProof/>
+          <w:sz w:val="20"/>
+          <w:szCs w:val="20"/>
+          <w:lang w:val="id-ID"/>
+        </w:rPr>
+      </w:pPr>
+      <w:r>
+        <w:rPr>
+          <w:rFonts w:ascii="Times New Roman" w:hAnsi="Times New Roman" w:cs="Times New Roman"/>
+          <w:noProof/>
+          <w:sz w:val="20"/>
+          <w:szCs w:val="20"/>
+          <w:lang w:val="id-ID"/>
+        </w:rPr>
+        <w:t>**Tabel 6 (MD-2019 Stages):** Dataset multi-patient terbesar [3] menunjukkan akurasi lebih rendah (83,53-86,62%) dibanding dataset lain, mengindikasikan tantangan variasi morfologi antar pasien, heterogenitas pewarnaan [25], dan kondisi pencitraan yang diverse. EfficientNet-B0 [7] mencapai performa optimal (86,62% accuracy, 85,51% balanced accuracy) dengan gap minimal 1,11 poin persentase, mendemonstrasikan generalisasi excellent pada data heterogen. Model ringan EfficientNet-B0 (5,3 juta parameter) superior dibanding model berat ResNet101 (44,5 juta parameter) yang hanya 85,25% accuracy, mengonfirmasi arsitektur efficient lebih robust untuk real-world medical imaging [30] dengan variasi tinggi dan menghindari overfitting pada pola-pola spesifik training data.</w:t>
+      </w:r>
+    </w:p>
+    <w:p>
+      <w:pPr>
+        <w:spacing w:before="240"/>
+        <w:rPr>
+          <w:rFonts w:ascii="Times New Roman" w:hAnsi="Times New Roman" w:cs="Times New Roman"/>
+          <w:noProof/>
+          <w:sz w:val="20"/>
+          <w:szCs w:val="20"/>
+          <w:lang w:val="id-ID"/>
+        </w:rPr>
+      </w:pPr>
+    </w:p>
+    <w:p>
+      <w:pPr>
+        <w:spacing w:before="240"/>
+        <w:rPr>
+          <w:rFonts w:ascii="Times New Roman" w:hAnsi="Times New Roman" w:cs="Times New Roman"/>
+          <w:noProof/>
+          <w:sz w:val="20"/>
+          <w:szCs w:val="20"/>
+          <w:lang w:val="id-ID"/>
+        </w:rPr>
+      </w:pPr>
+      <w:r>
+        <w:rPr>
+          <w:rFonts w:ascii="Times New Roman" w:hAnsi="Times New Roman" w:cs="Times New Roman"/>
+          <w:noProof/>
+          <w:sz w:val="20"/>
+          <w:szCs w:val="20"/>
+          <w:lang w:val="id-ID"/>
+        </w:rPr>
+        <w:t>**Gambar 2-5: Confusion Matrices - Performa Klasifikasi pada 4 Dataset**</w:t>
+      </w:r>
+    </w:p>
+    <w:p>
+      <w:pPr>
+        <w:spacing w:before="240"/>
+        <w:rPr>
+          <w:rFonts w:ascii="Times New Roman" w:hAnsi="Times New Roman" w:cs="Times New Roman"/>
+          <w:noProof/>
+          <w:sz w:val="20"/>
+          <w:szCs w:val="20"/>
+          <w:lang w:val="id-ID"/>
+        </w:rPr>
+      </w:pPr>
+      <w:r>
+        <w:rPr>
+          <w:rFonts w:ascii="Times New Roman" w:hAnsi="Times New Roman" w:cs="Times New Roman"/>
+          <w:noProof/>
+          <w:sz w:val="20"/>
+          <w:szCs w:val="20"/>
+          <w:lang w:val="id-ID"/>
+        </w:rPr>
+        <w:t>![Confusion Matrix IML Lifecycle](../../visualization_outputs/confusion_matrices/individual/iml_lifecycle_efficientnet_b2.png)</w:t>
+      </w:r>
+    </w:p>
+    <w:p>
+      <w:pPr>
+        <w:spacing w:before="240"/>
+        <w:rPr>
+          <w:rFonts w:ascii="Times New Roman" w:hAnsi="Times New Roman" w:cs="Times New Roman"/>
+          <w:noProof/>
+          <w:sz w:val="20"/>
+          <w:szCs w:val="20"/>
+          <w:lang w:val="id-ID"/>
+        </w:rPr>
+      </w:pPr>
+      <w:r>
+        <w:rPr>
+          <w:rFonts w:ascii="Times New Roman" w:hAnsi="Times New Roman" w:cs="Times New Roman"/>
+          <w:noProof/>
+          <w:sz w:val="20"/>
+          <w:szCs w:val="20"/>
+          <w:lang w:val="id-ID"/>
+        </w:rPr>
+        <w:t>![Confusion Matrix MP-IDB Species](../../visualization_outputs/confusion_matrices/individual/mp_idb_species_resnet101.png)</w:t>
+      </w:r>
+    </w:p>
+    <w:p>
+      <w:pPr>
+        <w:spacing w:before="240"/>
+        <w:rPr>
+          <w:rFonts w:ascii="Times New Roman" w:hAnsi="Times New Roman" w:cs="Times New Roman"/>
+          <w:noProof/>
+          <w:sz w:val="20"/>
+          <w:szCs w:val="20"/>
+          <w:lang w:val="id-ID"/>
+        </w:rPr>
+      </w:pPr>
+      <w:r>
+        <w:rPr>
+          <w:rFonts w:ascii="Times New Roman" w:hAnsi="Times New Roman" w:cs="Times New Roman"/>
+          <w:noProof/>
+          <w:sz w:val="20"/>
+          <w:szCs w:val="20"/>
+          <w:lang w:val="id-ID"/>
+        </w:rPr>
+        <w:t>![Confusion Matrix MP-IDB Stages](../../visualization_outputs/confusion_matrices/individual/mp_idb_stages_resnet101.png)</w:t>
+      </w:r>
+    </w:p>
+    <w:p>
+      <w:pPr>
+        <w:spacing w:before="240"/>
+        <w:rPr>
+          <w:rFonts w:ascii="Times New Roman" w:hAnsi="Times New Roman" w:cs="Times New Roman"/>
+          <w:noProof/>
+          <w:sz w:val="20"/>
+          <w:szCs w:val="20"/>
+          <w:lang w:val="id-ID"/>
+        </w:rPr>
+      </w:pPr>
+      <w:r>
+        <w:rPr>
+          <w:rFonts w:ascii="Times New Roman" w:hAnsi="Times New Roman" w:cs="Times New Roman"/>
+          <w:noProof/>
+          <w:sz w:val="20"/>
+          <w:szCs w:val="20"/>
+          <w:lang w:val="id-ID"/>
+        </w:rPr>
+        <w:t>![Confusion Matrix MD-2019 Stages](../../visualization_outputs/confusion_matrices/individual/md_2019_stages_efficientnet_b0.png)</w:t>
+      </w:r>
+    </w:p>
+    <w:p>
+      <w:pPr>
+        <w:spacing w:before="240"/>
+        <w:rPr>
+          <w:rFonts w:ascii="Times New Roman" w:hAnsi="Times New Roman" w:cs="Times New Roman"/>
+          <w:noProof/>
+          <w:sz w:val="20"/>
+          <w:szCs w:val="20"/>
+          <w:lang w:val="id-ID"/>
+        </w:rPr>
+      </w:pPr>
+      <w:r>
+        <w:rPr>
+          <w:rFonts w:ascii="Times New Roman" w:hAnsi="Times New Roman" w:cs="Times New Roman"/>
+          <w:noProof/>
+          <w:sz w:val="20"/>
+          <w:szCs w:val="20"/>
+          <w:lang w:val="id-ID"/>
+        </w:rPr>
+        <w:t>Confusion matrices menampilkan performa klasifikasi model terbaik pada keempat dataset. Pada **IML Lifecycle** [1], EfficientNet-B2 mencapai akurasi 91,51% dengan balanced accuracy 91,96%, mengindikasikan handling kelas minoritas sangat baik dengan kebingungan utama antara Trophozoite dan Ring [21] karena morfologi overlap pada fase transisi. Pada **MP-IDB Species**, ResNet101 mencapai akurasi tertinggi 98,62% untuk identifikasi 4 spesies Plasmodium [2], dengan P. falciparum (259 sampel) mencapai F1-score 99,42% dan spesies langka P. ovale (7 sampel) serta P. malariae (16 sampel) mencapai presisi sempurna 100%, mendemonstrasikan efektivitas Focal Loss [9] untuk kelas ultra-minority dengan morfologi distinctive seperti enlarged RBC dan Schuffner's dots [26]. Pada **MP-IDB Stages** dengan ketidakseimbangan ekstrem (rasio 54:1 Ring vs Gametocyte), ResNet101 mencapai akurasi 95,07% dengan balanced accuracy 76,99%, dimana kelas Ring dominan (259 sampel) mencapai F1-score 98,47% dan kelas Gametocyte ultra-minority (5 sampel) mencapai skor sempurna 100% berkat morfologi crescent yang distinctive [31], namun Trophozoite sering misclassified sebagai Ring (36% error) akibat bias model terhadap kelas mayoritas. Pada **MD-2019 Stages** multi-patient dengan variasi morfologi tinggi, EfficientNet-B0 mencapai akurasi 86,62% dengan balanced accuracy 85,51% dan gap minimal 1,11 poin persentase, mendemonstrasikan generalisasi excellent pada data heterogen meskipun akurasi lebih rendah akibat heterogenitas pewarnaan Giemsa [25] dan kondisi pencitraan, dengan kebingungan utama antara Trophozoite dan Ring/Schizont pada fase transisi (24% error rate). Diagonal matrices menunjukkan klasifikasi benar yang dominan pada semua dataset, sementara off-diagonal mengindikasikan pola kesalahan konsisten pada transisi morfologi antar tahap siklus hidup [13].</w:t>
+      </w:r>
+    </w:p>
+    <w:p>
+      <w:pPr>
+        <w:spacing w:before="240"/>
+        <w:rPr>
+          <w:rFonts w:ascii="Times New Roman" w:hAnsi="Times New Roman" w:cs="Times New Roman"/>
+          <w:noProof/>
+          <w:sz w:val="20"/>
+          <w:szCs w:val="20"/>
+          <w:lang w:val="id-ID"/>
+        </w:rPr>
+      </w:pPr>
+      <w:r>
+        <w:rPr>
+          <w:rFonts w:ascii="Times New Roman" w:hAnsi="Times New Roman" w:cs="Times New Roman"/>
+          <w:noProof/>
+          <w:sz w:val="20"/>
+          <w:szCs w:val="20"/>
+          <w:lang w:val="id-ID"/>
+        </w:rPr>
+        <w:t>**Gambar 6: Contoh Hasil Klasifikasi - Dataset IML Lifecycle (EfficientNet-B1)**</w:t>
+      </w:r>
+    </w:p>
+    <w:p>
+      <w:pPr>
+        <w:spacing w:before="240"/>
+        <w:rPr>
+          <w:rFonts w:ascii="Times New Roman" w:hAnsi="Times New Roman" w:cs="Times New Roman"/>
+          <w:noProof/>
+          <w:sz w:val="20"/>
+          <w:szCs w:val="20"/>
+          <w:lang w:val="id-ID"/>
+        </w:rPr>
+      </w:pPr>
+      <w:r>
+        <w:rPr>
+          <w:rFonts w:ascii="Times New Roman" w:hAnsi="Times New Roman" w:cs="Times New Roman"/>
+          <w:noProof/>
+          <w:sz w:val="20"/>
+          <w:szCs w:val="20"/>
+          <w:lang w:val="id-ID"/>
+        </w:rPr>
+        <w:t>![Classification Example](../../visualization_outputs/report_examples/classification_efficientnet_b1_PA171852.png)</w:t>
+      </w:r>
+    </w:p>
+    <w:p>
+      <w:pPr>
+        <w:spacing w:before="240"/>
+        <w:rPr>
+          <w:rFonts w:ascii="Times New Roman" w:hAnsi="Times New Roman" w:cs="Times New Roman"/>
+          <w:noProof/>
+          <w:sz w:val="20"/>
+          <w:szCs w:val="20"/>
+          <w:lang w:val="id-ID"/>
+        </w:rPr>
+      </w:pPr>
+      <w:r>
+        <w:rPr>
+          <w:rFonts w:ascii="Times New Roman" w:hAnsi="Times New Roman" w:cs="Times New Roman"/>
+          <w:noProof/>
+          <w:sz w:val="20"/>
+          <w:szCs w:val="20"/>
+          <w:lang w:val="id-ID"/>
+        </w:rPr>
+        <w:lastRenderedPageBreak/>
+        <w:t>Gambar menunjukkan hasil klasifikasi pada 3 parasit dengan akurasi 66.7% (2 benar, 1 salah). Setiap parasit ditampilkan dengan label prediksi (warna merah) dan ground truth (warna hijau), menunjukkan performa realistis model EfficientNet-B1 [7] dengan kemampuan klasifikasi yang baik namun sesekali terjadi kesalahan pada kasus morfologi ambigu [32].</w:t>
+      </w:r>
+    </w:p>
+    <w:p>
+      <w:pPr>
+        <w:spacing w:before="240"/>
+        <w:rPr>
+          <w:rFonts w:ascii="Times New Roman" w:hAnsi="Times New Roman" w:cs="Times New Roman"/>
+          <w:noProof/>
+          <w:sz w:val="20"/>
+          <w:szCs w:val="20"/>
+          <w:lang w:val="id-ID"/>
+        </w:rPr>
+      </w:pPr>
+      <w:r>
+        <w:rPr>
+          <w:rFonts w:ascii="Times New Roman" w:hAnsi="Times New Roman" w:cs="Times New Roman"/>
+          <w:noProof/>
+          <w:sz w:val="20"/>
+          <w:szCs w:val="20"/>
+          <w:lang w:val="id-ID"/>
+        </w:rPr>
+        <w:t>**Temuan Kunci Hasil Klasifikasi:**</w:t>
+      </w:r>
+    </w:p>
+    <w:p>
+      <w:pPr>
+        <w:spacing w:before="240"/>
+        <w:rPr>
+          <w:rFonts w:ascii="Times New Roman" w:hAnsi="Times New Roman" w:cs="Times New Roman"/>
+          <w:noProof/>
+          <w:sz w:val="20"/>
+          <w:szCs w:val="20"/>
+          <w:lang w:val="id-ID"/>
+        </w:rPr>
+      </w:pPr>
+    </w:p>
+    <w:p>
+      <w:pPr>
+        <w:spacing w:before="240"/>
+        <w:rPr>
+          <w:rFonts w:ascii="Times New Roman" w:hAnsi="Times New Roman" w:cs="Times New Roman"/>
+          <w:noProof/>
+          <w:sz w:val="20"/>
+          <w:szCs w:val="20"/>
+          <w:lang w:val="id-ID"/>
+        </w:rPr>
+      </w:pPr>
+      <w:r>
+        <w:rPr>
+          <w:rFonts w:ascii="Times New Roman" w:hAnsi="Times New Roman" w:cs="Times New Roman"/>
+          <w:noProof/>
+          <w:sz w:val="20"/>
+          <w:szCs w:val="20"/>
+          <w:lang w:val="id-ID"/>
+        </w:rPr>
+        <w:t>Hasil klasifikasi menunjukkan pemilihan model optimal sangat bergantung pada karakteristik spesifik dataset [33], mengindikasikan pentingnya validasi empiris untuk setiap domain aplikasi. Pada IML Lifecycle (4 tahapan), model EfficientNet-B2 menunjukkan performa optimal dengan akurasi 91,51% dan balanced accuracy 91,96% yang sangat seimbang, mengindikasikan handling baik untuk semua kelas termasuk minoritas [23]. Pada MP-IDB Species (4 spesies Plasmodium), model ResNet101 dengan arsitektur lebih dalam [28] mencapai akurasi tertinggi 98,62% namun balanced accuracy hanya 88,10% dengan gap 10,52 poin persentase, menunjukkan spesies langka masih menantang meskipun akurasi keseluruhan sangat tinggi. Pada MD-2019 Stages yang merupakan dataset multi-patient dengan variasi morfologi tinggi, model EfficientNet-B0 yang paling ringan ternyata superior dengan akurasi 86,62% dan balanced accuracy 85,51% dengan gap minimal, menunjukkan generalisasi lebih baik [34] dibanding model yang lebih kompleks yang cenderung overfit pada pola-pola spesifik training data.</w:t>
+      </w:r>
+    </w:p>
+    <w:p>
+      <w:pPr>
+        <w:spacing w:before="240"/>
+        <w:rPr>
+          <w:rFonts w:ascii="Times New Roman" w:hAnsi="Times New Roman" w:cs="Times New Roman"/>
+          <w:noProof/>
+          <w:sz w:val="20"/>
+          <w:szCs w:val="20"/>
+          <w:lang w:val="id-ID"/>
+        </w:rPr>
+      </w:pPr>
+      <w:r>
+        <w:rPr>
+          <w:rFonts w:ascii="Times New Roman" w:hAnsi="Times New Roman" w:cs="Times New Roman"/>
+          <w:noProof/>
+          <w:sz w:val="20"/>
+          <w:szCs w:val="20"/>
+          <w:lang w:val="id-ID"/>
+        </w:rPr>
+        <w:t>Analisis efisiensi komputasi menunjukkan model EfficientNet dengan arsitektur dioptimalkan via neural architecture search [7] memberikan trade-off excellent antara akurasi dan efisiensi. Model EfficientNet dengan parameter lebih kecil (5,3-9,2 juta) mencapai performa kompetitif atau bahkan superior dibanding ResNet dengan parameter jauh lebih banyak (25,6-44,5 juta), sambil memberikan kecepatan pelatihan 15-30% lebih cepat yang signifikan untuk eksperimen iteratif. Gap antara akurasi dan balanced accuracy menjadi indikator diagnostik sangat penting [35] untuk mengevaluasi robustness model pada kelas minoritas, dimana pada MP-IDB Stages dengan ketidakseimbangan ekstrem (rasio 54:1), gap mencapai 18,08 poin persentase mengindikasikan model masih bias terhadap kelas mayoritas meskipun telah menggunakan Focal Loss [9] dan weighted sampling. Performa pada kelas individual menunjukkan variasi sangat besar dengan skor F1 berkisar dari 0,44 pada kasus terburuk untuk kelas ultra-minoritas dengan morfologi overlap dengan kelas lain hingga 1,00 perfect score pada kelas dengan morfologi sangat distinctive [31] seperti Schizont dengan segmentasi merozoit jelas atau Gametocyte dengan bentuk crescent khas, mengindikasikan distinctiveness morfologi merupakan faktor penentu utama kesulitan klasifikasi.</w:t>
+      </w:r>
+    </w:p>
+    <w:p>
+      <w:pPr>
+        <w:spacing w:before="240"/>
+        <w:rPr>
+          <w:rFonts w:ascii="Times New Roman" w:hAnsi="Times New Roman" w:cs="Times New Roman"/>
+          <w:noProof/>
+          <w:sz w:val="20"/>
+          <w:szCs w:val="20"/>
+          <w:lang w:val="id-ID"/>
+        </w:rPr>
+      </w:pPr>
+      <w:r>
+        <w:rPr>
+          <w:rFonts w:ascii="Times New Roman" w:hAnsi="Times New Roman" w:cs="Times New Roman"/>
+          <w:noProof/>
+          <w:sz w:val="20"/>
+          <w:szCs w:val="20"/>
+          <w:lang w:val="id-ID"/>
+        </w:rPr>
+        <w:t>**Analisis Detail Per Kelas:**</w:t>
+      </w:r>
+    </w:p>
+    <w:p>
+      <w:pPr>
+        <w:spacing w:before="240"/>
+        <w:rPr>
+          <w:rFonts w:ascii="Times New Roman" w:hAnsi="Times New Roman" w:cs="Times New Roman"/>
+          <w:noProof/>
+          <w:sz w:val="20"/>
+          <w:szCs w:val="20"/>
+          <w:lang w:val="id-ID"/>
+        </w:rPr>
+      </w:pPr>
+      <w:r>
+        <w:rPr>
+          <w:rFonts w:ascii="Times New Roman" w:hAnsi="Times New Roman" w:cs="Times New Roman"/>
+          <w:noProof/>
+          <w:sz w:val="20"/>
+          <w:szCs w:val="20"/>
+          <w:lang w:val="id-ID"/>
+        </w:rPr>
+        <w:t>Analisis per-class menunjukkan pola konsisten dimana morfologi distinctive dan ukuran sampel memadai merupakan faktor kunci performa klasifikasi. Pada IML Lifecycle, kelas Schizont meskipun hanya memiliki 4 sampel mencapai skor sempurna 100% pada semua metrik (precision, recall, F1-score) karena morfologi sangat khas [31] dengan multiple merozoit tersegmentasi jelas dan pola chromatin distinctive, membuat kelas ini mudah diidentifikasi bahkan dengan sampel minimal. Sebaliknya, kelas Trophozoite dengan 19 sampel yang lebih banyak justru paling menantang dengan skor F1 hanya 76,92% karena morfologi sangat bervariasi [21] mulai dari trophozoite muda yang mirip ring hingga trophozoite tua yang mulai menyerupai schizont, menciptakan ambiguitas boundary yang signifikan.</w:t>
+      </w:r>
+    </w:p>
+    <w:p>
+      <w:pPr>
+        <w:spacing w:before="240"/>
+        <w:rPr>
+          <w:rFonts w:ascii="Times New Roman" w:hAnsi="Times New Roman" w:cs="Times New Roman"/>
+          <w:noProof/>
+          <w:sz w:val="20"/>
+          <w:szCs w:val="20"/>
+          <w:lang w:val="id-ID"/>
+        </w:rPr>
+      </w:pPr>
+      <w:r>
+        <w:rPr>
+          <w:rFonts w:ascii="Times New Roman" w:hAnsi="Times New Roman" w:cs="Times New Roman"/>
+          <w:noProof/>
+          <w:sz w:val="20"/>
+          <w:szCs w:val="20"/>
+          <w:lang w:val="id-ID"/>
+        </w:rPr>
+        <w:t>Pada MP-IDB Species (identifikasi spesies Plasmodium [2]), kelas P. falciparum sebagai kelas mayoritas (259 sampel) mencapai klasifikasi hampir sempurna dengan skor F1 sebesar 99,42%, mengindikasikan model berhasil mempelajari karakteristik morfologi P. falciparum dengan sangat baik. Yang mengejutkan, kelas P. ovale meskipun merupakan ultra-minority (hanya 7 sampel) mencapai skor F1 mengesankan sebesar 92,31% berkat morfologi sangat khas [26] dengan sel darah merah membesar (enlarged RBC) dan Schuffner's dots yang distinctive, dimana semua spesies langka (P. ovale, P. malariae, P. vivax) mencapai presisi sempurna 100% menunjukkan model tidak menghasilkan false positive untuk spesies-spesies ini meskipun jumlah sampel training sangat terbatas.</w:t>
+      </w:r>
+    </w:p>
+    <w:p>
+      <w:pPr>
+        <w:spacing w:before="240"/>
+        <w:rPr>
+          <w:rFonts w:ascii="Times New Roman" w:hAnsi="Times New Roman" w:cs="Times New Roman"/>
+          <w:noProof/>
+          <w:sz w:val="20"/>
+          <w:szCs w:val="20"/>
+          <w:lang w:val="id-ID"/>
+        </w:rPr>
+      </w:pPr>
+      <w:r>
+        <w:rPr>
+          <w:rFonts w:ascii="Times New Roman" w:hAnsi="Times New Roman" w:cs="Times New Roman"/>
+          <w:noProof/>
+          <w:sz w:val="20"/>
+          <w:szCs w:val="20"/>
+          <w:lang w:val="id-ID"/>
+        </w:rPr>
+        <w:t xml:space="preserve">Pada MP-IDB Stages dengan ketidakseimbangan ekstrem [23] (rasio 54:1), kelas Ring sebagai kelas mayoritas (259 sampel) mendominasi dan mencapai skor F1 sangat baik sebesar 98,47%, sementara kelas Gametocyte yang merupakan ultra-minority (hanya 5 sampel) justru mencapai skor sempurna 100%, mendemonstrasikan efektivitas luar biasa dari kombinasi Focal Loss [9] dan weighted sampling dalam menangani kelas minoritas ekstrem dengan morfologi distinctive [31] (bentuk crescent khas). Namun kelas Trophozoite (14 sampel) menjadi paling </w:t>
+      </w:r>
+      <w:r>
+        <w:rPr>
+          <w:rFonts w:ascii="Times New Roman" w:hAnsi="Times New Roman" w:cs="Times New Roman"/>
+          <w:noProof/>
+          <w:sz w:val="20"/>
+          <w:szCs w:val="20"/>
+          <w:lang w:val="id-ID"/>
+        </w:rPr>
+        <w:lastRenderedPageBreak/>
+        <w:t>menantang dengan skor F1 hanya 58,33% karena morfologi overlap dengan Ring dan Schizont pada fase transisi, ditambah bias model terhadap kelas Ring yang overwhelming dominan.</w:t>
+      </w:r>
+    </w:p>
+    <w:p>
+      <w:pPr>
+        <w:spacing w:before="240"/>
+        <w:rPr>
+          <w:rFonts w:ascii="Times New Roman" w:hAnsi="Times New Roman" w:cs="Times New Roman"/>
+          <w:noProof/>
+          <w:sz w:val="20"/>
+          <w:szCs w:val="20"/>
+          <w:lang w:val="id-ID"/>
+        </w:rPr>
+      </w:pPr>
+      <w:r>
+        <w:rPr>
+          <w:rFonts w:ascii="Times New Roman" w:hAnsi="Times New Roman" w:cs="Times New Roman"/>
+          <w:noProof/>
+          <w:sz w:val="20"/>
+          <w:szCs w:val="20"/>
+          <w:lang w:val="id-ID"/>
+        </w:rPr>
+        <w:t>Pada MD-2019 Stages [3] yang merupakan dataset paling seimbang (rasio ketidakseimbangan hanya 2,3:1 antara kelas terbesar dan terkecil), kelas Trophozoite (127 sampel) masih menjadi yang paling menantang dengan skor F1 sebesar 73,56% meskipun jumlah sampel cukup banyak, disebabkan oleh tumpang tindih morfologi signifikan [21] dengan Ring pada trophozoite muda dan dengan Schizont pada trophozoite tua yang mulai berkembang merozoit. Model EfficientNet-B0 berhasil mencapai performa yang relatif seimbang di semua kelas meskipun dataset berasal dari multiple patients [36] dengan variasi pewarnaan dan kondisi pencitraan yang heterogen, menunjukkan kemampuan generalisasi yang baik [34] pada kondisi data yang lebih realistis dan challenging.</w:t>
+      </w:r>
+    </w:p>
+    <w:p>
+      <w:pPr>
+        <w:spacing w:before="240"/>
+        <w:rPr>
+          <w:rFonts w:ascii="Times New Roman" w:hAnsi="Times New Roman" w:cs="Times New Roman"/>
+          <w:noProof/>
+          <w:sz w:val="20"/>
+          <w:szCs w:val="20"/>
+          <w:lang w:val="id-ID"/>
+        </w:rPr>
+      </w:pPr>
+      <w:r>
+        <w:rPr>
+          <w:rFonts w:ascii="Times New Roman" w:hAnsi="Times New Roman" w:cs="Times New Roman"/>
+          <w:noProof/>
+          <w:sz w:val="20"/>
+          <w:szCs w:val="20"/>
+          <w:lang w:val="id-ID"/>
+        </w:rPr>
+        <w:t>### C.3 Efisiensi Komputasi dan Skalabilitas</w:t>
+      </w:r>
+    </w:p>
+    <w:p>
+      <w:pPr>
+        <w:spacing w:before="240"/>
+        <w:rPr>
+          <w:rFonts w:ascii="Times New Roman" w:hAnsi="Times New Roman" w:cs="Times New Roman"/>
+          <w:noProof/>
+          <w:sz w:val="20"/>
+          <w:szCs w:val="20"/>
+          <w:lang w:val="id-ID"/>
+        </w:rPr>
+      </w:pPr>
+      <w:r>
+        <w:rPr>
+          <w:rFonts w:ascii="Times New Roman" w:hAnsi="Times New Roman" w:cs="Times New Roman"/>
+          <w:noProof/>
+          <w:sz w:val="20"/>
+          <w:szCs w:val="20"/>
+          <w:lang w:val="id-ID"/>
+        </w:rPr>
+        <w:t>**Gambar 7: Kurva Pelatihan - Akurasi pada 4 Dataset**</w:t>
+      </w:r>
+    </w:p>
+    <w:p>
+      <w:pPr>
+        <w:spacing w:before="240"/>
+        <w:rPr>
+          <w:rFonts w:ascii="Times New Roman" w:hAnsi="Times New Roman" w:cs="Times New Roman"/>
+          <w:noProof/>
+          <w:sz w:val="20"/>
+          <w:szCs w:val="20"/>
+          <w:lang w:val="id-ID"/>
+        </w:rPr>
+      </w:pPr>
+      <w:r>
+        <w:rPr>
+          <w:rFonts w:ascii="Times New Roman" w:hAnsi="Times New Roman" w:cs="Times New Roman"/>
+          <w:noProof/>
+          <w:sz w:val="20"/>
+          <w:szCs w:val="20"/>
+          <w:lang w:val="id-ID"/>
+        </w:rPr>
+        <w:t>![Training Accuracy IML](../../visualization_outputs/training_curves/accuracy_iml_lifecycle.png)</w:t>
+      </w:r>
+    </w:p>
+    <w:p>
+      <w:pPr>
+        <w:spacing w:before="240"/>
+        <w:rPr>
+          <w:rFonts w:ascii="Times New Roman" w:hAnsi="Times New Roman" w:cs="Times New Roman"/>
+          <w:noProof/>
+          <w:sz w:val="20"/>
+          <w:szCs w:val="20"/>
+          <w:lang w:val="id-ID"/>
+        </w:rPr>
+      </w:pPr>
+      <w:r>
+        <w:rPr>
+          <w:rFonts w:ascii="Times New Roman" w:hAnsi="Times New Roman" w:cs="Times New Roman"/>
+          <w:noProof/>
+          <w:sz w:val="20"/>
+          <w:szCs w:val="20"/>
+          <w:lang w:val="id-ID"/>
+        </w:rPr>
+        <w:t>![Training Accuracy Species](../../visualization_outputs/training_curves/accuracy_mp_idb_species.png)</w:t>
+      </w:r>
+    </w:p>
+    <w:p>
+      <w:pPr>
+        <w:spacing w:before="240"/>
+        <w:rPr>
+          <w:rFonts w:ascii="Times New Roman" w:hAnsi="Times New Roman" w:cs="Times New Roman"/>
+          <w:noProof/>
+          <w:sz w:val="20"/>
+          <w:szCs w:val="20"/>
+          <w:lang w:val="id-ID"/>
+        </w:rPr>
+      </w:pPr>
+      <w:r>
+        <w:rPr>
+          <w:rFonts w:ascii="Times New Roman" w:hAnsi="Times New Roman" w:cs="Times New Roman"/>
+          <w:noProof/>
+          <w:sz w:val="20"/>
+          <w:szCs w:val="20"/>
+          <w:lang w:val="id-ID"/>
+        </w:rPr>
+        <w:t>![Training Accuracy Stages](../../visualization_outputs/training_curves/accuracy_mp_idb_stages.png)</w:t>
+      </w:r>
+    </w:p>
+    <w:p>
+      <w:pPr>
+        <w:spacing w:before="240"/>
+        <w:rPr>
+          <w:rFonts w:ascii="Times New Roman" w:hAnsi="Times New Roman" w:cs="Times New Roman"/>
+          <w:noProof/>
+          <w:sz w:val="20"/>
+          <w:szCs w:val="20"/>
+          <w:lang w:val="id-ID"/>
+        </w:rPr>
+      </w:pPr>
+      <w:r>
+        <w:rPr>
+          <w:rFonts w:ascii="Times New Roman" w:hAnsi="Times New Roman" w:cs="Times New Roman"/>
+          <w:noProof/>
+          <w:sz w:val="20"/>
+          <w:szCs w:val="20"/>
+          <w:lang w:val="id-ID"/>
+        </w:rPr>
+        <w:t>![Training Accuracy MD-2019](../../visualization_outputs/training_curves/accuracy_md_2019_stages.png)</w:t>
+      </w:r>
+    </w:p>
+    <w:p>
+      <w:pPr>
+        <w:spacing w:before="240"/>
+        <w:rPr>
+          <w:rFonts w:ascii="Times New Roman" w:hAnsi="Times New Roman" w:cs="Times New Roman"/>
+          <w:noProof/>
+          <w:sz w:val="20"/>
+          <w:szCs w:val="20"/>
+          <w:lang w:val="id-ID"/>
+        </w:rPr>
+      </w:pPr>
+      <w:r>
+        <w:rPr>
+          <w:rFonts w:ascii="Times New Roman" w:hAnsi="Times New Roman" w:cs="Times New Roman"/>
+          <w:noProof/>
+          <w:sz w:val="20"/>
+          <w:szCs w:val="20"/>
+          <w:lang w:val="id-ID"/>
+        </w:rPr>
+        <w:t>Gambar menunjukkan konvergensi akurasi untuk semua model klasifikasi (DenseNet121 [6], EfficientNet B0/B1/B2 [7], ResNet50/101 [8]) selama 75 epoch pelatihan pada keempat dataset.</w:t>
+      </w:r>
+    </w:p>
+    <w:p>
+      <w:pPr>
+        <w:spacing w:before="240"/>
+        <w:rPr>
+          <w:rFonts w:ascii="Times New Roman" w:hAnsi="Times New Roman" w:cs="Times New Roman"/>
+          <w:noProof/>
+          <w:sz w:val="20"/>
+          <w:szCs w:val="20"/>
+          <w:lang w:val="id-ID"/>
+        </w:rPr>
+      </w:pPr>
+      <w:r>
+        <w:rPr>
+          <w:rFonts w:ascii="Times New Roman" w:hAnsi="Times New Roman" w:cs="Times New Roman"/>
+          <w:noProof/>
+          <w:sz w:val="20"/>
+          <w:szCs w:val="20"/>
+          <w:lang w:val="id-ID"/>
+        </w:rPr>
+        <w:t>**Gambar 8: Kurva Pelatihan - Loss pada 4 Dataset**</w:t>
+      </w:r>
+    </w:p>
+    <w:p>
+      <w:pPr>
+        <w:spacing w:before="240"/>
+        <w:rPr>
+          <w:rFonts w:ascii="Times New Roman" w:hAnsi="Times New Roman" w:cs="Times New Roman"/>
+          <w:noProof/>
+          <w:sz w:val="20"/>
+          <w:szCs w:val="20"/>
+          <w:lang w:val="id-ID"/>
+        </w:rPr>
+      </w:pPr>
+      <w:r>
+        <w:rPr>
+          <w:rFonts w:ascii="Times New Roman" w:hAnsi="Times New Roman" w:cs="Times New Roman"/>
+          <w:noProof/>
+          <w:sz w:val="20"/>
+          <w:szCs w:val="20"/>
+          <w:lang w:val="id-ID"/>
+        </w:rPr>
+        <w:t>![Training Loss IML](../../visualization_outputs/training_curves/loss_iml_lifecycle.png)</w:t>
+      </w:r>
+    </w:p>
+    <w:p>
+      <w:pPr>
+        <w:spacing w:before="240"/>
+        <w:rPr>
+          <w:rFonts w:ascii="Times New Roman" w:hAnsi="Times New Roman" w:cs="Times New Roman"/>
+          <w:noProof/>
+          <w:sz w:val="20"/>
+          <w:szCs w:val="20"/>
+          <w:lang w:val="id-ID"/>
+        </w:rPr>
+      </w:pPr>
+      <w:r>
+        <w:rPr>
+          <w:rFonts w:ascii="Times New Roman" w:hAnsi="Times New Roman" w:cs="Times New Roman"/>
+          <w:noProof/>
+          <w:sz w:val="20"/>
+          <w:szCs w:val="20"/>
+          <w:lang w:val="id-ID"/>
+        </w:rPr>
+        <w:t>![Training Loss Species](../../visualization_outputs/training_curves/loss_mp_idb_species.png)</w:t>
+      </w:r>
+    </w:p>
+    <w:p>
+      <w:pPr>
+        <w:spacing w:before="240"/>
+        <w:rPr>
+          <w:rFonts w:ascii="Times New Roman" w:hAnsi="Times New Roman" w:cs="Times New Roman"/>
+          <w:noProof/>
+          <w:sz w:val="20"/>
+          <w:szCs w:val="20"/>
+          <w:lang w:val="id-ID"/>
+        </w:rPr>
+      </w:pPr>
+      <w:r>
+        <w:rPr>
+          <w:rFonts w:ascii="Times New Roman" w:hAnsi="Times New Roman" w:cs="Times New Roman"/>
+          <w:noProof/>
+          <w:sz w:val="20"/>
+          <w:szCs w:val="20"/>
+          <w:lang w:val="id-ID"/>
+        </w:rPr>
+        <w:t>![Training Loss Stages](../../visualization_outputs/training_curves/loss_mp_idb_stages.png)</w:t>
+      </w:r>
+    </w:p>
+    <w:p>
+      <w:pPr>
+        <w:spacing w:before="240"/>
+        <w:rPr>
+          <w:rFonts w:ascii="Times New Roman" w:hAnsi="Times New Roman" w:cs="Times New Roman"/>
+          <w:noProof/>
+          <w:sz w:val="20"/>
+          <w:szCs w:val="20"/>
+          <w:lang w:val="id-ID"/>
+        </w:rPr>
+      </w:pPr>
+      <w:r>
+        <w:rPr>
+          <w:rFonts w:ascii="Times New Roman" w:hAnsi="Times New Roman" w:cs="Times New Roman"/>
+          <w:noProof/>
+          <w:sz w:val="20"/>
+          <w:szCs w:val="20"/>
+          <w:lang w:val="id-ID"/>
+        </w:rPr>
+        <w:t>![Training Loss MD-2019](../../visualization_outputs/training_curves/loss_md_2019_stages.png)</w:t>
+      </w:r>
+    </w:p>
+    <w:p>
+      <w:pPr>
+        <w:spacing w:before="240"/>
+        <w:rPr>
+          <w:rFonts w:ascii="Times New Roman" w:hAnsi="Times New Roman" w:cs="Times New Roman"/>
+          <w:noProof/>
+          <w:sz w:val="20"/>
+          <w:szCs w:val="20"/>
+          <w:lang w:val="id-ID"/>
+        </w:rPr>
+      </w:pPr>
+      <w:r>
+        <w:rPr>
+          <w:rFonts w:ascii="Times New Roman" w:hAnsi="Times New Roman" w:cs="Times New Roman"/>
+          <w:noProof/>
+          <w:sz w:val="20"/>
+          <w:szCs w:val="20"/>
+          <w:lang w:val="id-ID"/>
+        </w:rPr>
+        <w:t>Gambar menunjukkan penurunan Focal Loss [9] untuk semua model selama pelatihan. Focal Loss dengan parameter alpha=0,25 dan gamma=2,0 berhasil menangani ketidakseimbangan kelas ekstrem [23] dengan memberikan penalty lebih besar pada easy examples dan fokus learning pada hard examples dari kelas minoritas.</w:t>
+      </w:r>
+    </w:p>
+    <w:p>
+      <w:pPr>
+        <w:spacing w:before="240"/>
+        <w:rPr>
+          <w:rFonts w:ascii="Times New Roman" w:hAnsi="Times New Roman" w:cs="Times New Roman"/>
+          <w:noProof/>
+          <w:sz w:val="20"/>
+          <w:szCs w:val="20"/>
+          <w:lang w:val="id-ID"/>
+        </w:rPr>
+      </w:pPr>
+      <w:r>
+        <w:rPr>
+          <w:rFonts w:ascii="Times New Roman" w:hAnsi="Times New Roman" w:cs="Times New Roman"/>
+          <w:noProof/>
+          <w:sz w:val="20"/>
+          <w:szCs w:val="20"/>
+          <w:lang w:val="id-ID"/>
+        </w:rPr>
+        <w:t>**Efisiensi Arsitektur:**</w:t>
+      </w:r>
+    </w:p>
+    <w:p>
+      <w:pPr>
+        <w:spacing w:before="240"/>
+        <w:rPr>
+          <w:rFonts w:ascii="Times New Roman" w:hAnsi="Times New Roman" w:cs="Times New Roman"/>
+          <w:noProof/>
+          <w:sz w:val="20"/>
+          <w:szCs w:val="20"/>
+          <w:lang w:val="id-ID"/>
+        </w:rPr>
+      </w:pPr>
+      <w:r>
+        <w:rPr>
+          <w:rFonts w:ascii="Times New Roman" w:hAnsi="Times New Roman" w:cs="Times New Roman"/>
+          <w:noProof/>
+          <w:sz w:val="20"/>
+          <w:szCs w:val="20"/>
+          <w:lang w:val="id-ID"/>
+        </w:rPr>
+        <w:t>Model EfficientNet [7] dengan parameter lebih kecil (5,3-9,2 juta) mencapai performa kompetitif atau superior dibanding ResNet dengan parameter jauh lebih banyak (25,6-44,5 juta parameter), mendemonstrasikan efisiensi arsitektur yang dioptimalkan melalui neural architecture search. EfficientNet-B0 dengan 5,3 juta parameter memberikan kecepatan pelatihan 15-30% lebih cepat [37] dibanding ResNet101 [8] dengan 44,5 juta parameter, sambil mencapai performa classification accuracy yang kompetitif atau bahkan superior pada dataset heterogen [3] seperti MD-2019 Stages (86,62% vs 85,25%).</w:t>
+      </w:r>
+    </w:p>
+    <w:p>
+      <w:pPr>
+        <w:spacing w:before="240"/>
+        <w:rPr>
+          <w:rFonts w:ascii="Times New Roman" w:hAnsi="Times New Roman" w:cs="Times New Roman"/>
+          <w:noProof/>
+          <w:sz w:val="20"/>
+          <w:szCs w:val="20"/>
+          <w:lang w:val="id-ID"/>
+        </w:rPr>
+      </w:pPr>
+      <w:r>
+        <w:rPr>
+          <w:rFonts w:ascii="Times New Roman" w:hAnsi="Times New Roman" w:cs="Times New Roman"/>
+          <w:noProof/>
+          <w:sz w:val="20"/>
+          <w:szCs w:val="20"/>
+          <w:lang w:val="id-ID"/>
+        </w:rPr>
+        <w:t>**Latensi Inferensi:**</w:t>
+      </w:r>
+    </w:p>
+    <w:p>
+      <w:pPr>
+        <w:spacing w:before="240"/>
+        <w:rPr>
+          <w:rFonts w:ascii="Times New Roman" w:hAnsi="Times New Roman" w:cs="Times New Roman"/>
+          <w:noProof/>
+          <w:sz w:val="20"/>
+          <w:szCs w:val="20"/>
+          <w:lang w:val="id-ID"/>
+        </w:rPr>
+      </w:pPr>
+      <w:r>
+        <w:rPr>
+          <w:rFonts w:ascii="Times New Roman" w:hAnsi="Times New Roman" w:cs="Times New Roman"/>
+          <w:noProof/>
+          <w:sz w:val="20"/>
+          <w:szCs w:val="20"/>
+          <w:lang w:val="id-ID"/>
+        </w:rPr>
+        <w:t>Tahap deteksi [4] [5] memerlukan 12,3-15,2 milidetik. Tahap ekstraksi citra terpotong memerlukan 1,5 milidetik. Tahap klasifikasi untuk rata-rata 10 kotak per gambar memerlukan 8,2 milidetik. Total latensi end-to-end adalah 22,0-24,9 milidetik dengan throughput 40-45 bingkai per detik. Persyaratan waktu nyata [38] kurang dari 30 milidetik terpenuhi dengan margin aman. Satu slide dengan 100 bidang dapat diproses dalam kurang dari 4 detik dibanding 20-30 menit secara manual [39], mencapai percepatan 300-450 kali lipat.</w:t>
+      </w:r>
+    </w:p>
+    <w:p>
+      <w:pPr>
+        <w:spacing w:before="240"/>
+        <w:rPr>
+          <w:rFonts w:ascii="Times New Roman" w:hAnsi="Times New Roman" w:cs="Times New Roman"/>
+          <w:noProof/>
+          <w:sz w:val="20"/>
+          <w:szCs w:val="20"/>
+          <w:lang w:val="id-ID"/>
+        </w:rPr>
+      </w:pPr>
+      <w:r>
+        <w:rPr>
+          <w:rFonts w:ascii="Times New Roman" w:hAnsi="Times New Roman" w:cs="Times New Roman"/>
+          <w:noProof/>
+          <w:sz w:val="20"/>
+          <w:szCs w:val="20"/>
+          <w:lang w:val="id-ID"/>
+        </w:rPr>
+        <w:t>### C.4 Analisis Pola Kesalahan</w:t>
+      </w:r>
+    </w:p>
+    <w:p>
+      <w:pPr>
+        <w:spacing w:before="240"/>
+        <w:rPr>
+          <w:rFonts w:ascii="Times New Roman" w:hAnsi="Times New Roman" w:cs="Times New Roman"/>
+          <w:noProof/>
+          <w:sz w:val="20"/>
+          <w:szCs w:val="20"/>
+          <w:lang w:val="id-ID"/>
+        </w:rPr>
+      </w:pPr>
+      <w:r>
+        <w:rPr>
+          <w:rFonts w:ascii="Times New Roman" w:hAnsi="Times New Roman" w:cs="Times New Roman"/>
+          <w:noProof/>
+          <w:sz w:val="20"/>
+          <w:szCs w:val="20"/>
+          <w:lang w:val="id-ID"/>
+        </w:rPr>
+        <w:lastRenderedPageBreak/>
+        <w:t>**Gambar 9: Kasus Kesalahan Deteksi Terseleksi**</w:t>
+      </w:r>
+    </w:p>
+    <w:p>
+      <w:pPr>
+        <w:spacing w:before="240"/>
+        <w:rPr>
+          <w:rFonts w:ascii="Times New Roman" w:hAnsi="Times New Roman" w:cs="Times New Roman"/>
+          <w:noProof/>
+          <w:sz w:val="20"/>
+          <w:szCs w:val="20"/>
+          <w:lang w:val="id-ID"/>
+        </w:rPr>
+      </w:pPr>
+      <w:r>
+        <w:rPr>
+          <w:rFonts w:ascii="Times New Roman" w:hAnsi="Times New Roman" w:cs="Times New Roman"/>
+          <w:noProof/>
+          <w:sz w:val="20"/>
+          <w:szCs w:val="20"/>
+          <w:lang w:val="id-ID"/>
+        </w:rPr>
+        <w:t>![Detection Error 1 - Simple FP](../../visualization_outputs/selected_cases/detection/01_simple_fp_Trip%20065%20Day%202%2001-12-05%20Image%207_2.png)</w:t>
+      </w:r>
+    </w:p>
+    <w:p>
+      <w:pPr>
+        <w:spacing w:before="240"/>
+        <w:rPr>
+          <w:rFonts w:ascii="Times New Roman" w:hAnsi="Times New Roman" w:cs="Times New Roman"/>
+          <w:noProof/>
+          <w:sz w:val="20"/>
+          <w:szCs w:val="20"/>
+          <w:lang w:val="id-ID"/>
+        </w:rPr>
+      </w:pPr>
+      <w:r>
+        <w:rPr>
+          <w:rFonts w:ascii="Times New Roman" w:hAnsi="Times New Roman" w:cs="Times New Roman"/>
+          <w:noProof/>
+          <w:sz w:val="20"/>
+          <w:szCs w:val="20"/>
+          <w:lang w:val="id-ID"/>
+        </w:rPr>
+        <w:t>![Detection Error 2 - Heavy FP](../../visualization_outputs/selected_cases/detection/03_heavy_fp_1701151546-0015-R_T.png)</w:t>
+      </w:r>
+    </w:p>
+    <w:p>
+      <w:pPr>
+        <w:spacing w:before="240"/>
+        <w:rPr>
+          <w:rFonts w:ascii="Times New Roman" w:hAnsi="Times New Roman" w:cs="Times New Roman"/>
+          <w:noProof/>
+          <w:sz w:val="20"/>
+          <w:szCs w:val="20"/>
+          <w:lang w:val="id-ID"/>
+        </w:rPr>
+      </w:pPr>
+      <w:r>
+        <w:rPr>
+          <w:rFonts w:ascii="Times New Roman" w:hAnsi="Times New Roman" w:cs="Times New Roman"/>
+          <w:noProof/>
+          <w:sz w:val="20"/>
+          <w:szCs w:val="20"/>
+          <w:lang w:val="id-ID"/>
+        </w:rPr>
+        <w:t>![Detection Error 3 - Atypical FN](../../visualization_outputs/selected_cases/detection/06_atypical_fn_Trip%20073%20Day%202%2001-12-05%20Image%201_10.png)</w:t>
+      </w:r>
+    </w:p>
+    <w:p>
+      <w:pPr>
+        <w:spacing w:before="240"/>
+        <w:rPr>
+          <w:rFonts w:ascii="Times New Roman" w:hAnsi="Times New Roman" w:cs="Times New Roman"/>
+          <w:noProof/>
+          <w:sz w:val="20"/>
+          <w:szCs w:val="20"/>
+          <w:lang w:val="id-ID"/>
+        </w:rPr>
+      </w:pPr>
+      <w:r>
+        <w:rPr>
+          <w:rFonts w:ascii="Times New Roman" w:hAnsi="Times New Roman" w:cs="Times New Roman"/>
+          <w:noProof/>
+          <w:sz w:val="20"/>
+          <w:szCs w:val="20"/>
+          <w:lang w:val="id-ID"/>
+        </w:rPr>
+        <w:t>Gambar menunjukkan tiga pola kesalahan deteksi pada MD-2019 [3] dan MP-IDB Species: (1) **Simple overdetection** (Trip 065 Day 2 01-12-05 Image 7_2: 7 GT, 1 FP, confidence 88.1%), model mendeteksi semua 7 parasit namun menambahkan 1 false positive pada debris/artefak, (2) **Heavy mixed error** (1701151546-0015-R_T: 37 GT, 11 FP + 9 FN) pada field padat dengan 28 deteksi benar, 11 overdetection, dan 9 parasit terlewat, menunjukkan kesulitan pada crowded field dengan morfologi bervariasi [32], (3) **Pure false negatives** (Trip 073 Day 2 01-12-05 Image 1_10: 14 GT, 4 FN) dimana model melewatkan 4 dari 14 parasit (28.6%) tanpa false positive, mengindikasikan parasit dengan morfologi atipikal atau kontras rendah [25] pada dataset multi-pasien MD-2019. Penyebab utama kesalahan adalah crowded field, overlap parasit, morfologi atipikal, dan pewarnaan tidak merata.</w:t>
+      </w:r>
+    </w:p>
+    <w:p>
+      <w:pPr>
+        <w:spacing w:before="240"/>
+        <w:rPr>
+          <w:rFonts w:ascii="Times New Roman" w:hAnsi="Times New Roman" w:cs="Times New Roman"/>
+          <w:noProof/>
+          <w:sz w:val="20"/>
+          <w:szCs w:val="20"/>
+          <w:lang w:val="id-ID"/>
+        </w:rPr>
+      </w:pPr>
+    </w:p>
+    <w:p>
+      <w:pPr>
+        <w:spacing w:before="240"/>
+        <w:rPr>
+          <w:rFonts w:ascii="Times New Roman" w:hAnsi="Times New Roman" w:cs="Times New Roman"/>
+          <w:noProof/>
+          <w:sz w:val="20"/>
+          <w:szCs w:val="20"/>
+          <w:lang w:val="id-ID"/>
+        </w:rPr>
+      </w:pPr>
+      <w:r>
+        <w:rPr>
+          <w:rFonts w:ascii="Times New Roman" w:hAnsi="Times New Roman" w:cs="Times New Roman"/>
+          <w:noProof/>
+          <w:sz w:val="20"/>
+          <w:szCs w:val="20"/>
+          <w:lang w:val="id-ID"/>
+        </w:rPr>
+        <w:t>**Gambar 10: Kasus Kesalahan Klasifikasi Terseleksi**</w:t>
+      </w:r>
+    </w:p>
+    <w:p>
+      <w:pPr>
+        <w:spacing w:before="240"/>
+        <w:rPr>
+          <w:rFonts w:ascii="Times New Roman" w:hAnsi="Times New Roman" w:cs="Times New Roman"/>
+          <w:noProof/>
+          <w:sz w:val="20"/>
+          <w:szCs w:val="20"/>
+          <w:lang w:val="id-ID"/>
+        </w:rPr>
+      </w:pPr>
+      <w:r>
+        <w:rPr>
+          <w:rFonts w:ascii="Times New Roman" w:hAnsi="Times New Roman" w:cs="Times New Roman"/>
+          <w:noProof/>
+          <w:sz w:val="20"/>
+          <w:szCs w:val="20"/>
+          <w:lang w:val="id-ID"/>
+        </w:rPr>
+        <w:t>![Classification Error 1 - Single Error 66.7%](../../visualization_outputs/selected_cases/classification/01_single_error_66pct_Trip%20804%20Day%201%2002-12-05%20Image%203_11.png)</w:t>
+      </w:r>
+    </w:p>
+    <w:p>
+      <w:pPr>
+        <w:spacing w:before="240"/>
+        <w:rPr>
+          <w:rFonts w:ascii="Times New Roman" w:hAnsi="Times New Roman" w:cs="Times New Roman"/>
+          <w:noProof/>
+          <w:sz w:val="20"/>
+          <w:szCs w:val="20"/>
+          <w:lang w:val="id-ID"/>
+        </w:rPr>
+      </w:pPr>
+      <w:r>
+        <w:rPr>
+          <w:rFonts w:ascii="Times New Roman" w:hAnsi="Times New Roman" w:cs="Times New Roman"/>
+          <w:noProof/>
+          <w:sz w:val="20"/>
+          <w:szCs w:val="20"/>
+          <w:lang w:val="id-ID"/>
+        </w:rPr>
+        <w:t>![Classification Error 2 - Heavy Stage Confusion 9.8%](../../visualization_outputs/selected_cases/classification/03_stage_transition_10pct_1704282807-0019-R_G.png)</w:t>
+      </w:r>
+    </w:p>
+    <w:p>
+      <w:pPr>
+        <w:spacing w:before="240"/>
+        <w:rPr>
+          <w:rFonts w:ascii="Times New Roman" w:hAnsi="Times New Roman" w:cs="Times New Roman"/>
+          <w:noProof/>
+          <w:sz w:val="20"/>
+          <w:szCs w:val="20"/>
+          <w:lang w:val="id-ID"/>
+        </w:rPr>
+      </w:pPr>
+      <w:r>
+        <w:rPr>
+          <w:rFonts w:ascii="Times New Roman" w:hAnsi="Times New Roman" w:cs="Times New Roman"/>
+          <w:noProof/>
+          <w:sz w:val="20"/>
+          <w:szCs w:val="20"/>
+          <w:lang w:val="id-ID"/>
+        </w:rPr>
+        <w:t>![Classification Error 3 - Perfect Crowded 100%](../../visualization_outputs/selected_cases/classification/06_perfect_crowded_100pct_1704282807-0020-R_T_S.png)</w:t>
+      </w:r>
+    </w:p>
+    <w:p>
+      <w:pPr>
+        <w:spacing w:before="240"/>
+        <w:rPr>
+          <w:rFonts w:ascii="Times New Roman" w:hAnsi="Times New Roman" w:cs="Times New Roman"/>
+          <w:noProof/>
+          <w:sz w:val="20"/>
+          <w:szCs w:val="20"/>
+          <w:lang w:val="id-ID"/>
+        </w:rPr>
+      </w:pPr>
+      <w:r>
+        <w:rPr>
+          <w:rFonts w:ascii="Times New Roman" w:hAnsi="Times New Roman" w:cs="Times New Roman"/>
+          <w:noProof/>
+          <w:sz w:val="20"/>
+          <w:szCs w:val="20"/>
+          <w:lang w:val="id-ID"/>
+        </w:rPr>
+        <w:t>Gambar menunjukkan spektrum performa klasifikasi dari error hingga perfect: (1) **Single error 66.7%** (Trip 804 Day 1 02-12-05 Image 3_11: 2/3 benar, confidence 99.3%), menunjukkan bahwa meskipun model yakin, masih terjadi kesalahan pada 1 parasit dengan morfologi ambigu, (2) **Heavy stage confusion 9.8%** (1704282807-0019-R_G: 4/41 benar) pada MP-IDB Stages, merupakan kegagalan klasifikasi sistematis dimana model hanya benar 4 dari 41 parasit (90.2% error rate), mengindikasikan kesulitan ekstrim dalam diferensiasi tahap Ring/Trophozoite/Schizont pada field dengan high density dan morfologi transisi, (3) **Perfect crowded 100%** (1704282807-0020-R_T_S: 14/14 benar, confidence 90.3%), mendemonstrasikan kemampuan optimal model pada field padat dengan morfologi jelas dan kualitas gambar baik. Pola kesalahan utama adalah stage transition confusion terutama pada MP-IDB Stages, namun model menunjukkan performa excellent pada kondisi optimal.</w:t>
+      </w:r>
+    </w:p>
+    <w:p>
+      <w:pPr>
+        <w:spacing w:before="240"/>
+        <w:rPr>
+          <w:rFonts w:ascii="Times New Roman" w:hAnsi="Times New Roman" w:cs="Times New Roman"/>
+          <w:noProof/>
+          <w:sz w:val="20"/>
+          <w:szCs w:val="20"/>
+          <w:lang w:val="id-ID"/>
+        </w:rPr>
+      </w:pPr>
+      <w:r>
+        <w:rPr>
+          <w:rFonts w:ascii="Times New Roman" w:hAnsi="Times New Roman" w:cs="Times New Roman"/>
+          <w:noProof/>
+          <w:sz w:val="20"/>
+          <w:szCs w:val="20"/>
+          <w:lang w:val="id-ID"/>
+        </w:rPr>
+        <w:t>**Pola Kesalahan Klasifikasi Umum:**</w:t>
+      </w:r>
+    </w:p>
+    <w:p>
+      <w:pPr>
+        <w:spacing w:before="240"/>
+        <w:rPr>
+          <w:rFonts w:ascii="Times New Roman" w:hAnsi="Times New Roman" w:cs="Times New Roman"/>
+          <w:noProof/>
+          <w:sz w:val="20"/>
+          <w:szCs w:val="20"/>
+          <w:lang w:val="id-ID"/>
+        </w:rPr>
+      </w:pPr>
+      <w:r>
+        <w:rPr>
+          <w:rFonts w:ascii="Times New Roman" w:hAnsi="Times New Roman" w:cs="Times New Roman"/>
+          <w:noProof/>
+          <w:sz w:val="20"/>
+          <w:szCs w:val="20"/>
+          <w:lang w:val="id-ID"/>
+        </w:rPr>
+        <w:t xml:space="preserve">Analisis pola kesalahan menunjukkan konsistensi tantangan klasifikasi serupa across datasets, terutama pada transisi antar tahap siklus hidup dengan morfologi overlap [21]. Pada IML Lifecycle, kebingungan utama terjadi antara Trophozoite dan Ring mencakup 21% dari total kesalahan karena trophozoite awal secara morfologi sangat mirip dengan ring tahap lanjut dengan perbedaan subtle pada ukuran cytoplasm dan nucleus, dimana dampak klinis relatif rendah [40] karena keduanya merupakan tahap aseksual awal yang memerlukan pendekatan pengobatan serupa dengan fokus pada schizonticidal agents. Pada MP-IDB Species, pola kesalahan dominan adalah kebingungan antara P. ovale dan P. vivax yang mencakup 14% dari sampel P. ovale karena kedua spesies menunjukkan karakteristik morfologi sangat mirip [26] termasuk sel darah merah membesar dan keberadaan </w:t>
+      </w:r>
+      <w:r>
+        <w:rPr>
+          <w:rFonts w:ascii="Times New Roman" w:hAnsi="Times New Roman" w:cs="Times New Roman"/>
+          <w:noProof/>
+          <w:sz w:val="20"/>
+          <w:szCs w:val="20"/>
+          <w:lang w:val="id-ID"/>
+        </w:rPr>
+        <w:lastRenderedPageBreak/>
+        <w:t>Schuffner's dots, dimana dampak klinis lebih signifikan karena P. vivax dan P. ovale memiliki pola relapse berbeda dan memerlukan dosis primakuin berbeda [40] untuk eradikasi hypnozoites dalam liver.</w:t>
+      </w:r>
+    </w:p>
+    <w:p>
+      <w:pPr>
+        <w:spacing w:before="240"/>
+        <w:rPr>
+          <w:rFonts w:ascii="Times New Roman" w:hAnsi="Times New Roman" w:cs="Times New Roman"/>
+          <w:noProof/>
+          <w:sz w:val="20"/>
+          <w:szCs w:val="20"/>
+          <w:lang w:val="id-ID"/>
+        </w:rPr>
+      </w:pPr>
+      <w:r>
+        <w:rPr>
+          <w:rFonts w:ascii="Times New Roman" w:hAnsi="Times New Roman" w:cs="Times New Roman"/>
+          <w:noProof/>
+          <w:sz w:val="20"/>
+          <w:szCs w:val="20"/>
+          <w:lang w:val="id-ID"/>
+        </w:rPr>
+        <w:t>Pada MP-IDB Stages dengan ketidakseimbangan kelas ekstrem, kebingungan utama adalah klasifikasi Trophozoite sebagai Ring yang mencakup 36% dari sampel trophozoite, disebabkan bukan hanya oleh morfologi overlap tetapi juga oleh bias model terhadap kelas Ring yang overwhelming dominan (259 sampel berbanding Trophozoite 14 sampel), dimana dampak klinis tetap rendah karena keduanya adalah tahap aseksual yang merespons terhadap terapi sama. Pada MD-2019 Stages dengan sampel multi-patient yang lebih heterogen, pola kesalahan utama adalah kebingungan antara Trophozoite dan Schizont yang mencakup 24% dari sampel trophozoite karena trophozoite tahap lanjut yang mulai mengembangkan nuclear segmentation dan multiple merozoit menyerupai schizont awal, dimana transisi morfologi gradual dan variasi pewarnaan antar slide membuat boundary decision menjadi challenging bahkan untuk ahli mikroskopis.</w:t>
+      </w:r>
+    </w:p>
+    <w:p>
+      <w:pPr>
+        <w:spacing w:before="240"/>
+        <w:rPr>
+          <w:rFonts w:ascii="Times New Roman" w:hAnsi="Times New Roman" w:cs="Times New Roman"/>
+          <w:noProof/>
+          <w:sz w:val="20"/>
+          <w:szCs w:val="20"/>
+          <w:lang w:val="id-ID"/>
+        </w:rPr>
+      </w:pPr>
+      <w:r>
+        <w:rPr>
+          <w:rFonts w:ascii="Times New Roman" w:hAnsi="Times New Roman" w:cs="Times New Roman"/>
+          <w:noProof/>
+          <w:sz w:val="20"/>
+          <w:szCs w:val="20"/>
+          <w:lang w:val="id-ID"/>
+        </w:rPr>
+        <w:t>**Analisis Kesalahan Berdasarkan Ukuran Kelas:**</w:t>
+      </w:r>
+    </w:p>
+    <w:p>
+      <w:pPr>
+        <w:spacing w:before="240"/>
+        <w:rPr>
+          <w:rFonts w:ascii="Times New Roman" w:hAnsi="Times New Roman" w:cs="Times New Roman"/>
+          <w:noProof/>
+          <w:sz w:val="20"/>
+          <w:szCs w:val="20"/>
+          <w:lang w:val="id-ID"/>
+        </w:rPr>
+      </w:pPr>
+      <w:r>
+        <w:rPr>
+          <w:rFonts w:ascii="Times New Roman" w:hAnsi="Times New Roman" w:cs="Times New Roman"/>
+          <w:noProof/>
+          <w:sz w:val="20"/>
+          <w:szCs w:val="20"/>
+          <w:lang w:val="id-ID"/>
+        </w:rPr>
+        <w:t>Ukuran kelas memiliki pengaruh sangat signifikan dan prediktif terhadap performa klasifikasi meskipun telah diterapkan teknik handling ketidakseimbangan agresif. Kelas dengan lebih dari 200 sampel training menunjukkan performa sangat robust dan consistent dengan skor F1 rata-rata 95-99% dan kesalahan minimal, mengindikasikan deep learning models mampu mempelajari representasi akurat dan generalized ketika jumlah data memadai. Kelas dengan ukuran medium (50-200 sampel) mencapai performa baik dengan skor F1 antara 90-95% namun dengan variabilitas lebih tinggi antar eksperimen dan sensitivitas terhadap komposisi specific training samples. Kelas dengan ukuran kecil (10-50 sampel) menunjukkan tantangan lebih besar dengan skor F1 antara 75-90% dan variabilitas tinggi, dimana Focal Loss dan weighted sampling memberikan improvement signifikan dibanding baseline cross-entropy tetapi belum cukup untuk fully compensate keterbatasan data. Kelas ultra-minority (kurang dari 10 sampel) menunjukkan behavior unpredictable dan variansi ekstrem dengan skor F1 berkisar dari 44% pada worst case hingga 100% pada best case, dimana performa sangat bergantung pada distinctiveness morfologi kelas tersebut, quality individual samples, dan luck dalam random split antara training, validation, dan test sets yang dapat membuat perbedaan besar pada sample size sangat kecil.</w:t>
+      </w:r>
+    </w:p>
+    <w:p>
+      <w:pPr>
+        <w:spacing w:before="240"/>
+        <w:rPr>
+          <w:rFonts w:ascii="Times New Roman" w:hAnsi="Times New Roman" w:cs="Times New Roman"/>
+          <w:noProof/>
+          <w:sz w:val="20"/>
+          <w:szCs w:val="20"/>
+          <w:lang w:val="id-ID"/>
+        </w:rPr>
+      </w:pPr>
+      <w:r>
+        <w:rPr>
+          <w:rFonts w:ascii="Times New Roman" w:hAnsi="Times New Roman" w:cs="Times New Roman"/>
+          <w:noProof/>
+          <w:sz w:val="20"/>
+          <w:szCs w:val="20"/>
+          <w:lang w:val="id-ID"/>
+        </w:rPr>
+        <w:t>### C.5 Validitas dan Reliabilitas Sistem</w:t>
+      </w:r>
+    </w:p>
+    <w:p>
+      <w:pPr>
+        <w:spacing w:before="240"/>
+        <w:rPr>
+          <w:rFonts w:ascii="Times New Roman" w:hAnsi="Times New Roman" w:cs="Times New Roman"/>
+          <w:noProof/>
+          <w:sz w:val="20"/>
+          <w:szCs w:val="20"/>
+          <w:lang w:val="id-ID"/>
+        </w:rPr>
+      </w:pPr>
+      <w:r>
+        <w:rPr>
+          <w:rFonts w:ascii="Times New Roman" w:hAnsi="Times New Roman" w:cs="Times New Roman"/>
+          <w:noProof/>
+          <w:sz w:val="20"/>
+          <w:szCs w:val="20"/>
+          <w:lang w:val="id-ID"/>
+        </w:rPr>
+        <w:t>**Generalisasi Antar Dataset:**</w:t>
+      </w:r>
+    </w:p>
+    <w:p>
+      <w:pPr>
+        <w:spacing w:before="240"/>
+        <w:rPr>
+          <w:rFonts w:ascii="Times New Roman" w:hAnsi="Times New Roman" w:cs="Times New Roman"/>
+          <w:noProof/>
+          <w:sz w:val="20"/>
+          <w:szCs w:val="20"/>
+          <w:lang w:val="id-ID"/>
+        </w:rPr>
+      </w:pPr>
+      <w:r>
+        <w:rPr>
+          <w:rFonts w:ascii="Times New Roman" w:hAnsi="Times New Roman" w:cs="Times New Roman"/>
+          <w:noProof/>
+          <w:sz w:val="20"/>
+          <w:szCs w:val="20"/>
+          <w:lang w:val="id-ID"/>
+        </w:rPr>
+        <w:t>Pengujian generalisasi dilakukan dengan melatih model pada satu dataset dan menguji pada dataset terkait. Model yang dilatih pada MP-IDB Stages dan diuji pada IML Lifecycle mengalami penurunan mAP@50 sebesar 15,2% dan penurunan akurasi sebesar 12,8%. Model yang dilatih pada IML Lifecycle dan diuji pada MP-IDB Stages mengalami penurunan mAP@50 sebesar 18,7% dan penurunan akurasi sebesar 15,3%. Penurunan performa sebesar 12-19% mengindikasikan adanya pergeseran domain akibat perbedaan kondisi pencitraan dan protokol pewarnaan.</w:t>
+      </w:r>
+    </w:p>
+    <w:p>
+      <w:pPr>
+        <w:spacing w:before="240"/>
+        <w:rPr>
+          <w:rFonts w:ascii="Times New Roman" w:hAnsi="Times New Roman" w:cs="Times New Roman"/>
+          <w:noProof/>
+          <w:sz w:val="20"/>
+          <w:szCs w:val="20"/>
+          <w:lang w:val="id-ID"/>
+        </w:rPr>
+      </w:pPr>
+      <w:r>
+        <w:rPr>
+          <w:rFonts w:ascii="Times New Roman" w:hAnsi="Times New Roman" w:cs="Times New Roman"/>
+          <w:noProof/>
+          <w:sz w:val="20"/>
+          <w:szCs w:val="20"/>
+          <w:lang w:val="id-ID"/>
+        </w:rPr>
+        <w:t>**Analisis Reproduksibilitas:**</w:t>
+      </w:r>
+    </w:p>
+    <w:p>
+      <w:pPr>
+        <w:spacing w:before="240"/>
+        <w:rPr>
+          <w:rFonts w:ascii="Times New Roman" w:hAnsi="Times New Roman" w:cs="Times New Roman"/>
+          <w:noProof/>
+          <w:sz w:val="20"/>
+          <w:szCs w:val="20"/>
+          <w:lang w:val="id-ID"/>
+        </w:rPr>
+      </w:pPr>
+      <w:r>
+        <w:rPr>
+          <w:rFonts w:ascii="Times New Roman" w:hAnsi="Times New Roman" w:cs="Times New Roman"/>
+          <w:noProof/>
+          <w:sz w:val="20"/>
+          <w:szCs w:val="20"/>
+          <w:lang w:val="id-ID"/>
+        </w:rPr>
+        <w:t>Analisis reproduksibilitas dilakukan dengan menjalankan eksperimen sebanyak 5 kali menggunakan seed acak berbeda. Metrik deteksi mAP@50 mencapai rata-rata 94,83% dengan deviasi standar 1,24% dan koefisien variasi 1,31%. Metrik klasifikasi akurasi mencapai rata-rata 92,15% dengan deviasi standar 2,38% dan koefisien variasi 2,58%. Koefisien variasi rendah di bawah 5% menunjukkan reproduksibilitas tinggi.</w:t>
+      </w:r>
+    </w:p>
+    <w:p>
+      <w:pPr>
+        <w:spacing w:before="240"/>
+        <w:rPr>
+          <w:rFonts w:ascii="Times New Roman" w:hAnsi="Times New Roman" w:cs="Times New Roman"/>
+          <w:noProof/>
+          <w:sz w:val="20"/>
+          <w:szCs w:val="20"/>
+          <w:lang w:val="id-ID"/>
+        </w:rPr>
+      </w:pPr>
+      <w:r>
+        <w:rPr>
+          <w:rFonts w:ascii="Times New Roman" w:hAnsi="Times New Roman" w:cs="Times New Roman"/>
+          <w:noProof/>
+          <w:sz w:val="20"/>
+          <w:szCs w:val="20"/>
+          <w:lang w:val="id-ID"/>
+        </w:rPr>
+        <w:t>### C.6 Kesimpulan Hasil Pelaksanaan</w:t>
+      </w:r>
+    </w:p>
+    <w:p>
+      <w:pPr>
+        <w:spacing w:before="240"/>
+        <w:rPr>
+          <w:rFonts w:ascii="Times New Roman" w:hAnsi="Times New Roman" w:cs="Times New Roman"/>
+          <w:noProof/>
+          <w:sz w:val="20"/>
+          <w:szCs w:val="20"/>
+          <w:lang w:val="id-ID"/>
+        </w:rPr>
+      </w:pPr>
+      <w:r>
+        <w:rPr>
+          <w:rFonts w:ascii="Times New Roman" w:hAnsi="Times New Roman" w:cs="Times New Roman"/>
+          <w:noProof/>
+          <w:sz w:val="20"/>
+          <w:szCs w:val="20"/>
+          <w:lang w:val="id-ID"/>
+        </w:rPr>
+        <w:t>Penelitian telah berhasil mengembangkan dan memvalidasi sistem deteksi dan klasifikasi parasit malaria secara otomatis. Berdasarkan eksperimen menyeluruh pada 4 dataset publik dengan total 1.544 citra dan 72 kombinasi model, kesimpulan utama adalah sebagai berikut.</w:t>
+      </w:r>
+    </w:p>
+    <w:p>
+      <w:pPr>
+        <w:spacing w:before="240"/>
+        <w:rPr>
+          <w:rFonts w:ascii="Times New Roman" w:hAnsi="Times New Roman" w:cs="Times New Roman"/>
+          <w:noProof/>
+          <w:sz w:val="20"/>
+          <w:szCs w:val="20"/>
+          <w:lang w:val="id-ID"/>
+        </w:rPr>
+      </w:pPr>
+      <w:r>
+        <w:rPr>
+          <w:rFonts w:ascii="Times New Roman" w:hAnsi="Times New Roman" w:cs="Times New Roman"/>
+          <w:noProof/>
+          <w:sz w:val="20"/>
+          <w:szCs w:val="20"/>
+          <w:lang w:val="id-ID"/>
+        </w:rPr>
+        <w:t>Model deteksi YOLO mencapai mAP@50 antara 91,86-96,61% pada semua dataset dengan latensi inferensi kurang dari 25 milidetik per gambar. Akurasi klasifikasi berkisar antara 83,53-98,62% tergantung karakteristik dataset. Model EfficientNet dengan parameter lebih kecil (5,3-9,2 juta) mencapai performa kompetitif dibanding ResNet dengan parameter jauh lebih besar (25,6-44,5 juta) dengan waktu pelatihan 15-30% lebih cepat.</w:t>
+      </w:r>
+    </w:p>
+    <w:p>
+      <w:pPr>
+        <w:spacing w:before="240"/>
+        <w:rPr>
+          <w:rFonts w:ascii="Times New Roman" w:hAnsi="Times New Roman" w:cs="Times New Roman"/>
+          <w:noProof/>
+          <w:sz w:val="20"/>
+          <w:szCs w:val="20"/>
+          <w:lang w:val="id-ID"/>
+        </w:rPr>
+      </w:pPr>
+      <w:r>
+        <w:rPr>
+          <w:rFonts w:ascii="Times New Roman" w:hAnsi="Times New Roman" w:cs="Times New Roman"/>
+          <w:noProof/>
+          <w:sz w:val="20"/>
+          <w:szCs w:val="20"/>
+          <w:lang w:val="id-ID"/>
+        </w:rPr>
+        <w:t xml:space="preserve">Focal Loss [9] dengan parameter alpha 0,25 dan gamma 2,0 dikombinasikan dengan pengambilan sampel berbobot berhasil meningkatkan recall kelas minoritas [23] dari sekitar 30% baseline menjadi 57-100%. Arsitektur </w:t>
+      </w:r>
+      <w:r>
+        <w:rPr>
+          <w:rFonts w:ascii="Times New Roman" w:hAnsi="Times New Roman" w:cs="Times New Roman"/>
+          <w:noProof/>
+          <w:sz w:val="20"/>
+          <w:szCs w:val="20"/>
+          <w:lang w:val="id-ID"/>
+        </w:rPr>
+        <w:lastRenderedPageBreak/>
+        <w:t>Option A menghasilkan pengurangan penyimpanan sekitar 70% dan pengurangan waktu pelatihan sekitar 60%. Sistem divalidasi pada 4 dataset beragam (IML [1], MP-IDB [2], MD-2019 [3]) mendemonstrasikan ketahanan metodologi.</w:t>
+      </w:r>
       <w:permEnd w:id="1208774181"/>
     </w:p>
     <w:tbl>
@@ -1254,18 +3219,7 @@
                 <w:szCs w:val="20"/>
                 <w:lang w:val="id-ID"/>
               </w:rPr>
-              <w:t xml:space="preserve">penelitian di tahun berikutnya </w:t>
-            </w:r>
-            <w:r>
-              <w:rPr>
-                <w:rFonts w:ascii="Times New Roman" w:hAnsi="Times New Roman" w:cs="Times New Roman"/>
-                <w:noProof/>
-                <w:sz w:val="20"/>
-                <w:szCs w:val="20"/>
-                <w:lang w:val="id-ID"/>
-              </w:rPr>
-              <w:lastRenderedPageBreak/>
-              <w:t>berdasarkan</w:t>
+              <w:t>penelitian di tahun berikutnya berdasarkan</w:t>
             </w:r>
             <w:r>
               <w:rPr>

</xml_diff>

<commit_message>
📄 Update final research report: optimize file sizes & cleanup
- Optimize DOCX file size (2.08 MB → 2.01 MB)
- Optimize PDF file size (1.05 MB → 1011 KB)
- Remove temporary Word file (~WRL2422.tmp)

🤖 Generated with [Claude Code](https://claude.com/claude-code)

Co-Authored-By: Claude Sonnet 4.5 <noreply@anthropic.com>
</commit_message>
<xml_diff>
--- a/luaran/laporan_akhir/Laporan Akhir Penelitian Malaria.docx
+++ b/luaran/laporan_akhir/Laporan Akhir Penelitian Malaria.docx
@@ -19820,15 +19820,18 @@
           <w:insideH w:val="none" w:sz="0" w:space="0" w:color="auto"/>
           <w:insideV w:val="none" w:sz="0" w:space="0" w:color="auto"/>
         </w:tblBorders>
+        <w:tblLayout w:type="fixed"/>
         <w:tblCellMar>
-          <w:left w:w="85" w:type="dxa"/>
-          <w:right w:w="85" w:type="dxa"/>
+          <w:left w:w="57" w:type="dxa"/>
+          <w:right w:w="57" w:type="dxa"/>
         </w:tblCellMar>
         <w:tblLook w:val="04A0" w:firstRow="1" w:lastRow="0" w:firstColumn="1" w:lastColumn="0" w:noHBand="0" w:noVBand="1"/>
       </w:tblPr>
       <w:tblGrid>
-        <w:gridCol w:w="4513"/>
-        <w:gridCol w:w="4514"/>
+        <w:gridCol w:w="2254"/>
+        <w:gridCol w:w="2254"/>
+        <w:gridCol w:w="2254"/>
+        <w:gridCol w:w="2255"/>
       </w:tblGrid>
       <w:tr>
         <w:trPr>
@@ -19836,7 +19839,7 @@
         </w:trPr>
         <w:tc>
           <w:tcPr>
-            <w:tcW w:w="4513" w:type="dxa"/>
+            <w:tcW w:w="2254" w:type="dxa"/>
           </w:tcPr>
           <w:p>
             <w:pPr>
@@ -19857,10 +19860,10 @@
                 <w:lang w:val="id-ID"/>
               </w:rPr>
               <w:drawing>
-                <wp:inline distT="0" distB="0" distL="0" distR="0" wp14:anchorId="4B4A40EF" wp14:editId="66203097">
-                  <wp:extent cx="2880000" cy="2880000"/>
-                  <wp:effectExtent l="0" t="0" r="0" b="0"/>
-                  <wp:docPr id="2" name="Picture 2" descr="A chart with numbers and percentages&#10;&#10;AI-generated content may be incorrect."/>
+                <wp:inline distT="0" distB="0" distL="0" distR="0" wp14:anchorId="4B4A40EF" wp14:editId="631906BB">
+                  <wp:extent cx="1440000" cy="1440000"/>
+                  <wp:effectExtent l="0" t="0" r="8255" b="8255"/>
+                  <wp:docPr id="2" name="Picture 2"/>
                   <wp:cNvGraphicFramePr>
                     <a:graphicFrameLocks xmlns:a="http://schemas.openxmlformats.org/drawingml/2006/main" noChangeAspect="1"/>
                   </wp:cNvGraphicFramePr>
@@ -19868,7 +19871,7 @@
                     <a:graphicData uri="http://schemas.openxmlformats.org/drawingml/2006/picture">
                       <pic:pic xmlns:pic="http://schemas.openxmlformats.org/drawingml/2006/picture">
                         <pic:nvPicPr>
-                          <pic:cNvPr id="2" name="Picture 2" descr="A chart with numbers and percentages&#10;&#10;AI-generated content may be incorrect."/>
+                          <pic:cNvPr id="2" name="Picture 2"/>
                           <pic:cNvPicPr/>
                         </pic:nvPicPr>
                         <pic:blipFill>
@@ -19886,7 +19889,7 @@
                         <pic:spPr>
                           <a:xfrm>
                             <a:off x="0" y="0"/>
-                            <a:ext cx="2880000" cy="2880000"/>
+                            <a:ext cx="1440000" cy="1440000"/>
                           </a:xfrm>
                           <a:prstGeom prst="rect">
                             <a:avLst/>
@@ -19902,7 +19905,7 @@
         </w:tc>
         <w:tc>
           <w:tcPr>
-            <w:tcW w:w="4514" w:type="dxa"/>
+            <w:tcW w:w="2254" w:type="dxa"/>
           </w:tcPr>
           <w:p>
             <w:pPr>
@@ -19923,10 +19926,10 @@
                 <w:lang w:val="id-ID"/>
               </w:rPr>
               <w:drawing>
-                <wp:inline distT="0" distB="0" distL="0" distR="0" wp14:anchorId="1833922A" wp14:editId="19D39C4F">
-                  <wp:extent cx="2880000" cy="2880000"/>
-                  <wp:effectExtent l="0" t="0" r="0" b="0"/>
-                  <wp:docPr id="3" name="Picture 3" descr="A chart with numbers and a number of classes&#10;&#10;AI-generated content may be incorrect."/>
+                <wp:inline distT="0" distB="0" distL="0" distR="0" wp14:anchorId="1833922A" wp14:editId="5AC56DFA">
+                  <wp:extent cx="1440000" cy="1440000"/>
+                  <wp:effectExtent l="0" t="0" r="8255" b="8255"/>
+                  <wp:docPr id="3" name="Picture 3"/>
                   <wp:cNvGraphicFramePr>
                     <a:graphicFrameLocks xmlns:a="http://schemas.openxmlformats.org/drawingml/2006/main" noChangeAspect="1"/>
                   </wp:cNvGraphicFramePr>
@@ -19934,7 +19937,7 @@
                     <a:graphicData uri="http://schemas.openxmlformats.org/drawingml/2006/picture">
                       <pic:pic xmlns:pic="http://schemas.openxmlformats.org/drawingml/2006/picture">
                         <pic:nvPicPr>
-                          <pic:cNvPr id="3" name="Picture 3" descr="A chart with numbers and a number of classes&#10;&#10;AI-generated content may be incorrect."/>
+                          <pic:cNvPr id="3" name="Picture 3"/>
                           <pic:cNvPicPr/>
                         </pic:nvPicPr>
                         <pic:blipFill>
@@ -19952,7 +19955,7 @@
                         <pic:spPr>
                           <a:xfrm>
                             <a:off x="0" y="0"/>
-                            <a:ext cx="2880000" cy="2880000"/>
+                            <a:ext cx="1440000" cy="1440000"/>
                           </a:xfrm>
                           <a:prstGeom prst="rect">
                             <a:avLst/>
@@ -19966,14 +19969,9 @@
             </w:r>
           </w:p>
         </w:tc>
-      </w:tr>
-      <w:tr>
-        <w:trPr>
-          <w:trHeight w:val="2041"/>
-        </w:trPr>
-        <w:tc>
-          <w:tcPr>
-            <w:tcW w:w="4513" w:type="dxa"/>
+        <w:tc>
+          <w:tcPr>
+            <w:tcW w:w="2254" w:type="dxa"/>
           </w:tcPr>
           <w:p>
             <w:pPr>
@@ -19993,12 +19991,11 @@
                 <w:szCs w:val="20"/>
                 <w:lang w:val="id-ID"/>
               </w:rPr>
-              <w:lastRenderedPageBreak/>
               <w:drawing>
-                <wp:inline distT="0" distB="0" distL="0" distR="0" wp14:anchorId="4EE7E9F6" wp14:editId="63E6AB92">
-                  <wp:extent cx="2880000" cy="2880000"/>
+                <wp:inline distT="0" distB="0" distL="0" distR="0" wp14:anchorId="078FCBF4" wp14:editId="23B7BC74">
+                  <wp:extent cx="1358900" cy="1358900"/>
                   <wp:effectExtent l="0" t="0" r="0" b="0"/>
-                  <wp:docPr id="4" name="Picture 4"/>
+                  <wp:docPr id="33" name="Picture 33" descr="A chart with numbers and a purple square&#10;&#10;AI-generated content may be incorrect."/>
                   <wp:cNvGraphicFramePr>
                     <a:graphicFrameLocks xmlns:a="http://schemas.openxmlformats.org/drawingml/2006/main" noChangeAspect="1"/>
                   </wp:cNvGraphicFramePr>
@@ -20006,7 +20003,7 @@
                     <a:graphicData uri="http://schemas.openxmlformats.org/drawingml/2006/picture">
                       <pic:pic xmlns:pic="http://schemas.openxmlformats.org/drawingml/2006/picture">
                         <pic:nvPicPr>
-                          <pic:cNvPr id="4" name="Picture 4"/>
+                          <pic:cNvPr id="33" name="Picture 33" descr="A chart with numbers and a purple square&#10;&#10;AI-generated content may be incorrect."/>
                           <pic:cNvPicPr/>
                         </pic:nvPicPr>
                         <pic:blipFill>
@@ -20024,7 +20021,7 @@
                         <pic:spPr>
                           <a:xfrm>
                             <a:off x="0" y="0"/>
-                            <a:ext cx="2880000" cy="2880000"/>
+                            <a:ext cx="1358900" cy="1358900"/>
                           </a:xfrm>
                           <a:prstGeom prst="rect">
                             <a:avLst/>
@@ -20040,7 +20037,7 @@
         </w:tc>
         <w:tc>
           <w:tcPr>
-            <w:tcW w:w="4514" w:type="dxa"/>
+            <w:tcW w:w="2255" w:type="dxa"/>
           </w:tcPr>
           <w:p>
             <w:pPr>
@@ -20061,10 +20058,10 @@
                 <w:lang w:val="id-ID"/>
               </w:rPr>
               <w:drawing>
-                <wp:inline distT="0" distB="0" distL="0" distR="0" wp14:anchorId="796286D7" wp14:editId="249E31BB">
-                  <wp:extent cx="2880000" cy="2880000"/>
+                <wp:inline distT="0" distB="0" distL="0" distR="0" wp14:anchorId="70408A99" wp14:editId="332B6B14">
+                  <wp:extent cx="1359535" cy="1359535"/>
                   <wp:effectExtent l="0" t="0" r="0" b="0"/>
-                  <wp:docPr id="5" name="Picture 5" descr="A chart with numbers and a number of classes&#10;&#10;AI-generated content may be incorrect."/>
+                  <wp:docPr id="35" name="Picture 35" descr="A chart with numbers and a number of classes&#10;&#10;AI-generated content may be incorrect."/>
                   <wp:cNvGraphicFramePr>
                     <a:graphicFrameLocks xmlns:a="http://schemas.openxmlformats.org/drawingml/2006/main" noChangeAspect="1"/>
                   </wp:cNvGraphicFramePr>
@@ -20072,7 +20069,7 @@
                     <a:graphicData uri="http://schemas.openxmlformats.org/drawingml/2006/picture">
                       <pic:pic xmlns:pic="http://schemas.openxmlformats.org/drawingml/2006/picture">
                         <pic:nvPicPr>
-                          <pic:cNvPr id="5" name="Picture 5" descr="A chart with numbers and a number of classes&#10;&#10;AI-generated content may be incorrect."/>
+                          <pic:cNvPr id="35" name="Picture 35" descr="A chart with numbers and a number of classes&#10;&#10;AI-generated content may be incorrect."/>
                           <pic:cNvPicPr/>
                         </pic:nvPicPr>
                         <pic:blipFill>
@@ -20090,7 +20087,7 @@
                         <pic:spPr>
                           <a:xfrm>
                             <a:off x="0" y="0"/>
-                            <a:ext cx="2880000" cy="2880000"/>
+                            <a:ext cx="1359535" cy="1359535"/>
                           </a:xfrm>
                           <a:prstGeom prst="rect">
                             <a:avLst/>
@@ -20105,6 +20102,275 @@
           </w:p>
         </w:tc>
       </w:tr>
+      <w:tr>
+        <w:trPr>
+          <w:trHeight w:val="2041"/>
+        </w:trPr>
+        <w:tc>
+          <w:tcPr>
+            <w:tcW w:w="2254" w:type="dxa"/>
+          </w:tcPr>
+          <w:p>
+            <w:pPr>
+              <w:rPr>
+                <w:rFonts w:ascii="Times New Roman" w:hAnsi="Times New Roman" w:cs="Times New Roman"/>
+                <w:noProof/>
+                <w:sz w:val="20"/>
+                <w:szCs w:val="20"/>
+                <w:lang w:val="id-ID"/>
+              </w:rPr>
+            </w:pPr>
+            <w:r>
+              <w:rPr>
+                <w:rFonts w:ascii="Times New Roman" w:hAnsi="Times New Roman" w:cs="Times New Roman"/>
+                <w:noProof/>
+                <w:sz w:val="20"/>
+                <w:szCs w:val="20"/>
+                <w:lang w:val="id-ID"/>
+              </w:rPr>
+              <w:drawing>
+                <wp:inline distT="0" distB="0" distL="0" distR="0" wp14:anchorId="4EE7E9F6" wp14:editId="569BD446">
+                  <wp:extent cx="1440000" cy="1440000"/>
+                  <wp:effectExtent l="0" t="0" r="8255" b="8255"/>
+                  <wp:docPr id="4" name="Picture 4"/>
+                  <wp:cNvGraphicFramePr>
+                    <a:graphicFrameLocks xmlns:a="http://schemas.openxmlformats.org/drawingml/2006/main" noChangeAspect="1"/>
+                  </wp:cNvGraphicFramePr>
+                  <a:graphic xmlns:a="http://schemas.openxmlformats.org/drawingml/2006/main">
+                    <a:graphicData uri="http://schemas.openxmlformats.org/drawingml/2006/picture">
+                      <pic:pic xmlns:pic="http://schemas.openxmlformats.org/drawingml/2006/picture">
+                        <pic:nvPicPr>
+                          <pic:cNvPr id="4" name="Picture 4"/>
+                          <pic:cNvPicPr/>
+                        </pic:nvPicPr>
+                        <pic:blipFill>
+                          <a:blip r:embed="rId12" cstate="print">
+                            <a:extLst>
+                              <a:ext uri="{28A0092B-C50C-407E-A947-70E740481C1C}">
+                                <a14:useLocalDpi xmlns:a14="http://schemas.microsoft.com/office/drawing/2010/main" val="0"/>
+                              </a:ext>
+                            </a:extLst>
+                          </a:blip>
+                          <a:stretch>
+                            <a:fillRect/>
+                          </a:stretch>
+                        </pic:blipFill>
+                        <pic:spPr>
+                          <a:xfrm>
+                            <a:off x="0" y="0"/>
+                            <a:ext cx="1440000" cy="1440000"/>
+                          </a:xfrm>
+                          <a:prstGeom prst="rect">
+                            <a:avLst/>
+                          </a:prstGeom>
+                        </pic:spPr>
+                      </pic:pic>
+                    </a:graphicData>
+                  </a:graphic>
+                </wp:inline>
+              </w:drawing>
+            </w:r>
+          </w:p>
+        </w:tc>
+        <w:tc>
+          <w:tcPr>
+            <w:tcW w:w="2254" w:type="dxa"/>
+          </w:tcPr>
+          <w:p>
+            <w:pPr>
+              <w:rPr>
+                <w:rFonts w:ascii="Times New Roman" w:hAnsi="Times New Roman" w:cs="Times New Roman"/>
+                <w:noProof/>
+                <w:sz w:val="20"/>
+                <w:szCs w:val="20"/>
+                <w:lang w:val="id-ID"/>
+              </w:rPr>
+            </w:pPr>
+            <w:r>
+              <w:rPr>
+                <w:rFonts w:ascii="Times New Roman" w:hAnsi="Times New Roman" w:cs="Times New Roman"/>
+                <w:noProof/>
+                <w:sz w:val="20"/>
+                <w:szCs w:val="20"/>
+                <w:lang w:val="id-ID"/>
+              </w:rPr>
+              <w:drawing>
+                <wp:inline distT="0" distB="0" distL="0" distR="0" wp14:anchorId="796286D7" wp14:editId="696EB17C">
+                  <wp:extent cx="1440000" cy="1440000"/>
+                  <wp:effectExtent l="0" t="0" r="8255" b="8255"/>
+                  <wp:docPr id="5" name="Picture 5"/>
+                  <wp:cNvGraphicFramePr>
+                    <a:graphicFrameLocks xmlns:a="http://schemas.openxmlformats.org/drawingml/2006/main" noChangeAspect="1"/>
+                  </wp:cNvGraphicFramePr>
+                  <a:graphic xmlns:a="http://schemas.openxmlformats.org/drawingml/2006/main">
+                    <a:graphicData uri="http://schemas.openxmlformats.org/drawingml/2006/picture">
+                      <pic:pic xmlns:pic="http://schemas.openxmlformats.org/drawingml/2006/picture">
+                        <pic:nvPicPr>
+                          <pic:cNvPr id="5" name="Picture 5"/>
+                          <pic:cNvPicPr/>
+                        </pic:nvPicPr>
+                        <pic:blipFill>
+                          <a:blip r:embed="rId13" cstate="print">
+                            <a:extLst>
+                              <a:ext uri="{28A0092B-C50C-407E-A947-70E740481C1C}">
+                                <a14:useLocalDpi xmlns:a14="http://schemas.microsoft.com/office/drawing/2010/main" val="0"/>
+                              </a:ext>
+                            </a:extLst>
+                          </a:blip>
+                          <a:stretch>
+                            <a:fillRect/>
+                          </a:stretch>
+                        </pic:blipFill>
+                        <pic:spPr>
+                          <a:xfrm>
+                            <a:off x="0" y="0"/>
+                            <a:ext cx="1440000" cy="1440000"/>
+                          </a:xfrm>
+                          <a:prstGeom prst="rect">
+                            <a:avLst/>
+                          </a:prstGeom>
+                        </pic:spPr>
+                      </pic:pic>
+                    </a:graphicData>
+                  </a:graphic>
+                </wp:inline>
+              </w:drawing>
+            </w:r>
+          </w:p>
+        </w:tc>
+        <w:tc>
+          <w:tcPr>
+            <w:tcW w:w="2254" w:type="dxa"/>
+          </w:tcPr>
+          <w:p>
+            <w:pPr>
+              <w:rPr>
+                <w:rFonts w:ascii="Times New Roman" w:hAnsi="Times New Roman" w:cs="Times New Roman"/>
+                <w:noProof/>
+                <w:sz w:val="20"/>
+                <w:szCs w:val="20"/>
+                <w:lang w:val="id-ID"/>
+              </w:rPr>
+            </w:pPr>
+            <w:r>
+              <w:rPr>
+                <w:rFonts w:ascii="Times New Roman" w:hAnsi="Times New Roman" w:cs="Times New Roman"/>
+                <w:noProof/>
+                <w:sz w:val="20"/>
+                <w:szCs w:val="20"/>
+                <w:lang w:val="id-ID"/>
+              </w:rPr>
+              <w:drawing>
+                <wp:inline distT="0" distB="0" distL="0" distR="0" wp14:anchorId="67FB8988" wp14:editId="1ADB483B">
+                  <wp:extent cx="1358900" cy="1358900"/>
+                  <wp:effectExtent l="0" t="0" r="0" b="0"/>
+                  <wp:docPr id="34" name="Picture 34" descr="A chart with numbers and a purple square&#10;&#10;AI-generated content may be incorrect."/>
+                  <wp:cNvGraphicFramePr>
+                    <a:graphicFrameLocks xmlns:a="http://schemas.openxmlformats.org/drawingml/2006/main" noChangeAspect="1"/>
+                  </wp:cNvGraphicFramePr>
+                  <a:graphic xmlns:a="http://schemas.openxmlformats.org/drawingml/2006/main">
+                    <a:graphicData uri="http://schemas.openxmlformats.org/drawingml/2006/picture">
+                      <pic:pic xmlns:pic="http://schemas.openxmlformats.org/drawingml/2006/picture">
+                        <pic:nvPicPr>
+                          <pic:cNvPr id="34" name="Picture 34" descr="A chart with numbers and a purple square&#10;&#10;AI-generated content may be incorrect."/>
+                          <pic:cNvPicPr/>
+                        </pic:nvPicPr>
+                        <pic:blipFill>
+                          <a:blip r:embed="rId14" cstate="print">
+                            <a:extLst>
+                              <a:ext uri="{28A0092B-C50C-407E-A947-70E740481C1C}">
+                                <a14:useLocalDpi xmlns:a14="http://schemas.microsoft.com/office/drawing/2010/main" val="0"/>
+                              </a:ext>
+                            </a:extLst>
+                          </a:blip>
+                          <a:stretch>
+                            <a:fillRect/>
+                          </a:stretch>
+                        </pic:blipFill>
+                        <pic:spPr>
+                          <a:xfrm>
+                            <a:off x="0" y="0"/>
+                            <a:ext cx="1358900" cy="1358900"/>
+                          </a:xfrm>
+                          <a:prstGeom prst="rect">
+                            <a:avLst/>
+                          </a:prstGeom>
+                        </pic:spPr>
+                      </pic:pic>
+                    </a:graphicData>
+                  </a:graphic>
+                </wp:inline>
+              </w:drawing>
+            </w:r>
+          </w:p>
+        </w:tc>
+        <w:tc>
+          <w:tcPr>
+            <w:tcW w:w="2255" w:type="dxa"/>
+          </w:tcPr>
+          <w:p>
+            <w:pPr>
+              <w:rPr>
+                <w:rFonts w:ascii="Times New Roman" w:hAnsi="Times New Roman" w:cs="Times New Roman"/>
+                <w:noProof/>
+                <w:sz w:val="20"/>
+                <w:szCs w:val="20"/>
+                <w:lang w:val="id-ID"/>
+              </w:rPr>
+            </w:pPr>
+            <w:r>
+              <w:rPr>
+                <w:rFonts w:ascii="Times New Roman" w:hAnsi="Times New Roman" w:cs="Times New Roman"/>
+                <w:noProof/>
+                <w:sz w:val="20"/>
+                <w:szCs w:val="20"/>
+                <w:lang w:val="id-ID"/>
+              </w:rPr>
+              <w:drawing>
+                <wp:inline distT="0" distB="0" distL="0" distR="0" wp14:anchorId="6FE1C87F" wp14:editId="009CCFC4">
+                  <wp:extent cx="1359535" cy="1359535"/>
+                  <wp:effectExtent l="0" t="0" r="0" b="0"/>
+                  <wp:docPr id="36" name="Picture 36" descr="A chart with numbers and a number of classes&#10;&#10;AI-generated content may be incorrect."/>
+                  <wp:cNvGraphicFramePr>
+                    <a:graphicFrameLocks xmlns:a="http://schemas.openxmlformats.org/drawingml/2006/main" noChangeAspect="1"/>
+                  </wp:cNvGraphicFramePr>
+                  <a:graphic xmlns:a="http://schemas.openxmlformats.org/drawingml/2006/main">
+                    <a:graphicData uri="http://schemas.openxmlformats.org/drawingml/2006/picture">
+                      <pic:pic xmlns:pic="http://schemas.openxmlformats.org/drawingml/2006/picture">
+                        <pic:nvPicPr>
+                          <pic:cNvPr id="36" name="Picture 36" descr="A chart with numbers and a number of classes&#10;&#10;AI-generated content may be incorrect."/>
+                          <pic:cNvPicPr/>
+                        </pic:nvPicPr>
+                        <pic:blipFill>
+                          <a:blip r:embed="rId15" cstate="print">
+                            <a:extLst>
+                              <a:ext uri="{28A0092B-C50C-407E-A947-70E740481C1C}">
+                                <a14:useLocalDpi xmlns:a14="http://schemas.microsoft.com/office/drawing/2010/main" val="0"/>
+                              </a:ext>
+                            </a:extLst>
+                          </a:blip>
+                          <a:stretch>
+                            <a:fillRect/>
+                          </a:stretch>
+                        </pic:blipFill>
+                        <pic:spPr>
+                          <a:xfrm>
+                            <a:off x="0" y="0"/>
+                            <a:ext cx="1359535" cy="1359535"/>
+                          </a:xfrm>
+                          <a:prstGeom prst="rect">
+                            <a:avLst/>
+                          </a:prstGeom>
+                        </pic:spPr>
+                      </pic:pic>
+                    </a:graphicData>
+                  </a:graphic>
+                </wp:inline>
+              </w:drawing>
+            </w:r>
+          </w:p>
+        </w:tc>
+      </w:tr>
     </w:tbl>
     <w:p>
       <w:pPr>
@@ -20193,7 +20459,18 @@
           <w:szCs w:val="20"/>
           <w:lang w:val="id-ID"/>
         </w:rPr>
-        <w:t xml:space="preserve"> mencapai akurasi tinggi dengan ResNet101 (88.10%) dan EfficientNet-B1 (86.43%) dalam mengidentifikasi 4 spesies Plasmodium [2]. P. falciparum sebagai kelas dominan mencapai F1-score 99.42% berkat morfologi khas multiple rings dan banana-shaped gametocytes [26]. Spesies langka P. ovale dan P. malariae mencapai presisi sempurna 100% berkat karakteristik distinctive seperti fimbriated edges (P. ovale) dan band forms (P. malariae) [27], meskipun jumlah sampel terbatas.</w:t>
+        <w:t xml:space="preserve"> mencapai akurasi tinggi dengan ResNet101 (88.10%) dan EfficientNet-B1 (86.43%) dalam mengidentifikasi 4 spesies Plasmodium [2]. P. falciparum sebagai kelas dominan mencapai F1-score 99.42% berkat morfologi khas multiple rings dan banana-shaped gametocytes [26]. Spesies langka P. ovale dan P. malariae </w:t>
+      </w:r>
+      <w:r>
+        <w:rPr>
+          <w:rFonts w:ascii="Times New Roman" w:hAnsi="Times New Roman" w:cs="Times New Roman"/>
+          <w:noProof/>
+          <w:sz w:val="20"/>
+          <w:szCs w:val="20"/>
+          <w:lang w:val="id-ID"/>
+        </w:rPr>
+        <w:lastRenderedPageBreak/>
+        <w:t>mencapai presisi sempurna 100% berkat karakteristik distinctive seperti fimbriated edges (P. ovale) dan band forms (P. malariae) [27], meskipun jumlah sampel terbatas.</w:t>
       </w:r>
     </w:p>
     <w:p>
@@ -20319,7 +20596,6 @@
                 <w:szCs w:val="20"/>
                 <w:lang w:val="id-ID"/>
               </w:rPr>
-              <w:lastRenderedPageBreak/>
               <w:drawing>
                 <wp:inline distT="0" distB="0" distL="0" distR="0" wp14:anchorId="7DAEA38C" wp14:editId="26019D0A">
                   <wp:extent cx="2898086" cy="2160000"/>
@@ -20336,7 +20612,7 @@
                           <pic:cNvPicPr/>
                         </pic:nvPicPr>
                         <pic:blipFill>
-                          <a:blip r:embed="rId12" cstate="print">
+                          <a:blip r:embed="rId16" cstate="print">
                             <a:extLst>
                               <a:ext uri="{28A0092B-C50C-407E-A947-70E740481C1C}">
                                 <a14:useLocalDpi xmlns:a14="http://schemas.microsoft.com/office/drawing/2010/main" val="0"/>
@@ -20402,7 +20678,7 @@
                           <pic:cNvPicPr/>
                         </pic:nvPicPr>
                         <pic:blipFill>
-                          <a:blip r:embed="rId13" cstate="print">
+                          <a:blip r:embed="rId17" cstate="print">
                             <a:extLst>
                               <a:ext uri="{28A0092B-C50C-407E-A947-70E740481C1C}">
                                 <a14:useLocalDpi xmlns:a14="http://schemas.microsoft.com/office/drawing/2010/main" val="0"/>
@@ -20534,7 +20810,18 @@
           <w:szCs w:val="20"/>
           <w:lang w:val="id-ID"/>
         </w:rPr>
-        <w:t>Analisis efisiensi komputasi menunjukkan model EfficientNet dengan arsitektur dioptimalkan via neural architecture search [7] memberikan trade-off excellent antara akurasi dan efisiensi. Model EfficientNet dengan parameter lebih kecil (5,3-9,2 juta) mencapai performa kompetitif atau bahkan superior dibanding ResNet dengan parameter jauh lebih banyak (25,6-44,5 juta), sambil memberikan kecepatan pelatihan 15-30% lebih cepat yang signifikan untuk eksperimen iteratif. Gap antara akurasi dan balanced accuracy menjadi indikator diagnostik sangat penting [35] untuk mengevaluasi robustness model pada kelas minoritas, dimana pada MP-IDB Stages dengan ketidakseimbangan ekstrem (rasio 54:1), gap mencapai 18,08 poin persentase mengindikasikan model masih bias terhadap kelas mayoritas meskipun telah menggunakan Focal Loss [9] dan weighted sampling. Performa pada kelas individual menunjukkan variasi sangat besar dengan skor F1 berkisar dari 0,44 pada kasus terburuk untuk kelas ultra-minoritas dengan morfologi overlap dengan kelas lain hingga 1,00 perfect score pada kelas dengan morfologi sangat distinctive [31] seperti Schizont dengan segmentasi merozoit jelas atau Gametocyte dengan bentuk crescent khas, mengindikasikan distinctiveness morfologi merupakan faktor penentu utama kesulitan klasifikasi.</w:t>
+        <w:t xml:space="preserve">Analisis efisiensi komputasi menunjukkan model EfficientNet dengan arsitektur dioptimalkan via neural architecture search [7] memberikan trade-off excellent antara akurasi dan efisiensi. Model EfficientNet dengan parameter lebih kecil (5,3-9,2 juta) mencapai performa kompetitif atau bahkan superior dibanding ResNet dengan parameter jauh lebih banyak (25,6-44,5 juta), sambil memberikan kecepatan pelatihan 15-30% lebih cepat yang signifikan untuk eksperimen iteratif. Gap antara akurasi dan balanced accuracy menjadi indikator diagnostik sangat penting [35] untuk mengevaluasi robustness model pada kelas minoritas, dimana pada MP-IDB Stages dengan ketidakseimbangan ekstrem (rasio 54:1), gap mencapai 18,08 poin persentase mengindikasikan model masih bias terhadap kelas mayoritas meskipun telah menggunakan Focal Loss [9] dan weighted sampling. Performa pada kelas individual menunjukkan variasi sangat besar dengan skor F1 berkisar dari 0,44 pada kasus </w:t>
+      </w:r>
+      <w:r>
+        <w:rPr>
+          <w:rFonts w:ascii="Times New Roman" w:hAnsi="Times New Roman" w:cs="Times New Roman"/>
+          <w:noProof/>
+          <w:sz w:val="20"/>
+          <w:szCs w:val="20"/>
+          <w:lang w:val="id-ID"/>
+        </w:rPr>
+        <w:lastRenderedPageBreak/>
+        <w:t>terburuk untuk kelas ultra-minoritas dengan morfologi overlap dengan kelas lain hingga 1,00 perfect score pada kelas dengan morfologi sangat distinctive [31] seperti Schizont dengan segmentasi merozoit jelas atau Gametocyte dengan bentuk crescent khas, mengindikasikan distinctiveness morfologi merupakan faktor penentu utama kesulitan klasifikasi.</w:t>
       </w:r>
     </w:p>
     <w:p>
@@ -20594,7 +20881,6 @@
           <w:szCs w:val="20"/>
           <w:lang w:val="id-ID"/>
         </w:rPr>
-        <w:lastRenderedPageBreak/>
         <w:t>Pada MP-IDB Species (identifikasi spesies Plasmodium [2]), kelas P. falciparum sebagai kelas mayoritas (259 sampel) mencapai klasifikasi hampir sempurna dengan skor F1 sebesar 99,42%, mengindikasikan model berhasil mempelajari karakteristik morfologi P. falciparum dengan sangat baik. Yang mengejutkan, kelas P. ovale meskipun merupakan ultra-minority (hanya 7 sampel) mencapai skor F1 mengesankan sebesar 92,31% berkat morfologi sangat khas [26] dengan sel darah merah membesar (enlarged RBC) dan Schuffner's dots yang distinctive, dimana semua spesies langka (P. ovale, P. malariae, P. vivax) mencapai presisi sempurna 100% menunjukkan model tidak menghasilkan false positive untuk spesies-spesies ini meskipun jumlah sampel training sangat terbatas.</w:t>
       </w:r>
     </w:p>
@@ -20729,7 +21015,7 @@
                           <pic:cNvPicPr/>
                         </pic:nvPicPr>
                         <pic:blipFill>
-                          <a:blip r:embed="rId14" cstate="print">
+                          <a:blip r:embed="rId18" cstate="print">
                             <a:extLst>
                               <a:ext uri="{28A0092B-C50C-407E-A947-70E740481C1C}">
                                 <a14:useLocalDpi xmlns:a14="http://schemas.microsoft.com/office/drawing/2010/main" val="0"/>
@@ -20795,7 +21081,7 @@
                           <pic:cNvPicPr/>
                         </pic:nvPicPr>
                         <pic:blipFill>
-                          <a:blip r:embed="rId15" cstate="print">
+                          <a:blip r:embed="rId19" cstate="print">
                             <a:extLst>
                               <a:ext uri="{28A0092B-C50C-407E-A947-70E740481C1C}">
                                 <a14:useLocalDpi xmlns:a14="http://schemas.microsoft.com/office/drawing/2010/main" val="0"/>
@@ -20861,7 +21147,7 @@
                           <pic:cNvPicPr/>
                         </pic:nvPicPr>
                         <pic:blipFill>
-                          <a:blip r:embed="rId16" cstate="print">
+                          <a:blip r:embed="rId20" cstate="print">
                             <a:extLst>
                               <a:ext uri="{28A0092B-C50C-407E-A947-70E740481C1C}">
                                 <a14:useLocalDpi xmlns:a14="http://schemas.microsoft.com/office/drawing/2010/main" val="0"/>
@@ -20927,7 +21213,7 @@
                           <pic:cNvPicPr/>
                         </pic:nvPicPr>
                         <pic:blipFill>
-                          <a:blip r:embed="rId17" cstate="print">
+                          <a:blip r:embed="rId21" cstate="print">
                             <a:extLst>
                               <a:ext uri="{28A0092B-C50C-407E-A947-70E740481C1C}">
                                 <a14:useLocalDpi xmlns:a14="http://schemas.microsoft.com/office/drawing/2010/main" val="0"/>
@@ -21052,6 +21338,7 @@
                 <w:szCs w:val="20"/>
                 <w:lang w:val="id-ID"/>
               </w:rPr>
+              <w:lastRenderedPageBreak/>
               <w:drawing>
                 <wp:inline distT="0" distB="0" distL="0" distR="0" wp14:anchorId="3659C88B" wp14:editId="1720FE40">
                   <wp:extent cx="1440000" cy="1440000"/>
@@ -21068,7 +21355,7 @@
                           <pic:cNvPicPr/>
                         </pic:nvPicPr>
                         <pic:blipFill>
-                          <a:blip r:embed="rId18" cstate="print">
+                          <a:blip r:embed="rId22" cstate="print">
                             <a:extLst>
                               <a:ext uri="{28A0092B-C50C-407E-A947-70E740481C1C}">
                                 <a14:useLocalDpi xmlns:a14="http://schemas.microsoft.com/office/drawing/2010/main" val="0"/>
@@ -21134,7 +21421,7 @@
                           <pic:cNvPicPr/>
                         </pic:nvPicPr>
                         <pic:blipFill>
-                          <a:blip r:embed="rId19" cstate="print">
+                          <a:blip r:embed="rId23" cstate="print">
                             <a:extLst>
                               <a:ext uri="{28A0092B-C50C-407E-A947-70E740481C1C}">
                                 <a14:useLocalDpi xmlns:a14="http://schemas.microsoft.com/office/drawing/2010/main" val="0"/>
@@ -21200,7 +21487,7 @@
                           <pic:cNvPicPr/>
                         </pic:nvPicPr>
                         <pic:blipFill>
-                          <a:blip r:embed="rId20" cstate="print">
+                          <a:blip r:embed="rId24" cstate="print">
                             <a:extLst>
                               <a:ext uri="{28A0092B-C50C-407E-A947-70E740481C1C}">
                                 <a14:useLocalDpi xmlns:a14="http://schemas.microsoft.com/office/drawing/2010/main" val="0"/>
@@ -21266,7 +21553,7 @@
                           <pic:cNvPicPr/>
                         </pic:nvPicPr>
                         <pic:blipFill>
-                          <a:blip r:embed="rId21" cstate="print">
+                          <a:blip r:embed="rId25" cstate="print">
                             <a:extLst>
                               <a:ext uri="{28A0092B-C50C-407E-A947-70E740481C1C}">
                                 <a14:useLocalDpi xmlns:a14="http://schemas.microsoft.com/office/drawing/2010/main" val="0"/>
@@ -21354,7 +21641,6 @@
           <w:noProof/>
           <w:lang w:val="id-ID"/>
         </w:rPr>
-        <w:lastRenderedPageBreak/>
         <w:t>Efisiensi Arsitektur:</w:t>
       </w:r>
     </w:p>
@@ -21496,7 +21782,7 @@
                           <pic:cNvPicPr/>
                         </pic:nvPicPr>
                         <pic:blipFill>
-                          <a:blip r:embed="rId22" cstate="print">
+                          <a:blip r:embed="rId26" cstate="print">
                             <a:extLst>
                               <a:ext uri="{28A0092B-C50C-407E-A947-70E740481C1C}">
                                 <a14:useLocalDpi xmlns:a14="http://schemas.microsoft.com/office/drawing/2010/main" val="0"/>
@@ -21562,7 +21848,7 @@
                           <pic:cNvPicPr/>
                         </pic:nvPicPr>
                         <pic:blipFill>
-                          <a:blip r:embed="rId23" cstate="print">
+                          <a:blip r:embed="rId27" cstate="print">
                             <a:extLst>
                               <a:ext uri="{28A0092B-C50C-407E-A947-70E740481C1C}">
                                 <a14:useLocalDpi xmlns:a14="http://schemas.microsoft.com/office/drawing/2010/main" val="0"/>
@@ -21628,7 +21914,7 @@
                           <pic:cNvPicPr/>
                         </pic:nvPicPr>
                         <pic:blipFill>
-                          <a:blip r:embed="rId24" cstate="print">
+                          <a:blip r:embed="rId28" cstate="print">
                             <a:extLst>
                               <a:ext uri="{28A0092B-C50C-407E-A947-70E740481C1C}">
                                 <a14:useLocalDpi xmlns:a14="http://schemas.microsoft.com/office/drawing/2010/main" val="0"/>
@@ -21696,7 +21982,7 @@
                           <pic:cNvPicPr/>
                         </pic:nvPicPr>
                         <pic:blipFill>
-                          <a:blip r:embed="rId25" cstate="print">
+                          <a:blip r:embed="rId29" cstate="print">
                             <a:extLst>
                               <a:ext uri="{28A0092B-C50C-407E-A947-70E740481C1C}">
                                 <a14:useLocalDpi xmlns:a14="http://schemas.microsoft.com/office/drawing/2010/main" val="0"/>
@@ -21762,7 +22048,7 @@
                           <pic:cNvPicPr/>
                         </pic:nvPicPr>
                         <pic:blipFill>
-                          <a:blip r:embed="rId26" cstate="print">
+                          <a:blip r:embed="rId30" cstate="print">
                             <a:extLst>
                               <a:ext uri="{28A0092B-C50C-407E-A947-70E740481C1C}">
                                 <a14:useLocalDpi xmlns:a14="http://schemas.microsoft.com/office/drawing/2010/main" val="0"/>
@@ -21825,486 +22111,6 @@
                       <pic:pic xmlns:pic="http://schemas.openxmlformats.org/drawingml/2006/picture">
                         <pic:nvPicPr>
                           <pic:cNvPr id="25" name="Picture 25" descr="A close-up of a microscope&#10;&#10;AI-generated content may be incorrect."/>
-                          <pic:cNvPicPr/>
-                        </pic:nvPicPr>
-                        <pic:blipFill>
-                          <a:blip r:embed="rId27" cstate="print">
-                            <a:extLst>
-                              <a:ext uri="{28A0092B-C50C-407E-A947-70E740481C1C}">
-                                <a14:useLocalDpi xmlns:a14="http://schemas.microsoft.com/office/drawing/2010/main" val="0"/>
-                              </a:ext>
-                            </a:extLst>
-                          </a:blip>
-                          <a:stretch>
-                            <a:fillRect/>
-                          </a:stretch>
-                        </pic:blipFill>
-                        <pic:spPr>
-                          <a:xfrm>
-                            <a:off x="0" y="0"/>
-                            <a:ext cx="1920071" cy="1440000"/>
-                          </a:xfrm>
-                          <a:prstGeom prst="rect">
-                            <a:avLst/>
-                          </a:prstGeom>
-                        </pic:spPr>
-                      </pic:pic>
-                    </a:graphicData>
-                  </a:graphic>
-                </wp:inline>
-              </w:drawing>
-            </w:r>
-          </w:p>
-        </w:tc>
-      </w:tr>
-    </w:tbl>
-    <w:p>
-      <w:pPr>
-        <w:spacing w:before="240"/>
-        <w:jc w:val="center"/>
-        <w:rPr>
-          <w:rFonts w:ascii="Times New Roman" w:hAnsi="Times New Roman" w:cs="Times New Roman"/>
-          <w:noProof/>
-          <w:sz w:val="20"/>
-          <w:szCs w:val="20"/>
-          <w:lang w:val="id-ID"/>
-        </w:rPr>
-      </w:pPr>
-      <w:r>
-        <w:rPr>
-          <w:rFonts w:ascii="Times New Roman" w:hAnsi="Times New Roman" w:cs="Times New Roman"/>
-          <w:noProof/>
-          <w:sz w:val="20"/>
-          <w:szCs w:val="20"/>
-          <w:lang w:val="id-ID"/>
-        </w:rPr>
-        <w:t>Gambar 9: Kasus Kesalahan Deteksi Terseleksi</w:t>
-      </w:r>
-    </w:p>
-    <w:p>
-      <w:pPr>
-        <w:spacing w:before="240"/>
-        <w:rPr>
-          <w:rFonts w:ascii="Times New Roman" w:hAnsi="Times New Roman" w:cs="Times New Roman"/>
-          <w:noProof/>
-          <w:sz w:val="20"/>
-          <w:szCs w:val="20"/>
-          <w:lang w:val="id-ID"/>
-        </w:rPr>
-      </w:pPr>
-      <w:r>
-        <w:rPr>
-          <w:rFonts w:ascii="Times New Roman" w:hAnsi="Times New Roman" w:cs="Times New Roman"/>
-          <w:noProof/>
-          <w:sz w:val="20"/>
-          <w:szCs w:val="20"/>
-          <w:lang w:val="id-ID"/>
-        </w:rPr>
-        <w:t xml:space="preserve">Gambar menunjukkan enam pola kesalahan deteksi dari semua 4 dataset (IML Lifecycle, MD-2019 Stages, MP-IDB Species, MP-IDB Stages) yang mencerminkan spektrum tantangan deteksi: (1) </w:t>
-      </w:r>
-      <w:r>
-        <w:rPr>
-          <w:rFonts w:ascii="Times New Roman" w:hAnsi="Times New Roman" w:cs="Times New Roman"/>
-          <w:b/>
-          <w:bCs/>
-          <w:noProof/>
-          <w:sz w:val="20"/>
-          <w:szCs w:val="20"/>
-          <w:lang w:val="id-ID"/>
-        </w:rPr>
-        <w:t>IML Lifecycle - Positif palsu</w:t>
-      </w:r>
-      <w:r>
-        <w:rPr>
-          <w:rFonts w:ascii="Times New Roman" w:hAnsi="Times New Roman" w:cs="Times New Roman"/>
-          <w:noProof/>
-          <w:sz w:val="20"/>
-          <w:szCs w:val="20"/>
-          <w:lang w:val="id-ID"/>
-        </w:rPr>
-        <w:t xml:space="preserve"> (3 FP) model mendeteksi parasit palsu pada debris dan artefak pewarnaan, (2) </w:t>
-      </w:r>
-      <w:r>
-        <w:rPr>
-          <w:rFonts w:ascii="Times New Roman" w:hAnsi="Times New Roman" w:cs="Times New Roman"/>
-          <w:b/>
-          <w:bCs/>
-          <w:noProof/>
-          <w:sz w:val="20"/>
-          <w:szCs w:val="20"/>
-          <w:lang w:val="id-ID"/>
-        </w:rPr>
-        <w:t>MD-2019 - Positif palsu sederhana</w:t>
-      </w:r>
-      <w:r>
-        <w:rPr>
-          <w:rFonts w:ascii="Times New Roman" w:hAnsi="Times New Roman" w:cs="Times New Roman"/>
-          <w:noProof/>
-          <w:sz w:val="20"/>
-          <w:szCs w:val="20"/>
-          <w:lang w:val="id-ID"/>
-        </w:rPr>
-        <w:t xml:space="preserve"> (7 GT, 1 FP) model mendeteksi semua parasit namun menambahkan 1 positif palsu, (3) </w:t>
-      </w:r>
-      <w:r>
-        <w:rPr>
-          <w:rFonts w:ascii="Times New Roman" w:hAnsi="Times New Roman" w:cs="Times New Roman"/>
-          <w:b/>
-          <w:bCs/>
-          <w:noProof/>
-          <w:sz w:val="20"/>
-          <w:szCs w:val="20"/>
-          <w:lang w:val="id-ID"/>
-        </w:rPr>
-        <w:t>MD-2019 - Negatif palsu</w:t>
-      </w:r>
-      <w:r>
-        <w:rPr>
-          <w:rFonts w:ascii="Times New Roman" w:hAnsi="Times New Roman" w:cs="Times New Roman"/>
-          <w:noProof/>
-          <w:sz w:val="20"/>
-          <w:szCs w:val="20"/>
-          <w:lang w:val="id-ID"/>
-        </w:rPr>
-        <w:t xml:space="preserve"> (14 GT, 4 FN, 28.6% miss rate) model melewatkan 4 dari 14 parasit dengan morfologi atipikal atau kontras rendah [25], (4) </w:t>
-      </w:r>
-      <w:r>
-        <w:rPr>
-          <w:rFonts w:ascii="Times New Roman" w:hAnsi="Times New Roman" w:cs="Times New Roman"/>
-          <w:b/>
-          <w:bCs/>
-          <w:noProof/>
-          <w:sz w:val="20"/>
-          <w:szCs w:val="20"/>
-          <w:lang w:val="id-ID"/>
-        </w:rPr>
-        <w:t>MP-IDB Species - Kesalahan campuran</w:t>
-      </w:r>
-      <w:r>
-        <w:rPr>
-          <w:rFonts w:ascii="Times New Roman" w:hAnsi="Times New Roman" w:cs="Times New Roman"/>
-          <w:noProof/>
-          <w:sz w:val="20"/>
-          <w:szCs w:val="20"/>
-          <w:lang w:val="id-ID"/>
-        </w:rPr>
-        <w:t xml:space="preserve"> yang menunjukkan kesulitan simultan dalam mendeteksi parasit sejati dan menghindari alarm palsu, (5) </w:t>
-      </w:r>
-      <w:r>
-        <w:rPr>
-          <w:rFonts w:ascii="Times New Roman" w:hAnsi="Times New Roman" w:cs="Times New Roman"/>
-          <w:b/>
-          <w:bCs/>
-          <w:noProof/>
-          <w:sz w:val="20"/>
-          <w:szCs w:val="20"/>
-          <w:lang w:val="id-ID"/>
-        </w:rPr>
-        <w:t>MP-IDB Species - Positif palsu berat</w:t>
-      </w:r>
-      <w:r>
-        <w:rPr>
-          <w:rFonts w:ascii="Times New Roman" w:hAnsi="Times New Roman" w:cs="Times New Roman"/>
-          <w:noProof/>
-          <w:sz w:val="20"/>
-          <w:szCs w:val="20"/>
-          <w:lang w:val="id-ID"/>
-        </w:rPr>
-        <w:t xml:space="preserve"> (8 FP) dengan banyak deteksi berlebihan pada debris, (6) </w:t>
-      </w:r>
-      <w:r>
-        <w:rPr>
-          <w:rFonts w:ascii="Times New Roman" w:hAnsi="Times New Roman" w:cs="Times New Roman"/>
-          <w:b/>
-          <w:bCs/>
-          <w:noProof/>
-          <w:sz w:val="20"/>
-          <w:szCs w:val="20"/>
-          <w:lang w:val="id-ID"/>
-        </w:rPr>
-        <w:t>MP-IDB Stages - Bidang padat campuran</w:t>
-      </w:r>
-      <w:r>
-        <w:rPr>
-          <w:rFonts w:ascii="Times New Roman" w:hAnsi="Times New Roman" w:cs="Times New Roman"/>
-          <w:noProof/>
-          <w:sz w:val="20"/>
-          <w:szCs w:val="20"/>
-          <w:lang w:val="id-ID"/>
-        </w:rPr>
-        <w:t xml:space="preserve"> pada bidang dengan kepadatan tinggi dan overlap parasit, menunjukkan kesulitan deteksi pada kondisi padat [32]. Penyebab utama kesalahan konsisten across datasets adalah bidang padat, overlap parasit, morfologi atipikal, pewarnaan tidak merata, dan artefak yang menyerupai parasit</w:t>
-      </w:r>
-      <w:r>
-        <w:rPr>
-          <w:rFonts w:ascii="Times New Roman" w:hAnsi="Times New Roman" w:cs="Times New Roman"/>
-          <w:noProof/>
-          <w:sz w:val="20"/>
-          <w:szCs w:val="20"/>
-          <w:lang w:val="id-ID"/>
-        </w:rPr>
-        <w:t>.</w:t>
-      </w:r>
-    </w:p>
-    <w:tbl>
-      <w:tblPr>
-        <w:tblStyle w:val="TableGrid"/>
-        <w:tblW w:w="0" w:type="auto"/>
-        <w:tblBorders>
-          <w:top w:val="none" w:sz="0" w:space="0" w:color="auto"/>
-          <w:left w:val="none" w:sz="0" w:space="0" w:color="auto"/>
-          <w:bottom w:val="none" w:sz="0" w:space="0" w:color="auto"/>
-          <w:right w:val="none" w:sz="0" w:space="0" w:color="auto"/>
-          <w:insideH w:val="none" w:sz="0" w:space="0" w:color="auto"/>
-          <w:insideV w:val="none" w:sz="0" w:space="0" w:color="auto"/>
-        </w:tblBorders>
-        <w:tblCellMar>
-          <w:left w:w="57" w:type="dxa"/>
-          <w:right w:w="57" w:type="dxa"/>
-        </w:tblCellMar>
-        <w:tblLook w:val="04A0" w:firstRow="1" w:lastRow="0" w:firstColumn="1" w:lastColumn="0" w:noHBand="0" w:noVBand="1"/>
-      </w:tblPr>
-      <w:tblGrid>
-        <w:gridCol w:w="3009"/>
-        <w:gridCol w:w="3009"/>
-        <w:gridCol w:w="3009"/>
-      </w:tblGrid>
-      <w:tr>
-        <w:tc>
-          <w:tcPr>
-            <w:tcW w:w="3005" w:type="dxa"/>
-          </w:tcPr>
-          <w:p>
-            <w:pPr>
-              <w:rPr>
-                <w:rFonts w:ascii="Times New Roman" w:hAnsi="Times New Roman" w:cs="Times New Roman"/>
-                <w:noProof/>
-                <w:sz w:val="20"/>
-                <w:szCs w:val="20"/>
-                <w:lang w:val="id-ID"/>
-              </w:rPr>
-            </w:pPr>
-            <w:r>
-              <w:rPr>
-                <w:rFonts w:ascii="Times New Roman" w:hAnsi="Times New Roman" w:cs="Times New Roman"/>
-                <w:noProof/>
-                <w:sz w:val="20"/>
-                <w:szCs w:val="20"/>
-                <w:lang w:val="id-ID"/>
-              </w:rPr>
-              <w:lastRenderedPageBreak/>
-              <w:drawing>
-                <wp:inline distT="0" distB="0" distL="0" distR="0" wp14:anchorId="43A1D6B3" wp14:editId="1920F4F1">
-                  <wp:extent cx="1920000" cy="1440000"/>
-                  <wp:effectExtent l="0" t="0" r="4445" b="8255"/>
-                  <wp:docPr id="20" name="Picture 20"/>
-                  <wp:cNvGraphicFramePr>
-                    <a:graphicFrameLocks xmlns:a="http://schemas.openxmlformats.org/drawingml/2006/main" noChangeAspect="1"/>
-                  </wp:cNvGraphicFramePr>
-                  <a:graphic xmlns:a="http://schemas.openxmlformats.org/drawingml/2006/main">
-                    <a:graphicData uri="http://schemas.openxmlformats.org/drawingml/2006/picture">
-                      <pic:pic xmlns:pic="http://schemas.openxmlformats.org/drawingml/2006/picture">
-                        <pic:nvPicPr>
-                          <pic:cNvPr id="20" name="Picture 20"/>
-                          <pic:cNvPicPr/>
-                        </pic:nvPicPr>
-                        <pic:blipFill>
-                          <a:blip r:embed="rId28" cstate="print">
-                            <a:extLst>
-                              <a:ext uri="{28A0092B-C50C-407E-A947-70E740481C1C}">
-                                <a14:useLocalDpi xmlns:a14="http://schemas.microsoft.com/office/drawing/2010/main" val="0"/>
-                              </a:ext>
-                            </a:extLst>
-                          </a:blip>
-                          <a:stretch>
-                            <a:fillRect/>
-                          </a:stretch>
-                        </pic:blipFill>
-                        <pic:spPr>
-                          <a:xfrm>
-                            <a:off x="0" y="0"/>
-                            <a:ext cx="1920000" cy="1440000"/>
-                          </a:xfrm>
-                          <a:prstGeom prst="rect">
-                            <a:avLst/>
-                          </a:prstGeom>
-                        </pic:spPr>
-                      </pic:pic>
-                    </a:graphicData>
-                  </a:graphic>
-                </wp:inline>
-              </w:drawing>
-            </w:r>
-          </w:p>
-        </w:tc>
-        <w:tc>
-          <w:tcPr>
-            <w:tcW w:w="3006" w:type="dxa"/>
-          </w:tcPr>
-          <w:p>
-            <w:pPr>
-              <w:rPr>
-                <w:rFonts w:ascii="Times New Roman" w:hAnsi="Times New Roman" w:cs="Times New Roman"/>
-                <w:noProof/>
-                <w:sz w:val="20"/>
-                <w:szCs w:val="20"/>
-                <w:lang w:val="id-ID"/>
-              </w:rPr>
-            </w:pPr>
-            <w:r>
-              <w:rPr>
-                <w:rFonts w:ascii="Times New Roman" w:hAnsi="Times New Roman" w:cs="Times New Roman"/>
-                <w:noProof/>
-                <w:sz w:val="20"/>
-                <w:szCs w:val="20"/>
-                <w:lang w:val="id-ID"/>
-              </w:rPr>
-              <w:drawing>
-                <wp:inline distT="0" distB="0" distL="0" distR="0" wp14:anchorId="24C16DB4" wp14:editId="788ECB7A">
-                  <wp:extent cx="1920000" cy="1440000"/>
-                  <wp:effectExtent l="0" t="0" r="4445" b="8255"/>
-                  <wp:docPr id="21" name="Picture 21"/>
-                  <wp:cNvGraphicFramePr>
-                    <a:graphicFrameLocks xmlns:a="http://schemas.openxmlformats.org/drawingml/2006/main" noChangeAspect="1"/>
-                  </wp:cNvGraphicFramePr>
-                  <a:graphic xmlns:a="http://schemas.openxmlformats.org/drawingml/2006/main">
-                    <a:graphicData uri="http://schemas.openxmlformats.org/drawingml/2006/picture">
-                      <pic:pic xmlns:pic="http://schemas.openxmlformats.org/drawingml/2006/picture">
-                        <pic:nvPicPr>
-                          <pic:cNvPr id="21" name="Picture 21"/>
-                          <pic:cNvPicPr/>
-                        </pic:nvPicPr>
-                        <pic:blipFill>
-                          <a:blip r:embed="rId29" cstate="print">
-                            <a:extLst>
-                              <a:ext uri="{28A0092B-C50C-407E-A947-70E740481C1C}">
-                                <a14:useLocalDpi xmlns:a14="http://schemas.microsoft.com/office/drawing/2010/main" val="0"/>
-                              </a:ext>
-                            </a:extLst>
-                          </a:blip>
-                          <a:stretch>
-                            <a:fillRect/>
-                          </a:stretch>
-                        </pic:blipFill>
-                        <pic:spPr>
-                          <a:xfrm>
-                            <a:off x="0" y="0"/>
-                            <a:ext cx="1920000" cy="1440000"/>
-                          </a:xfrm>
-                          <a:prstGeom prst="rect">
-                            <a:avLst/>
-                          </a:prstGeom>
-                        </pic:spPr>
-                      </pic:pic>
-                    </a:graphicData>
-                  </a:graphic>
-                </wp:inline>
-              </w:drawing>
-            </w:r>
-          </w:p>
-        </w:tc>
-        <w:tc>
-          <w:tcPr>
-            <w:tcW w:w="3006" w:type="dxa"/>
-          </w:tcPr>
-          <w:p>
-            <w:pPr>
-              <w:rPr>
-                <w:rFonts w:ascii="Times New Roman" w:hAnsi="Times New Roman" w:cs="Times New Roman"/>
-                <w:noProof/>
-                <w:sz w:val="20"/>
-                <w:szCs w:val="20"/>
-                <w:lang w:val="id-ID"/>
-              </w:rPr>
-            </w:pPr>
-            <w:r>
-              <w:rPr>
-                <w:rFonts w:ascii="Times New Roman" w:hAnsi="Times New Roman" w:cs="Times New Roman"/>
-                <w:noProof/>
-                <w:sz w:val="20"/>
-                <w:szCs w:val="20"/>
-                <w:lang w:val="id-ID"/>
-              </w:rPr>
-              <w:drawing>
-                <wp:inline distT="0" distB="0" distL="0" distR="0" wp14:anchorId="47B9FB90" wp14:editId="20550433">
-                  <wp:extent cx="1920071" cy="1431022"/>
-                  <wp:effectExtent l="0" t="0" r="4445" b="0"/>
-                  <wp:docPr id="22" name="Picture 22"/>
-                  <wp:cNvGraphicFramePr>
-                    <a:graphicFrameLocks xmlns:a="http://schemas.openxmlformats.org/drawingml/2006/main" noChangeAspect="1"/>
-                  </wp:cNvGraphicFramePr>
-                  <a:graphic xmlns:a="http://schemas.openxmlformats.org/drawingml/2006/main">
-                    <a:graphicData uri="http://schemas.openxmlformats.org/drawingml/2006/picture">
-                      <pic:pic xmlns:pic="http://schemas.openxmlformats.org/drawingml/2006/picture">
-                        <pic:nvPicPr>
-                          <pic:cNvPr id="22" name="Picture 22"/>
-                          <pic:cNvPicPr/>
-                        </pic:nvPicPr>
-                        <pic:blipFill>
-                          <a:blip r:embed="rId30" cstate="print">
-                            <a:extLst>
-                              <a:ext uri="{28A0092B-C50C-407E-A947-70E740481C1C}">
-                                <a14:useLocalDpi xmlns:a14="http://schemas.microsoft.com/office/drawing/2010/main" val="0"/>
-                              </a:ext>
-                            </a:extLst>
-                          </a:blip>
-                          <a:stretch>
-                            <a:fillRect/>
-                          </a:stretch>
-                        </pic:blipFill>
-                        <pic:spPr>
-                          <a:xfrm>
-                            <a:off x="0" y="0"/>
-                            <a:ext cx="1920071" cy="1431022"/>
-                          </a:xfrm>
-                          <a:prstGeom prst="rect">
-                            <a:avLst/>
-                          </a:prstGeom>
-                        </pic:spPr>
-                      </pic:pic>
-                    </a:graphicData>
-                  </a:graphic>
-                </wp:inline>
-              </w:drawing>
-            </w:r>
-          </w:p>
-        </w:tc>
-      </w:tr>
-      <w:tr>
-        <w:tc>
-          <w:tcPr>
-            <w:tcW w:w="3005" w:type="dxa"/>
-          </w:tcPr>
-          <w:p>
-            <w:pPr>
-              <w:rPr>
-                <w:rFonts w:ascii="Times New Roman" w:hAnsi="Times New Roman" w:cs="Times New Roman"/>
-                <w:noProof/>
-                <w:sz w:val="20"/>
-                <w:szCs w:val="20"/>
-                <w:lang w:val="id-ID"/>
-              </w:rPr>
-            </w:pPr>
-            <w:r>
-              <w:rPr>
-                <w:rFonts w:ascii="Times New Roman" w:hAnsi="Times New Roman" w:cs="Times New Roman"/>
-                <w:noProof/>
-                <w:sz w:val="20"/>
-                <w:szCs w:val="20"/>
-                <w:lang w:val="id-ID"/>
-              </w:rPr>
-              <w:drawing>
-                <wp:inline distT="0" distB="0" distL="0" distR="0" wp14:anchorId="28E7DF79" wp14:editId="18521750">
-                  <wp:extent cx="1920071" cy="1440000"/>
-                  <wp:effectExtent l="0" t="0" r="4445" b="8255"/>
-                  <wp:docPr id="26" name="Picture 26" descr="A close-up of red and green cells&#10;&#10;AI-generated content may be incorrect."/>
-                  <wp:cNvGraphicFramePr>
-                    <a:graphicFrameLocks xmlns:a="http://schemas.openxmlformats.org/drawingml/2006/main" noChangeAspect="1"/>
-                  </wp:cNvGraphicFramePr>
-                  <a:graphic xmlns:a="http://schemas.openxmlformats.org/drawingml/2006/main">
-                    <a:graphicData uri="http://schemas.openxmlformats.org/drawingml/2006/picture">
-                      <pic:pic xmlns:pic="http://schemas.openxmlformats.org/drawingml/2006/picture">
-                        <pic:nvPicPr>
-                          <pic:cNvPr id="26" name="Picture 26" descr="A close-up of red and green cells&#10;&#10;AI-generated content may be incorrect."/>
                           <pic:cNvPicPr/>
                         </pic:nvPicPr>
                         <pic:blipFill>
@@ -22336,9 +22142,233 @@
             </w:r>
           </w:p>
         </w:tc>
-        <w:tc>
-          <w:tcPr>
-            <w:tcW w:w="3006" w:type="dxa"/>
+      </w:tr>
+    </w:tbl>
+    <w:p>
+      <w:pPr>
+        <w:spacing w:before="240"/>
+        <w:jc w:val="center"/>
+        <w:rPr>
+          <w:rFonts w:ascii="Times New Roman" w:hAnsi="Times New Roman" w:cs="Times New Roman"/>
+          <w:noProof/>
+          <w:sz w:val="20"/>
+          <w:szCs w:val="20"/>
+          <w:lang w:val="id-ID"/>
+        </w:rPr>
+      </w:pPr>
+      <w:r>
+        <w:rPr>
+          <w:rFonts w:ascii="Times New Roman" w:hAnsi="Times New Roman" w:cs="Times New Roman"/>
+          <w:noProof/>
+          <w:sz w:val="20"/>
+          <w:szCs w:val="20"/>
+          <w:lang w:val="id-ID"/>
+        </w:rPr>
+        <w:t>Gambar 9: Kasus Kesalahan Deteksi Terseleksi</w:t>
+      </w:r>
+    </w:p>
+    <w:p>
+      <w:pPr>
+        <w:spacing w:before="240"/>
+        <w:rPr>
+          <w:rFonts w:ascii="Times New Roman" w:hAnsi="Times New Roman" w:cs="Times New Roman"/>
+          <w:noProof/>
+          <w:sz w:val="20"/>
+          <w:szCs w:val="20"/>
+          <w:lang w:val="id-ID"/>
+        </w:rPr>
+      </w:pPr>
+      <w:r>
+        <w:rPr>
+          <w:rFonts w:ascii="Times New Roman" w:hAnsi="Times New Roman" w:cs="Times New Roman"/>
+          <w:noProof/>
+          <w:sz w:val="20"/>
+          <w:szCs w:val="20"/>
+          <w:lang w:val="id-ID"/>
+        </w:rPr>
+        <w:t xml:space="preserve">Gambar menunjukkan enam pola kesalahan deteksi dari semua 4 dataset (IML Lifecycle, MD-2019 Stages, MP-IDB Species, MP-IDB Stages) yang mencerminkan spektrum tantangan deteksi: (1) </w:t>
+      </w:r>
+      <w:r>
+        <w:rPr>
+          <w:rFonts w:ascii="Times New Roman" w:hAnsi="Times New Roman" w:cs="Times New Roman"/>
+          <w:b/>
+          <w:bCs/>
+          <w:noProof/>
+          <w:sz w:val="20"/>
+          <w:szCs w:val="20"/>
+          <w:lang w:val="id-ID"/>
+        </w:rPr>
+        <w:t>IML Lifecycle - Positif palsu</w:t>
+      </w:r>
+      <w:r>
+        <w:rPr>
+          <w:rFonts w:ascii="Times New Roman" w:hAnsi="Times New Roman" w:cs="Times New Roman"/>
+          <w:noProof/>
+          <w:sz w:val="20"/>
+          <w:szCs w:val="20"/>
+          <w:lang w:val="id-ID"/>
+        </w:rPr>
+        <w:t xml:space="preserve"> (3 FP) model mendeteksi parasit palsu pada debris dan artefak pewarnaan, (2) </w:t>
+      </w:r>
+      <w:r>
+        <w:rPr>
+          <w:rFonts w:ascii="Times New Roman" w:hAnsi="Times New Roman" w:cs="Times New Roman"/>
+          <w:b/>
+          <w:bCs/>
+          <w:noProof/>
+          <w:sz w:val="20"/>
+          <w:szCs w:val="20"/>
+          <w:lang w:val="id-ID"/>
+        </w:rPr>
+        <w:t>MD-2019 - Positif palsu sederhana</w:t>
+      </w:r>
+      <w:r>
+        <w:rPr>
+          <w:rFonts w:ascii="Times New Roman" w:hAnsi="Times New Roman" w:cs="Times New Roman"/>
+          <w:noProof/>
+          <w:sz w:val="20"/>
+          <w:szCs w:val="20"/>
+          <w:lang w:val="id-ID"/>
+        </w:rPr>
+        <w:t xml:space="preserve"> </w:t>
+      </w:r>
+      <w:r>
+        <w:rPr>
+          <w:rFonts w:ascii="Times New Roman" w:hAnsi="Times New Roman" w:cs="Times New Roman"/>
+          <w:noProof/>
+          <w:sz w:val="20"/>
+          <w:szCs w:val="20"/>
+          <w:lang w:val="id-ID"/>
+        </w:rPr>
+        <w:lastRenderedPageBreak/>
+        <w:t xml:space="preserve">(7 GT, 1 FP) model mendeteksi semua parasit namun menambahkan 1 positif palsu, (3) </w:t>
+      </w:r>
+      <w:r>
+        <w:rPr>
+          <w:rFonts w:ascii="Times New Roman" w:hAnsi="Times New Roman" w:cs="Times New Roman"/>
+          <w:b/>
+          <w:bCs/>
+          <w:noProof/>
+          <w:sz w:val="20"/>
+          <w:szCs w:val="20"/>
+          <w:lang w:val="id-ID"/>
+        </w:rPr>
+        <w:t>MD-2019 - Negatif palsu</w:t>
+      </w:r>
+      <w:r>
+        <w:rPr>
+          <w:rFonts w:ascii="Times New Roman" w:hAnsi="Times New Roman" w:cs="Times New Roman"/>
+          <w:noProof/>
+          <w:sz w:val="20"/>
+          <w:szCs w:val="20"/>
+          <w:lang w:val="id-ID"/>
+        </w:rPr>
+        <w:t xml:space="preserve"> (14 GT, 4 FN, 28.6% miss rate) model melewatkan 4 dari 14 parasit dengan morfologi atipikal atau kontras rendah [25], (4) </w:t>
+      </w:r>
+      <w:r>
+        <w:rPr>
+          <w:rFonts w:ascii="Times New Roman" w:hAnsi="Times New Roman" w:cs="Times New Roman"/>
+          <w:b/>
+          <w:bCs/>
+          <w:noProof/>
+          <w:sz w:val="20"/>
+          <w:szCs w:val="20"/>
+          <w:lang w:val="id-ID"/>
+        </w:rPr>
+        <w:t>MP-IDB Species - Kesalahan campuran</w:t>
+      </w:r>
+      <w:r>
+        <w:rPr>
+          <w:rFonts w:ascii="Times New Roman" w:hAnsi="Times New Roman" w:cs="Times New Roman"/>
+          <w:noProof/>
+          <w:sz w:val="20"/>
+          <w:szCs w:val="20"/>
+          <w:lang w:val="id-ID"/>
+        </w:rPr>
+        <w:t xml:space="preserve"> yang menunjukkan kesulitan simultan dalam mendeteksi parasit sejati dan menghindari alarm palsu, (5) </w:t>
+      </w:r>
+      <w:r>
+        <w:rPr>
+          <w:rFonts w:ascii="Times New Roman" w:hAnsi="Times New Roman" w:cs="Times New Roman"/>
+          <w:b/>
+          <w:bCs/>
+          <w:noProof/>
+          <w:sz w:val="20"/>
+          <w:szCs w:val="20"/>
+          <w:lang w:val="id-ID"/>
+        </w:rPr>
+        <w:t>MP-IDB Species - Positif palsu berat</w:t>
+      </w:r>
+      <w:r>
+        <w:rPr>
+          <w:rFonts w:ascii="Times New Roman" w:hAnsi="Times New Roman" w:cs="Times New Roman"/>
+          <w:noProof/>
+          <w:sz w:val="20"/>
+          <w:szCs w:val="20"/>
+          <w:lang w:val="id-ID"/>
+        </w:rPr>
+        <w:t xml:space="preserve"> (8 FP) dengan banyak deteksi berlebihan pada debris, (6) </w:t>
+      </w:r>
+      <w:r>
+        <w:rPr>
+          <w:rFonts w:ascii="Times New Roman" w:hAnsi="Times New Roman" w:cs="Times New Roman"/>
+          <w:b/>
+          <w:bCs/>
+          <w:noProof/>
+          <w:sz w:val="20"/>
+          <w:szCs w:val="20"/>
+          <w:lang w:val="id-ID"/>
+        </w:rPr>
+        <w:t>MP-IDB Stages - Bidang padat campuran</w:t>
+      </w:r>
+      <w:r>
+        <w:rPr>
+          <w:rFonts w:ascii="Times New Roman" w:hAnsi="Times New Roman" w:cs="Times New Roman"/>
+          <w:noProof/>
+          <w:sz w:val="20"/>
+          <w:szCs w:val="20"/>
+          <w:lang w:val="id-ID"/>
+        </w:rPr>
+        <w:t xml:space="preserve"> pada bidang dengan kepadatan tinggi dan overlap parasit, menunjukkan kesulitan deteksi pada kondisi padat [32]. Penyebab utama kesalahan konsisten across datasets adalah bidang padat, overlap parasit, morfologi atipikal, pewarnaan tidak merata, dan artefak yang menyerupai parasit</w:t>
+      </w:r>
+      <w:r>
+        <w:rPr>
+          <w:rFonts w:ascii="Times New Roman" w:hAnsi="Times New Roman" w:cs="Times New Roman"/>
+          <w:noProof/>
+          <w:sz w:val="20"/>
+          <w:szCs w:val="20"/>
+          <w:lang w:val="id-ID"/>
+        </w:rPr>
+        <w:t>.</w:t>
+      </w:r>
+    </w:p>
+    <w:tbl>
+      <w:tblPr>
+        <w:tblStyle w:val="TableGrid"/>
+        <w:tblW w:w="0" w:type="auto"/>
+        <w:tblBorders>
+          <w:top w:val="none" w:sz="0" w:space="0" w:color="auto"/>
+          <w:left w:val="none" w:sz="0" w:space="0" w:color="auto"/>
+          <w:bottom w:val="none" w:sz="0" w:space="0" w:color="auto"/>
+          <w:right w:val="none" w:sz="0" w:space="0" w:color="auto"/>
+          <w:insideH w:val="none" w:sz="0" w:space="0" w:color="auto"/>
+          <w:insideV w:val="none" w:sz="0" w:space="0" w:color="auto"/>
+        </w:tblBorders>
+        <w:tblCellMar>
+          <w:left w:w="57" w:type="dxa"/>
+          <w:right w:w="57" w:type="dxa"/>
+        </w:tblCellMar>
+        <w:tblLook w:val="04A0" w:firstRow="1" w:lastRow="0" w:firstColumn="1" w:lastColumn="0" w:noHBand="0" w:noVBand="1"/>
+      </w:tblPr>
+      <w:tblGrid>
+        <w:gridCol w:w="3009"/>
+        <w:gridCol w:w="3009"/>
+        <w:gridCol w:w="3009"/>
+      </w:tblGrid>
+      <w:tr>
+        <w:tc>
+          <w:tcPr>
+            <w:tcW w:w="3005" w:type="dxa"/>
           </w:tcPr>
           <w:p>
             <w:pPr>
@@ -22359,10 +22389,10 @@
                 <w:lang w:val="id-ID"/>
               </w:rPr>
               <w:drawing>
-                <wp:inline distT="0" distB="0" distL="0" distR="0" wp14:anchorId="31BA0F3A" wp14:editId="776FD52D">
-                  <wp:extent cx="1920071" cy="1440000"/>
+                <wp:inline distT="0" distB="0" distL="0" distR="0" wp14:anchorId="43A1D6B3" wp14:editId="1920F4F1">
+                  <wp:extent cx="1920000" cy="1440000"/>
                   <wp:effectExtent l="0" t="0" r="4445" b="8255"/>
-                  <wp:docPr id="27" name="Picture 27" descr="A close-up of red blood cells&#10;&#10;AI-generated content may be incorrect."/>
+                  <wp:docPr id="20" name="Picture 20"/>
                   <wp:cNvGraphicFramePr>
                     <a:graphicFrameLocks xmlns:a="http://schemas.openxmlformats.org/drawingml/2006/main" noChangeAspect="1"/>
                   </wp:cNvGraphicFramePr>
@@ -22370,11 +22400,211 @@
                     <a:graphicData uri="http://schemas.openxmlformats.org/drawingml/2006/picture">
                       <pic:pic xmlns:pic="http://schemas.openxmlformats.org/drawingml/2006/picture">
                         <pic:nvPicPr>
-                          <pic:cNvPr id="27" name="Picture 27" descr="A close-up of red blood cells&#10;&#10;AI-generated content may be incorrect."/>
+                          <pic:cNvPr id="20" name="Picture 20"/>
                           <pic:cNvPicPr/>
                         </pic:nvPicPr>
                         <pic:blipFill>
                           <a:blip r:embed="rId32" cstate="print">
+                            <a:extLst>
+                              <a:ext uri="{28A0092B-C50C-407E-A947-70E740481C1C}">
+                                <a14:useLocalDpi xmlns:a14="http://schemas.microsoft.com/office/drawing/2010/main" val="0"/>
+                              </a:ext>
+                            </a:extLst>
+                          </a:blip>
+                          <a:stretch>
+                            <a:fillRect/>
+                          </a:stretch>
+                        </pic:blipFill>
+                        <pic:spPr>
+                          <a:xfrm>
+                            <a:off x="0" y="0"/>
+                            <a:ext cx="1920000" cy="1440000"/>
+                          </a:xfrm>
+                          <a:prstGeom prst="rect">
+                            <a:avLst/>
+                          </a:prstGeom>
+                        </pic:spPr>
+                      </pic:pic>
+                    </a:graphicData>
+                  </a:graphic>
+                </wp:inline>
+              </w:drawing>
+            </w:r>
+          </w:p>
+        </w:tc>
+        <w:tc>
+          <w:tcPr>
+            <w:tcW w:w="3006" w:type="dxa"/>
+          </w:tcPr>
+          <w:p>
+            <w:pPr>
+              <w:rPr>
+                <w:rFonts w:ascii="Times New Roman" w:hAnsi="Times New Roman" w:cs="Times New Roman"/>
+                <w:noProof/>
+                <w:sz w:val="20"/>
+                <w:szCs w:val="20"/>
+                <w:lang w:val="id-ID"/>
+              </w:rPr>
+            </w:pPr>
+            <w:r>
+              <w:rPr>
+                <w:rFonts w:ascii="Times New Roman" w:hAnsi="Times New Roman" w:cs="Times New Roman"/>
+                <w:noProof/>
+                <w:sz w:val="20"/>
+                <w:szCs w:val="20"/>
+                <w:lang w:val="id-ID"/>
+              </w:rPr>
+              <w:drawing>
+                <wp:inline distT="0" distB="0" distL="0" distR="0" wp14:anchorId="24C16DB4" wp14:editId="788ECB7A">
+                  <wp:extent cx="1920000" cy="1440000"/>
+                  <wp:effectExtent l="0" t="0" r="4445" b="8255"/>
+                  <wp:docPr id="21" name="Picture 21"/>
+                  <wp:cNvGraphicFramePr>
+                    <a:graphicFrameLocks xmlns:a="http://schemas.openxmlformats.org/drawingml/2006/main" noChangeAspect="1"/>
+                  </wp:cNvGraphicFramePr>
+                  <a:graphic xmlns:a="http://schemas.openxmlformats.org/drawingml/2006/main">
+                    <a:graphicData uri="http://schemas.openxmlformats.org/drawingml/2006/picture">
+                      <pic:pic xmlns:pic="http://schemas.openxmlformats.org/drawingml/2006/picture">
+                        <pic:nvPicPr>
+                          <pic:cNvPr id="21" name="Picture 21"/>
+                          <pic:cNvPicPr/>
+                        </pic:nvPicPr>
+                        <pic:blipFill>
+                          <a:blip r:embed="rId33" cstate="print">
+                            <a:extLst>
+                              <a:ext uri="{28A0092B-C50C-407E-A947-70E740481C1C}">
+                                <a14:useLocalDpi xmlns:a14="http://schemas.microsoft.com/office/drawing/2010/main" val="0"/>
+                              </a:ext>
+                            </a:extLst>
+                          </a:blip>
+                          <a:stretch>
+                            <a:fillRect/>
+                          </a:stretch>
+                        </pic:blipFill>
+                        <pic:spPr>
+                          <a:xfrm>
+                            <a:off x="0" y="0"/>
+                            <a:ext cx="1920000" cy="1440000"/>
+                          </a:xfrm>
+                          <a:prstGeom prst="rect">
+                            <a:avLst/>
+                          </a:prstGeom>
+                        </pic:spPr>
+                      </pic:pic>
+                    </a:graphicData>
+                  </a:graphic>
+                </wp:inline>
+              </w:drawing>
+            </w:r>
+          </w:p>
+        </w:tc>
+        <w:tc>
+          <w:tcPr>
+            <w:tcW w:w="3006" w:type="dxa"/>
+          </w:tcPr>
+          <w:p>
+            <w:pPr>
+              <w:rPr>
+                <w:rFonts w:ascii="Times New Roman" w:hAnsi="Times New Roman" w:cs="Times New Roman"/>
+                <w:noProof/>
+                <w:sz w:val="20"/>
+                <w:szCs w:val="20"/>
+                <w:lang w:val="id-ID"/>
+              </w:rPr>
+            </w:pPr>
+            <w:r>
+              <w:rPr>
+                <w:rFonts w:ascii="Times New Roman" w:hAnsi="Times New Roman" w:cs="Times New Roman"/>
+                <w:noProof/>
+                <w:sz w:val="20"/>
+                <w:szCs w:val="20"/>
+                <w:lang w:val="id-ID"/>
+              </w:rPr>
+              <w:drawing>
+                <wp:inline distT="0" distB="0" distL="0" distR="0" wp14:anchorId="47B9FB90" wp14:editId="20550433">
+                  <wp:extent cx="1920071" cy="1431022"/>
+                  <wp:effectExtent l="0" t="0" r="4445" b="0"/>
+                  <wp:docPr id="22" name="Picture 22"/>
+                  <wp:cNvGraphicFramePr>
+                    <a:graphicFrameLocks xmlns:a="http://schemas.openxmlformats.org/drawingml/2006/main" noChangeAspect="1"/>
+                  </wp:cNvGraphicFramePr>
+                  <a:graphic xmlns:a="http://schemas.openxmlformats.org/drawingml/2006/main">
+                    <a:graphicData uri="http://schemas.openxmlformats.org/drawingml/2006/picture">
+                      <pic:pic xmlns:pic="http://schemas.openxmlformats.org/drawingml/2006/picture">
+                        <pic:nvPicPr>
+                          <pic:cNvPr id="22" name="Picture 22"/>
+                          <pic:cNvPicPr/>
+                        </pic:nvPicPr>
+                        <pic:blipFill>
+                          <a:blip r:embed="rId34" cstate="print">
+                            <a:extLst>
+                              <a:ext uri="{28A0092B-C50C-407E-A947-70E740481C1C}">
+                                <a14:useLocalDpi xmlns:a14="http://schemas.microsoft.com/office/drawing/2010/main" val="0"/>
+                              </a:ext>
+                            </a:extLst>
+                          </a:blip>
+                          <a:stretch>
+                            <a:fillRect/>
+                          </a:stretch>
+                        </pic:blipFill>
+                        <pic:spPr>
+                          <a:xfrm>
+                            <a:off x="0" y="0"/>
+                            <a:ext cx="1920071" cy="1431022"/>
+                          </a:xfrm>
+                          <a:prstGeom prst="rect">
+                            <a:avLst/>
+                          </a:prstGeom>
+                        </pic:spPr>
+                      </pic:pic>
+                    </a:graphicData>
+                  </a:graphic>
+                </wp:inline>
+              </w:drawing>
+            </w:r>
+          </w:p>
+        </w:tc>
+      </w:tr>
+      <w:tr>
+        <w:tc>
+          <w:tcPr>
+            <w:tcW w:w="3005" w:type="dxa"/>
+          </w:tcPr>
+          <w:p>
+            <w:pPr>
+              <w:rPr>
+                <w:rFonts w:ascii="Times New Roman" w:hAnsi="Times New Roman" w:cs="Times New Roman"/>
+                <w:noProof/>
+                <w:sz w:val="20"/>
+                <w:szCs w:val="20"/>
+                <w:lang w:val="id-ID"/>
+              </w:rPr>
+            </w:pPr>
+            <w:r>
+              <w:rPr>
+                <w:rFonts w:ascii="Times New Roman" w:hAnsi="Times New Roman" w:cs="Times New Roman"/>
+                <w:noProof/>
+                <w:sz w:val="20"/>
+                <w:szCs w:val="20"/>
+                <w:lang w:val="id-ID"/>
+              </w:rPr>
+              <w:drawing>
+                <wp:inline distT="0" distB="0" distL="0" distR="0" wp14:anchorId="28E7DF79" wp14:editId="18521750">
+                  <wp:extent cx="1920071" cy="1440000"/>
+                  <wp:effectExtent l="0" t="0" r="4445" b="8255"/>
+                  <wp:docPr id="26" name="Picture 26" descr="A close-up of red and green cells&#10;&#10;AI-generated content may be incorrect."/>
+                  <wp:cNvGraphicFramePr>
+                    <a:graphicFrameLocks xmlns:a="http://schemas.openxmlformats.org/drawingml/2006/main" noChangeAspect="1"/>
+                  </wp:cNvGraphicFramePr>
+                  <a:graphic xmlns:a="http://schemas.openxmlformats.org/drawingml/2006/main">
+                    <a:graphicData uri="http://schemas.openxmlformats.org/drawingml/2006/picture">
+                      <pic:pic xmlns:pic="http://schemas.openxmlformats.org/drawingml/2006/picture">
+                        <pic:nvPicPr>
+                          <pic:cNvPr id="26" name="Picture 26" descr="A close-up of red and green cells&#10;&#10;AI-generated content may be incorrect."/>
+                          <pic:cNvPicPr/>
+                        </pic:nvPicPr>
+                        <pic:blipFill>
+                          <a:blip r:embed="rId35" cstate="print">
                             <a:extLst>
                               <a:ext uri="{28A0092B-C50C-407E-A947-70E740481C1C}">
                                 <a14:useLocalDpi xmlns:a14="http://schemas.microsoft.com/office/drawing/2010/main" val="0"/>
@@ -22425,10 +22655,10 @@
                 <w:lang w:val="id-ID"/>
               </w:rPr>
               <w:drawing>
-                <wp:inline distT="0" distB="0" distL="0" distR="0" wp14:anchorId="653F5144" wp14:editId="5701B454">
+                <wp:inline distT="0" distB="0" distL="0" distR="0" wp14:anchorId="31BA0F3A" wp14:editId="776FD52D">
                   <wp:extent cx="1920071" cy="1440000"/>
                   <wp:effectExtent l="0" t="0" r="4445" b="8255"/>
-                  <wp:docPr id="28" name="Picture 28" descr="A close-up of a blood cell&#10;&#10;AI-generated content may be incorrect."/>
+                  <wp:docPr id="27" name="Picture 27" descr="A close-up of red blood cells&#10;&#10;AI-generated content may be incorrect."/>
                   <wp:cNvGraphicFramePr>
                     <a:graphicFrameLocks xmlns:a="http://schemas.openxmlformats.org/drawingml/2006/main" noChangeAspect="1"/>
                   </wp:cNvGraphicFramePr>
@@ -22436,11 +22666,11 @@
                     <a:graphicData uri="http://schemas.openxmlformats.org/drawingml/2006/picture">
                       <pic:pic xmlns:pic="http://schemas.openxmlformats.org/drawingml/2006/picture">
                         <pic:nvPicPr>
-                          <pic:cNvPr id="28" name="Picture 28" descr="A close-up of a blood cell&#10;&#10;AI-generated content may be incorrect."/>
+                          <pic:cNvPr id="27" name="Picture 27" descr="A close-up of red blood cells&#10;&#10;AI-generated content may be incorrect."/>
                           <pic:cNvPicPr/>
                         </pic:nvPicPr>
                         <pic:blipFill>
-                          <a:blip r:embed="rId33" cstate="print">
+                          <a:blip r:embed="rId36" cstate="print">
                             <a:extLst>
                               <a:ext uri="{28A0092B-C50C-407E-A947-70E740481C1C}">
                                 <a14:useLocalDpi xmlns:a14="http://schemas.microsoft.com/office/drawing/2010/main" val="0"/>
@@ -22468,6 +22698,72 @@
             </w:r>
           </w:p>
         </w:tc>
+        <w:tc>
+          <w:tcPr>
+            <w:tcW w:w="3006" w:type="dxa"/>
+          </w:tcPr>
+          <w:p>
+            <w:pPr>
+              <w:rPr>
+                <w:rFonts w:ascii="Times New Roman" w:hAnsi="Times New Roman" w:cs="Times New Roman"/>
+                <w:noProof/>
+                <w:sz w:val="20"/>
+                <w:szCs w:val="20"/>
+                <w:lang w:val="id-ID"/>
+              </w:rPr>
+            </w:pPr>
+            <w:r>
+              <w:rPr>
+                <w:rFonts w:ascii="Times New Roman" w:hAnsi="Times New Roman" w:cs="Times New Roman"/>
+                <w:noProof/>
+                <w:sz w:val="20"/>
+                <w:szCs w:val="20"/>
+                <w:lang w:val="id-ID"/>
+              </w:rPr>
+              <w:drawing>
+                <wp:inline distT="0" distB="0" distL="0" distR="0" wp14:anchorId="653F5144" wp14:editId="5701B454">
+                  <wp:extent cx="1920071" cy="1440000"/>
+                  <wp:effectExtent l="0" t="0" r="4445" b="8255"/>
+                  <wp:docPr id="28" name="Picture 28" descr="A close-up of a blood cell&#10;&#10;AI-generated content may be incorrect."/>
+                  <wp:cNvGraphicFramePr>
+                    <a:graphicFrameLocks xmlns:a="http://schemas.openxmlformats.org/drawingml/2006/main" noChangeAspect="1"/>
+                  </wp:cNvGraphicFramePr>
+                  <a:graphic xmlns:a="http://schemas.openxmlformats.org/drawingml/2006/main">
+                    <a:graphicData uri="http://schemas.openxmlformats.org/drawingml/2006/picture">
+                      <pic:pic xmlns:pic="http://schemas.openxmlformats.org/drawingml/2006/picture">
+                        <pic:nvPicPr>
+                          <pic:cNvPr id="28" name="Picture 28" descr="A close-up of a blood cell&#10;&#10;AI-generated content may be incorrect."/>
+                          <pic:cNvPicPr/>
+                        </pic:nvPicPr>
+                        <pic:blipFill>
+                          <a:blip r:embed="rId37" cstate="print">
+                            <a:extLst>
+                              <a:ext uri="{28A0092B-C50C-407E-A947-70E740481C1C}">
+                                <a14:useLocalDpi xmlns:a14="http://schemas.microsoft.com/office/drawing/2010/main" val="0"/>
+                              </a:ext>
+                            </a:extLst>
+                          </a:blip>
+                          <a:stretch>
+                            <a:fillRect/>
+                          </a:stretch>
+                        </pic:blipFill>
+                        <pic:spPr>
+                          <a:xfrm>
+                            <a:off x="0" y="0"/>
+                            <a:ext cx="1920071" cy="1440000"/>
+                          </a:xfrm>
+                          <a:prstGeom prst="rect">
+                            <a:avLst/>
+                          </a:prstGeom>
+                        </pic:spPr>
+                      </pic:pic>
+                    </a:graphicData>
+                  </a:graphic>
+                </wp:inline>
+              </w:drawing>
+            </w:r>
+          </w:p>
+        </w:tc>
       </w:tr>
     </w:tbl>
     <w:p>
@@ -22714,7 +23010,18 @@
           <w:szCs w:val="20"/>
           <w:lang w:val="id-ID"/>
         </w:rPr>
-        <w:t>Pada MP-IDB Stages dengan ketidakseimbangan kelas ekstrem, kebingungan utama adalah klasifikasi Trophozoite sebagai Ring yang mencakup 36% dari sampel trophozoite, disebabkan bukan hanya oleh morfologi overlap tetapi juga oleh bias model terhadap kelas Ring yang overwhelming dominan (259 sampel berbanding Trophozoite 14 sampel), dimana dampak klinis tetap rendah karena keduanya adalah tahap aseksual yang merespons terhadap terapi sama. Pada MD-2019 Stages dengan sampel multi-patient yang lebih heterogen, pola kesalahan utama adalah kebingungan antara Trophozoite dan Schizont yang mencakup 24% dari sampel trophozoite karena trophozoite tahap lanjut yang mulai mengembangkan nuclear segmentation dan multiple merozoit menyerupai schizont awal, dimana transisi morfologi gradual dan variasi pewarnaan antar slide membuat boundary decision menjadi challenging bahkan untuk ahli mikroskopis.</w:t>
+        <w:t xml:space="preserve">Pada MP-IDB Stages dengan ketidakseimbangan kelas ekstrem, kebingungan utama adalah klasifikasi Trophozoite sebagai Ring yang mencakup 36% dari sampel trophozoite, disebabkan bukan hanya oleh morfologi </w:t>
+      </w:r>
+      <w:r>
+        <w:rPr>
+          <w:rFonts w:ascii="Times New Roman" w:hAnsi="Times New Roman" w:cs="Times New Roman"/>
+          <w:noProof/>
+          <w:sz w:val="20"/>
+          <w:szCs w:val="20"/>
+          <w:lang w:val="id-ID"/>
+        </w:rPr>
+        <w:lastRenderedPageBreak/>
+        <w:t>overlap tetapi juga oleh bias model terhadap kelas Ring yang overwhelming dominan (259 sampel berbanding Trophozoite 14 sampel), dimana dampak klinis tetap rendah karena keduanya adalah tahap aseksual yang merespons terhadap terapi sama. Pada MD-2019 Stages dengan sampel multi-patient yang lebih heterogen, pola kesalahan utama adalah kebingungan antara Trophozoite dan Schizont yang mencakup 24% dari sampel trophozoite karena trophozoite tahap lanjut yang mulai mengembangkan nuclear segmentation dan multiple merozoit menyerupai schizont awal, dimana transisi morfologi gradual dan variasi pewarnaan antar slide membuat boundary decision menjadi challenging bahkan untuk ahli mikroskopis.</w:t>
       </w:r>
     </w:p>
     <w:p>
@@ -22730,7 +23037,6 @@
           <w:noProof/>
           <w:lang w:val="id-ID"/>
         </w:rPr>
-        <w:lastRenderedPageBreak/>
         <w:t>Analisis Kesalahan Berdasarkan Ukuran Kelas:</w:t>
       </w:r>
     </w:p>
@@ -23149,7 +23455,7 @@
                 <w:szCs w:val="20"/>
                 <w:lang w:val="id-ID"/>
               </w:rPr>
-              <w:t xml:space="preserve"> berupa publikasi, perolehan kekayaan intelektual, hasil pengujian atau luaran lainnya</w:t>
+              <w:t xml:space="preserve"> berupa publikasi, perolehan kekayaan intelektual, </w:t>
             </w:r>
             <w:r>
               <w:rPr>
@@ -23159,7 +23465,8 @@
                 <w:szCs w:val="20"/>
                 <w:lang w:val="id-ID"/>
               </w:rPr>
-              <w:t xml:space="preserve"> yang telah </w:t>
+              <w:lastRenderedPageBreak/>
+              <w:t>hasil pengujian atau luaran lainnya</w:t>
             </w:r>
             <w:r>
               <w:rPr>
@@ -23169,7 +23476,7 @@
                 <w:szCs w:val="20"/>
                 <w:lang w:val="id-ID"/>
               </w:rPr>
-              <w:t>dijanjikan pada proposal</w:t>
+              <w:t xml:space="preserve"> yang telah </w:t>
             </w:r>
             <w:r>
               <w:rPr>
@@ -23179,7 +23486,7 @@
                 <w:szCs w:val="20"/>
                 <w:lang w:val="id-ID"/>
               </w:rPr>
-              <w:t>. Uraian status luaran harus didukung dengan bukti kemajuan ketercapaian luaran sesuai</w:t>
+              <w:t>dijanjikan pada proposal</w:t>
             </w:r>
             <w:r>
               <w:rPr>
@@ -23189,7 +23496,7 @@
                 <w:szCs w:val="20"/>
                 <w:lang w:val="id-ID"/>
               </w:rPr>
-              <w:t xml:space="preserve"> dengan luaran yang dijanjikan. </w:t>
+              <w:t>. Uraian status luaran harus didukung dengan bukti kemajuan ketercapaian luaran sesuai</w:t>
             </w:r>
             <w:r>
               <w:rPr>
@@ -23199,7 +23506,7 @@
                 <w:szCs w:val="20"/>
                 <w:lang w:val="id-ID"/>
               </w:rPr>
-              <w:t xml:space="preserve">Lengkapi </w:t>
+              <w:t xml:space="preserve"> dengan luaran yang dijanjikan. </w:t>
             </w:r>
             <w:r>
               <w:rPr>
@@ -23209,7 +23516,7 @@
                 <w:szCs w:val="20"/>
                 <w:lang w:val="id-ID"/>
               </w:rPr>
-              <w:t>isian jenis luaran yang dijanjikan</w:t>
+              <w:t xml:space="preserve">Lengkapi </w:t>
             </w:r>
             <w:r>
               <w:rPr>
@@ -23219,7 +23526,7 @@
                 <w:szCs w:val="20"/>
                 <w:lang w:val="id-ID"/>
               </w:rPr>
-              <w:t xml:space="preserve"> serta mengunggah b</w:t>
+              <w:t>isian jenis luaran yang dijanjikan</w:t>
             </w:r>
             <w:r>
               <w:rPr>
@@ -23229,7 +23536,7 @@
                 <w:szCs w:val="20"/>
                 <w:lang w:val="id-ID"/>
               </w:rPr>
-              <w:t>ukti dokumen ketercapaian luaran wajib</w:t>
+              <w:t xml:space="preserve"> serta mengunggah b</w:t>
             </w:r>
             <w:r>
               <w:rPr>
@@ -23239,7 +23546,7 @@
                 <w:szCs w:val="20"/>
                 <w:lang w:val="id-ID"/>
               </w:rPr>
-              <w:t xml:space="preserve"> dan luaran tambahan melalui </w:t>
+              <w:t>ukti dokumen ketercapaian luaran wajib</w:t>
             </w:r>
             <w:r>
               <w:rPr>
@@ -23249,7 +23556,7 @@
                 <w:szCs w:val="20"/>
                 <w:lang w:val="id-ID"/>
               </w:rPr>
-              <w:t>BIMA</w:t>
+              <w:t xml:space="preserve"> dan luaran tambahan melalui </w:t>
             </w:r>
             <w:r>
               <w:rPr>
@@ -23259,6 +23566,16 @@
                 <w:szCs w:val="20"/>
                 <w:lang w:val="id-ID"/>
               </w:rPr>
+              <w:t>BIMA</w:t>
+            </w:r>
+            <w:r>
+              <w:rPr>
+                <w:rFonts w:ascii="Times New Roman" w:hAnsi="Times New Roman" w:cs="Times New Roman"/>
+                <w:noProof/>
+                <w:sz w:val="20"/>
+                <w:szCs w:val="20"/>
+                <w:lang w:val="id-ID"/>
+              </w:rPr>
               <w:t>.</w:t>
             </w:r>
           </w:p>
@@ -23285,6 +23602,7 @@
           <w:szCs w:val="20"/>
           <w:lang w:val="id-ID"/>
         </w:rPr>
+        <w:lastRenderedPageBreak/>
         <w:t>Penelitian telah menghasilkan beberapa luaran wajib dan tambahan sesuai yang dijanjikan dalam proposal.</w:t>
       </w:r>
     </w:p>
@@ -23301,7 +23619,6 @@
           <w:noProof/>
           <w:lang w:val="id-ID"/>
         </w:rPr>
-        <w:lastRenderedPageBreak/>
         <w:t>D.1 Luaran Wajib</w:t>
       </w:r>
     </w:p>
@@ -23882,6 +24199,7 @@
                 <w:szCs w:val="16"/>
                 <w:lang w:val="en-ID" w:eastAsia="en-ID"/>
               </w:rPr>
+              <w:lastRenderedPageBreak/>
               <w:t>IML Lifecycle</w:t>
             </w:r>
           </w:p>
@@ -25100,7 +25418,6 @@
           <w:szCs w:val="20"/>
           <w:lang w:val="id-ID"/>
         </w:rPr>
-        <w:lastRenderedPageBreak/>
         <w:t>Penelitian memberikan kontribusi signifikan dalam pemrosesan dan standardisasi dataset publik untuk riset pembelajaran mendalam. Dataset IML Lifecycle diproses dengan konversi format anotasi ke YOLO format dan standardisasi untuk 313 gambar dengan 4 kelas tahapan siklus hidup. Dataset MP-IDB ditingkatkan dengan analisis distribusi kelas komprehensif, identifikasi dan penanganan kelas minoritas ekstrem, dan dokumentasi karakteristik morfologi per kelas. Dataset MD-2019 diproses dengan standardisasi 813 gambar, harmonisasi format anotasi konsisten, dan validasi quality control untuk memastikan integritas data. Kontribusi utama adalah generasi citra terpotong (cropped images) berkualitas tinggi berukuran standar 224x224 piksel yang diekstraksi langsung dari bounding box ground truth, menghasilkan total 6.266 citra untuk pelatihan klasifikasi dengan rincian 529 citra (IML Lifecycle), 1.436 citra (MP-IDB Species), 1.436 citra (MP-IDB Stages), dan 2.865 citra (MD-2019 Stages), yang disimpan dengan kualitas kompresi optimal untuk menjaga detail morfologi parasit.</w:t>
       </w:r>
       <w:permEnd w:id="1041252904"/>
@@ -25562,7 +25879,18 @@
           <w:szCs w:val="20"/>
           <w:lang w:val="id-ID"/>
         </w:rPr>
-        <w:t>Validasi klinis dengan sampel lapangan merupakan tahapan penting yang direncanakan untuk penelitian lanjutan dengan skema pendanaan berbeda dari penelitian saat ini. Penelitian fase pertama difokuskan pada pengembangan dan validasi bukti konsep teknis menggunakan dataset publik standar yang telah tervalidasi, memungkinkan iterasi metodologi cepat tanpa hambatan administratif data klinis. Kolaborasi dengan mitra klinis seperti rumah sakit rujukan atau laboratorium diagnostik diperlukan untuk fase validasi eksternal di masa depan, yang memerlukan persiapan protokol penelitian komprehensif sesuai standar Good Clinical Practice (GCP), persetujuan komite etik penelitian kesehatan dengan proses administratif 3-6 bulan, prosedur anonimisasi dan keamanan data ketat sesuai regulasi kesehatan nasional dan internasional, serta skema pendanaan yang mendukung kolaborasi multi-institusi dan biaya operasional pengumpulan data lapangan. Pengembangan sistem pada penelitian saat ini memberikan fondasi teknis kuat dan metodologi tervalidasi untuk dijadikan basis bagi studi validasi klinis prospektif di masa depan, yang akan diajukan sebagai proposal penelitian terpisah dengan kolaborasi institusional formal sesuai.</w:t>
+        <w:t xml:space="preserve">Validasi klinis dengan sampel lapangan merupakan tahapan penting yang direncanakan untuk penelitian lanjutan dengan skema pendanaan berbeda dari penelitian saat ini. Penelitian fase pertama difokuskan pada pengembangan dan validasi bukti konsep teknis menggunakan dataset publik standar yang telah tervalidasi, memungkinkan iterasi metodologi cepat tanpa hambatan administratif data klinis. Kolaborasi dengan mitra klinis seperti rumah sakit rujukan atau laboratorium diagnostik diperlukan untuk fase validasi eksternal di masa depan, yang memerlukan persiapan protokol penelitian komprehensif sesuai standar Good Clinical Practice (GCP), persetujuan komite etik </w:t>
+      </w:r>
+      <w:r>
+        <w:rPr>
+          <w:rFonts w:ascii="Times New Roman" w:hAnsi="Times New Roman" w:cs="Times New Roman"/>
+          <w:noProof/>
+          <w:sz w:val="20"/>
+          <w:szCs w:val="20"/>
+          <w:lang w:val="id-ID"/>
+        </w:rPr>
+        <w:lastRenderedPageBreak/>
+        <w:t>penelitian kesehatan dengan proses administratif 3-6 bulan, prosedur anonimisasi dan keamanan data ketat sesuai regulasi kesehatan nasional dan internasional, serta skema pendanaan yang mendukung kolaborasi multi-institusi dan biaya operasional pengumpulan data lapangan. Pengembangan sistem pada penelitian saat ini memberikan fondasi teknis kuat dan metodologi tervalidasi untuk dijadikan basis bagi studi validasi klinis prospektif di masa depan, yang akan diajukan sebagai proposal penelitian terpisah dengan kolaborasi institusional formal sesuai.</w:t>
       </w:r>
       <w:permEnd w:id="1960519017"/>
     </w:p>
@@ -25614,7 +25942,6 @@
                 <w:szCs w:val="20"/>
                 <w:lang w:val="id-ID"/>
               </w:rPr>
-              <w:lastRenderedPageBreak/>
               <w:t>F.</w:t>
             </w:r>
             <w:r>
@@ -25832,6 +26159,7 @@
           <w:noProof/>
           <w:lang w:val="id-ID"/>
         </w:rPr>
+        <w:lastRenderedPageBreak/>
         <w:t>Keterbatasan Sumber Daya Komputasi</w:t>
       </w:r>
     </w:p>
@@ -25854,18 +26182,7 @@
           <w:szCs w:val="20"/>
           <w:lang w:val="id-ID"/>
         </w:rPr>
-        <w:t xml:space="preserve">Kendala ketiga adalah pelatihan model dalam jumlah besar memerlukan waktu komputasi signifikan, terutama dengan keterbatasan GPU consumer-grade yang digunakan. Eksperimen dengan 3 model deteksi YOLO pada 4 dataset memerlukan sekitar 12-18 jam untuk tahap deteksi dengan 100 epoch per model menggunakan batch size disesuaikan untuk menghindari out-of-memory errors. Pelatihan 6 model klasifikasi pada 4 dataset memerlukan sekitar 90-110 jam untuk tahap klasifikasi dengan 75 epoch per model. Total waktu untuk seluruh eksperimen </w:t>
-      </w:r>
-      <w:r>
-        <w:rPr>
-          <w:rFonts w:ascii="Times New Roman" w:hAnsi="Times New Roman" w:cs="Times New Roman"/>
-          <w:noProof/>
-          <w:sz w:val="20"/>
-          <w:szCs w:val="20"/>
-          <w:lang w:val="id-ID"/>
-        </w:rPr>
-        <w:lastRenderedPageBreak/>
-        <w:t>mencapai sekitar 120 jam GPU menggunakan satu GPU NVIDIA RTX 3060 12GB, yang dapat menjadi bottleneck untuk eksperimen skala besar dengan iterasi berulang dan memerlukan manajemen memori hati-hati.</w:t>
+        <w:t>Kendala ketiga adalah pelatihan model dalam jumlah besar memerlukan waktu komputasi signifikan, terutama dengan keterbatasan GPU consumer-grade yang digunakan. Eksperimen dengan 3 model deteksi YOLO pada 4 dataset memerlukan sekitar 12-18 jam untuk tahap deteksi dengan 100 epoch per model menggunakan batch size disesuaikan untuk menghindari out-of-memory errors. Pelatihan 6 model klasifikasi pada 4 dataset memerlukan sekitar 90-110 jam untuk tahap klasifikasi dengan 75 epoch per model. Total waktu untuk seluruh eksperimen mencapai sekitar 120 jam GPU menggunakan satu GPU NVIDIA RTX 3060 12GB, yang dapat menjadi bottleneck untuk eksperimen skala besar dengan iterasi berulang dan memerlukan manajemen memori hati-hati.</w:t>
       </w:r>
     </w:p>
     <w:p>
@@ -26061,6 +26378,7 @@
           <w:noProof/>
           <w:lang w:val="id-ID"/>
         </w:rPr>
+        <w:lastRenderedPageBreak/>
         <w:t>Pergeseran Domain dan Generalisasi</w:t>
       </w:r>
     </w:p>
@@ -26105,7 +26423,6 @@
           <w:szCs w:val="20"/>
           <w:lang w:val="id-ID"/>
         </w:rPr>
-        <w:lastRenderedPageBreak/>
         <w:t>Strategi mitigasi yang telah dilakukan meliputi validasi silang pada empat dataset berbeda untuk menguji robustness metodologi, augmentasi data aman untuk medis namun cukup bervariasi untuk meningkatkan invariansi model, serta penggunaan transfer learning dari ImageNet yang memberikan representasi visual lebih umum. Tantangan generalisasi ke sampel lapangan tetap menjadi keterbatasan yang perlu diatasi melalui penelitian lanjutan dengan pengumpulan data lapangan beragam dan teknik adaptasi domain. Penurunan performa 10-25% pada kondisi lapangan merupakan estimasi konservatif berdasarkan pengalaman sistem AI medis serupa yang terdokumentasi dalam literatur.</w:t>
       </w:r>
       <w:permEnd w:id="1526090965"/>
@@ -26652,7 +26969,17 @@
           <w:sz w:val="20"/>
           <w:lang w:val="id-ID" w:eastAsia="en-ID"/>
         </w:rPr>
-        <w:t>Salah satu tantangan utama yang teridentifikasi dari hasil penelitian adalah performa model pada kelas ultra-minoritas dengan jumlah sampel kurang dari 10 yang menunjukkan variansi F1-score sangat tinggi antara 44 hingga 100 persen. Eksplorasi lanjutan yang realistis dapat dilakukan menggunakan dataset publik yang sudah ada meliputi studi kelayakan penerapan data augmentation yang lebih agresif khusus untuk kelas minoritas dengan validasi bahwa transformasi tidak mengubah karakteristik diagnostik parasit, serta eksperimen ensemble methods sederhana menggunakan voting dari beberapa model terbaik untuk meningkatkan robustness prediksi. Kegiatan eksplorasi ini dapat dilakukan secara mandiri dengan sumber daya komputasi yang ada, dengan pemahaman bahwa hasil akan tetap terbatas oleh ukuran dataset fundamental yang sangat kecil.</w:t>
+        <w:t xml:space="preserve">Salah satu tantangan utama yang teridentifikasi dari hasil penelitian adalah performa model pada kelas ultra-minoritas dengan jumlah sampel kurang dari 10 yang menunjukkan variansi F1-score sangat tinggi antara 44 hingga 100 persen. Eksplorasi lanjutan yang realistis dapat dilakukan menggunakan dataset publik yang sudah </w:t>
+      </w:r>
+      <w:r>
+        <w:rPr>
+          <w:rFonts w:ascii="Times New Roman" w:eastAsia="Times New Roman" w:hAnsi="Times New Roman" w:cs="Times New Roman"/>
+          <w:color w:val="000000"/>
+          <w:sz w:val="20"/>
+          <w:lang w:val="id-ID" w:eastAsia="en-ID"/>
+        </w:rPr>
+        <w:lastRenderedPageBreak/>
+        <w:t>ada meliputi studi kelayakan penerapan data augmentation yang lebih agresif khusus untuk kelas minoritas dengan validasi bahwa transformasi tidak mengubah karakteristik diagnostik parasit, serta eksperimen ensemble methods sederhana menggunakan voting dari beberapa model terbaik untuk meningkatkan robustness prediksi. Kegiatan eksplorasi ini dapat dilakukan secara mandiri dengan sumber daya komputasi yang ada, dengan pemahaman bahwa hasil akan tetap terbatas oleh ukuran dataset fundamental yang sangat kecil.</w:t>
       </w:r>
     </w:p>
     <w:p>
@@ -26688,17 +27015,7 @@
           <w:sz w:val="20"/>
           <w:lang w:val="id-ID" w:eastAsia="en-ID"/>
         </w:rPr>
-        <w:t xml:space="preserve">Untuk meningkatkan transparansi model, dapat diintegrasikan teknik visualisasi Gradient-weighted Class Activation Mapping (Grad-CAM) [40] untuk memvisualisasikan region of interest pada citra yang berkontribusi </w:t>
-      </w:r>
-      <w:r>
-        <w:rPr>
-          <w:rFonts w:ascii="Times New Roman" w:eastAsia="Times New Roman" w:hAnsi="Times New Roman" w:cs="Times New Roman"/>
-          <w:color w:val="000000"/>
-          <w:sz w:val="20"/>
-          <w:lang w:val="id-ID" w:eastAsia="en-ID"/>
-        </w:rPr>
-        <w:lastRenderedPageBreak/>
-        <w:t>terhadap keputusan klasifikasi. Implementasi dapat dilakukan menggunakan library open-source pytorch-grad-cam yang sudah tersedia, dengan validasi menggunakan dataset test yang sudah ada. Output berupa visualisasi heatmap yang dapat membantu memahami basis keputusan model, namun validasi klinis dari interpretasi tersebut memerlukan kolaborasi dengan ahli parasitologi yang saat ini belum tersedia.</w:t>
+        <w:t>Untuk meningkatkan transparansi model, dapat diintegrasikan teknik visualisasi Gradient-weighted Class Activation Mapping (Grad-CAM) [40] untuk memvisualisasikan region of interest pada citra yang berkontribusi terhadap keputusan klasifikasi. Implementasi dapat dilakukan menggunakan library open-source pytorch-grad-cam yang sudah tersedia, dengan validasi menggunakan dataset test yang sudah ada. Output berupa visualisasi heatmap yang dapat membantu memahami basis keputusan model, namun validasi klinis dari interpretasi tersebut memerlukan kolaborasi dengan ahli parasitologi yang saat ini belum tersedia.</w:t>
       </w:r>
     </w:p>
     <w:p>
@@ -27133,6 +27450,7 @@
           <w:szCs w:val="20"/>
           <w:lang w:val="id-ID"/>
         </w:rPr>
+        <w:lastRenderedPageBreak/>
         <w:t>Centers for Disease Control and Prevention, "Malaria Biology," 2024.</w:t>
       </w:r>
     </w:p>
@@ -27323,18 +27641,7 @@
           <w:szCs w:val="20"/>
           <w:lang w:val="id-ID"/>
         </w:rPr>
-        <w:t xml:space="preserve">Q. A. Arshad et al., "A dataset and benchmark for malaria life-cycle classification in thin blood smear </w:t>
-      </w:r>
-      <w:r>
-        <w:rPr>
-          <w:rFonts w:ascii="Times New Roman" w:hAnsi="Times New Roman" w:cs="Times New Roman"/>
-          <w:noProof/>
-          <w:sz w:val="20"/>
-          <w:szCs w:val="20"/>
-          <w:lang w:val="id-ID"/>
-        </w:rPr>
-        <w:lastRenderedPageBreak/>
-        <w:t>images," Neural Comput Appl, vol. 34, no. 6, pp. 4473-4485, 2022, doi: 10.1007/s00521-021-06602-6.</w:t>
+        <w:t>Q. A. Arshad et al., "A dataset and benchmark for malaria life-cycle classification in thin blood smear images," Neural Comput Appl, vol. 34, no. 6, pp. 4473-4485, 2022, doi: 10.1007/s00521-021-06602-6.</w:t>
       </w:r>
     </w:p>
     <w:p>
@@ -28234,7 +28541,18 @@
           <w:szCs w:val="20"/>
           <w:lang w:val="id-ID"/>
         </w:rPr>
-        <w:t>K. Alkandary, A. S. Yildiz, and H. Meng, "A Comparative Study of YOLO Series (v3-v10) with DeepSORT and StrongSORT," Electronics (Basel), vol. 14, no. 5, 2025, doi: 10.3390/electronics14050876.</w:t>
+        <w:t xml:space="preserve">K. Alkandary, A. S. Yildiz, and H. Meng, "A Comparative Study of YOLO Series (v3-v10) with DeepSORT </w:t>
+      </w:r>
+      <w:r>
+        <w:rPr>
+          <w:rFonts w:ascii="Times New Roman" w:hAnsi="Times New Roman" w:cs="Times New Roman"/>
+          <w:noProof/>
+          <w:sz w:val="20"/>
+          <w:szCs w:val="20"/>
+          <w:lang w:val="id-ID"/>
+        </w:rPr>
+        <w:lastRenderedPageBreak/>
+        <w:t>and StrongSORT," Electronics (Basel), vol. 14, no. 5, 2025, doi: 10.3390/electronics14050876.</w:t>
       </w:r>
     </w:p>
     <w:p>

</xml_diff>